<commit_message>
docs: accept PR7 and clarify merged fix versus captured UI state
</commit_message>
<xml_diff>
--- a/docs/user-guide/专题数字图书馆使用手册.docx
+++ b/docs/user-guide/专题数字图书馆使用手册.docx
@@ -17,7 +17,7 @@
     </w:p>
     <w:p>
       <w:r>
-        <w:t>文档版本为 1.0，编写日期为 2026 年 10 月 19 日。正文依据已合并 PR1 至 PR5 的 main 版本；问答实拍额外使用独立的 UI001 进度修复候选 PR6（https://github.com/Dan1un1u/digital-library-rag/pull/6）。该候选和本手册均待审核，现有正式实例尚未更新到截图版本。</w:t>
+        <w:t>文档版本为 1.0，编写日期为 2026 年 10 月 19 日。主功能截图依据 PR1 至 PR5 的版本；问答实拍使用 UI001 进度修复 PR6（https://github.com/Dan1un1u/digital-library-rag/pull/6）。PR6 已通过验收合入 main；截图保留拍摄时的“修复候选”标记，现有正式实例尚未更新到截图版本。</w:t>
       </w:r>
     </w:p>
     <w:p>
@@ -2830,7 +2830,7 @@
     </w:p>
     <w:p>
       <w:r>
-        <w:t>本节问答实拍包含 PR6 的进度修复候选。原 main 在某些较慢阶段会因进度区重复标识报错；合并并部署修复前，旧实例仍可能遇到该问题，不能把本节截图作为旧实例已修复的证明。</w:t>
+        <w:t>本节实拍时 PR6 仍为修复候选，现已通过验收合入 main。旧版本在较慢阶段可能因进度区重复标识报错；部署更新前仍可能遇到该问题，本节截图不代表旧实例已更新。</w:t>
       </w:r>
     </w:p>
     <w:p>
@@ -3441,7 +3441,7 @@
                 <w:b w:val="0"/>
                 <w:sz w:val="20"/>
               </w:rPr>
-              <w:t>对照 PR6 的修复状态；先用搜索与原文阅读，交由维护者部署修复</w:t>
+              <w:t>PR6 已合入 main；核对是否仍在运行旧版本，交由维护者部署更新</w:t>
             </w:r>
           </w:p>
         </w:tc>
@@ -3629,7 +3629,7 @@
     </w:p>
     <w:p>
       <w:r>
-        <w:t>独立文档演示环境不使用上述正式端口启动入口。其本机过程、截图和数据位置见同目录的 verification.json；正式馆藏与历史 dev 数据保留，未在本轮迁移或重建。</w:t>
+        <w:t>独立文档演示环境不使用上述正式端口启动入口。拍摄记录及数据位置见同目录的 verification.json，本轮验收见 acceptance-20261019.json；正式馆藏与历史 dev 数据未迁移或重建。</w:t>
       </w:r>
     </w:p>
     <w:p>
@@ -3670,7 +3670,7 @@
         <w:t>版本与边界。</w:t>
       </w:r>
       <w:r>
-        <w:t xml:space="preserve"> 主功能基线为 main 提交 b9565b482d8cf4f085235c9aba2d18e8303554ee；问答界面使用 UI001 代码提交 a401cf5，其独立 PR6 尚未合并。手册不宣称旧的 18501 或 19501 实例已经获得这些更新。本文展示操作路径，未重新执行总体检索准确率或回答质量评测。</w:t>
+        <w:t xml:space="preserve"> 主功能截图基线为 b9565b482d8cf4f085235c9aba2d18e8303554ee，问答界面使用 UI001 提交 a401cf5。PR6 已验收合并，截图及首版核验记录仍保留当时身份；本轮更新文档状态并记录新输出哈希。旧的 18501 或 19501 实例尚未部署更新，本文也未重新执行总体检索准确率或回答质量评测。</w:t>
       </w:r>
     </w:p>
     <w:p>

</xml_diff>

<commit_message>
fix: restore SiliconFlow delivery and remove private local integrations
</commit_message>
<xml_diff>
--- a/docs/user-guide/专题数字图书馆使用手册.docx
+++ b/docs/user-guide/专题数字图书馆使用手册.docx
@@ -17,7 +17,7 @@
     </w:p>
     <w:p>
       <w:r>
-        <w:t>文档版本为 1.0，编写日期为 2026 年 10 月 19 日。主功能截图依据 PR1 至 PR5 的版本；问答实拍使用 UI001 进度修复 PR6（https://github.com/Dan1un1u/digital-library-rag/pull/6）。PR6 已通过验收合入 main；截图保留拍摄时的“修复候选”标记，现有正式实例尚未更新到截图版本。</w:t>
+        <w:t>文档版本为 1.1，编写日期为 2026 年 10 月 19 日。主功能截图依据 PR1 至 PR5 的版本；问答实拍使用 UI001 进度修复 PR6（https://github.com/Dan1un1u/digital-library-rag/pull/6）。PR6 已通过验收合入 main；截图保留拍摄时的“修复候选”标记，现有正式实例尚未更新到截图版本。</w:t>
       </w:r>
     </w:p>
     <w:p>
@@ -113,7 +113,7 @@
     </w:p>
     <w:p>
       <w:r>
-        <w:t>进入“上传与管理 → 系统设置”，确认运行模式为“真实服务（REAL）”，模型显示 BAAI/bge-m3 和 gpt-6-luna，当前索引不是“暂无”。出现服务提示时，先按提示检查，再进行上传或提问。</w:t>
+        <w:t>进入“上传与管理 → 系统设置”，确认 REAL、模型与配置一致、索引不是“暂无”。当前默认使用硅基流动；图2中的 Luna 属于历史实拍环境。</w:t>
       </w:r>
     </w:p>
     <w:p>
@@ -676,7 +676,7 @@
     </w:p>
     <w:p>
       <w:r>
-        <w:t>REAL 表示使用真实服务，不意味着所有推理都在本机。BGE 在本机生成向量，Luna 推理仍通过已配置的云端服务完成。</w:t>
+        <w:t>REAL 表示使用真实服务。当前交付版本通过硅基流动生成向量和回答；历史截图保留当时模型身份，操作流程仍可参照。</w:t>
       </w:r>
     </w:p>
     <w:p>
@@ -3173,7 +3173,7 @@
                 <w:b w:val="0"/>
                 <w:sz w:val="20"/>
               </w:rPr>
-              <w:t>检查 Luna 服务与网络；阅读提示，核对保留下来的本机候选或稍后重试</w:t>
+              <w:t>检查增强识别服务配置与网络；阅读提示，核对保留下来的本机候选或稍后重试</w:t>
             </w:r>
           </w:p>
         </w:tc>
@@ -3675,7 +3675,7 @@
     </w:p>
     <w:p>
       <w:r>
-        <w:t>维护参考：仓库根 README.md；本地模型使用说明.txt；docs/workflow/catalog-ingestion.md；docs/workflow/test-task-isolation.md。PDF 文献、数据库、索引和认证配置不随文档 PR 分发。</w:t>
+        <w:t>维护参考：仓库根 README.md；docs/deployment/siliconflow.md；docs/workflow/catalog-ingestion.md；docs/workflow/test-task-isolation.md。PDF 文献、数据库、索引和认证配置不随文档 PR 分发。</w:t>
       </w:r>
     </w:p>
     <w:sectPr>
@@ -3701,7 +3701,7 @@
       <w:rPr>
         <w:sz w:val="16"/>
       </w:rPr>
-      <w:t xml:space="preserve">版本 1.0  ·  </w:t>
+      <w:t xml:space="preserve">版本 1.1  ·  </w:t>
     </w:r>
     <w:fldSimple w:instr="PAGE"/>
   </w:p>

</xml_diff>

<commit_message>
docs: rewrite the user manual around reader tasks
</commit_message>
<xml_diff>
--- a/docs/user-guide/专题数字图书馆使用手册.docx
+++ b/docs/user-guide/专题数字图书馆使用手册.docx
@@ -12,12 +12,26 @@
     </w:p>
     <w:p>
       <w:r>
-        <w:t>本文面向文献使用者、馆藏维护者与课堂演示者，说明如何浏览馆藏、搜索文献、依据原文提问，以及上传并核对 PDF。操作截图来自实际运行的独立演示馆藏，可按图中按钮逐步完成。</w:t>
+        <w:t>在图书馆中，你可以浏览 PDF 馆藏、搜索相关文献，也可以围绕馆藏内容提问，并通过回答中的引用阅读原文。本手册按实际使用顺序介绍这些操作。</w:t>
       </w:r>
     </w:p>
     <w:p>
       <w:r>
-        <w:t>文档版本为 1.1，编写日期为 2026 年 10 月 19 日。主功能截图依据 PR1 至 PR5 的版本；问答实拍使用 UI001 进度修复 PR6（https://github.com/Dan1un1u/digital-library-rag/pull/6）。PR6 已通过验收合入 main；截图保留拍摄时的“修复候选”标记，现有正式实例尚未更新到截图版本。</w:t>
+        <w:t>文档版本为 1.2，更新日期为 2026 年 10 月 19 日。</w:t>
+      </w:r>
+    </w:p>
+    <w:p>
+      <w:pPr>
+        <w:pStyle w:val="Heading1"/>
+        <w:pageBreakBefore w:val="0"/>
+      </w:pPr>
+      <w:r>
+        <w:t>1 开始使用</w:t>
+      </w:r>
+    </w:p>
+    <w:p>
+      <w:r>
+        <w:t>在浏览器打开管理员提供的图书馆地址。本机安装的默认入口是 http://127.0.0.1:18501/ 。进入首页后，从左侧选择要使用的功能。</w:t>
       </w:r>
     </w:p>
     <w:p>
@@ -30,7 +44,7 @@
         <w:drawing>
           <wp:inline xmlns:a="http://schemas.openxmlformats.org/drawingml/2006/main" xmlns:pic="http://schemas.openxmlformats.org/drawingml/2006/picture">
             <wp:extent cx="6400800" cy="3600450"/>
-            <wp:docPr id="1" name="Picture 1" descr="图1 馆藏首页与功能导航"/>
+            <wp:docPr id="1" name="Picture 1" descr="图1 图书馆首页"/>
             <wp:cNvGraphicFramePr>
               <a:graphicFrameLocks noChangeAspect="1"/>
             </wp:cNvGraphicFramePr>
@@ -67,17 +81,26 @@
         <w:jc w:val="center"/>
       </w:pPr>
       <w:r>
-        <w:t>图1 馆藏首页与功能导航</w:t>
+        <w:t>图1 图书馆首页</w:t>
       </w:r>
     </w:p>
     <w:p>
       <w:r>
-        <w:t>第一次使用，可依次完成：从左侧打开“馆藏展示”；在“搜索与问答”输入一个题名并选择“搜索”；找到结果后阅读原文。上传文献前，先看本手册第 6 至 9 节；录制视频可直接使用第 12 节的演示顺序。</w:t>
+        <w:t>“馆藏展示”用于浏览文献，“搜索与问答”用于查找资料和提问，“上传与管理”用于添加文献、核对信息和查看入库状态。</w:t>
       </w:r>
     </w:p>
     <w:p>
       <w:r>
-        <w:t>阅读导航：第 2 节打开系统；第 3 节浏览馆藏；第 4 至 5 节搜索；第 6 至 9 节上传与审核；第 10 至 11 节问答与引用；第 12 节故障处理与视频；第 13 节维护及工作记录。</w:t>
+        <w:t xml:space="preserve">如果你负责在本机启动系统，在项目文件夹中运行 </w:t>
+      </w:r>
+      <w:r>
+        <w:rPr>
+          <w:rFonts w:ascii="Consolas" w:hAnsi="Consolas"/>
+        </w:rPr>
+        <w:t>./Start-Library.ps1 -Mode real</w:t>
+      </w:r>
+      <w:r>
+        <w:t>，再打开上面的地址。首次安装请按项目首页的安装说明完成配置。</w:t>
       </w:r>
     </w:p>
     <w:p>
@@ -86,34 +109,12 @@
         <w:pageBreakBefore/>
       </w:pPr>
       <w:r>
-        <w:t>2 打开系统与确认版本</w:t>
+        <w:t>2 浏览馆藏</w:t>
       </w:r>
     </w:p>
     <w:p>
       <w:r>
-        <w:t>本机现有正式使用入口是 http://127.0.0.1:18501/ 。本手册的实拍入口是 http://127.0.0.1:19520/ ，页面上方显示“使用手册演示环境”。这两个入口使用不同馆藏，数量和内容不同是正常现象。</w:t>
-      </w:r>
-    </w:p>
-    <w:p>
-      <w:r>
-        <w:t>已配置好的部署，在其项目根目录运行以下命令即可启动真实模式。首次安装或更换电脑请先阅读仓库安装说明；不能仅凭一份手册目录直接启动。</w:t>
-      </w:r>
-    </w:p>
-    <w:p>
-      <w:pPr>
-        <w:spacing w:after="100"/>
-      </w:pPr>
-      <w:r>
-        <w:rPr>
-          <w:rFonts w:ascii="Consolas" w:hAnsi="Consolas"/>
-          <w:sz w:val="20"/>
-        </w:rPr>
-        <w:t>.\Start-Library.ps1 -Mode real</w:t>
-      </w:r>
-    </w:p>
-    <w:p>
-      <w:r>
-        <w:t>进入“上传与管理 → 系统设置”，确认 REAL、模型与配置一致、索引不是“暂无”。当前默认使用硅基流动；图2中的 Luna 属于历史实拍环境。</w:t>
+        <w:t>选择“馆藏展示 → 馆藏文献分类”。页面顶部展示馆藏数量和学科分布；在“浏览所属学科”中选择自然科学、社会科学或哲学与人文科学，可以缩小浏览范围。</w:t>
       </w:r>
     </w:p>
     <w:p>
@@ -125,8 +126,8 @@
       <w:r>
         <w:drawing>
           <wp:inline xmlns:a="http://schemas.openxmlformats.org/drawingml/2006/main" xmlns:pic="http://schemas.openxmlformats.org/drawingml/2006/picture">
-            <wp:extent cx="5669280" cy="3188970"/>
-            <wp:docPr id="2" name="Picture 2" descr="图2 系统设置中的运行模式和模型"/>
+            <wp:extent cx="4937760" cy="2777490"/>
+            <wp:docPr id="2" name="Picture 2" descr="图2 按学科浏览文献"/>
             <wp:cNvGraphicFramePr>
               <a:graphicFrameLocks noChangeAspect="1"/>
             </wp:cNvGraphicFramePr>
@@ -134,7 +135,7 @@
               <a:graphicData uri="http://schemas.openxmlformats.org/drawingml/2006/picture">
                 <pic:pic>
                   <pic:nvPicPr>
-                    <pic:cNvPr id="0" name="16-system-status.jpg"/>
+                    <pic:cNvPr id="0" name="01b-classification.jpg"/>
                     <pic:cNvPicPr/>
                   </pic:nvPicPr>
                   <pic:blipFill>
@@ -146,7 +147,7 @@
                   <pic:spPr>
                     <a:xfrm>
                       <a:off x="0" y="0"/>
-                      <a:ext cx="5669280" cy="3188970"/>
+                      <a:ext cx="4937760" cy="2777490"/>
                     </a:xfrm>
                     <a:prstGeom prst="rect"/>
                   </pic:spPr>
@@ -163,534 +164,17 @@
         <w:jc w:val="center"/>
       </w:pPr>
       <w:r>
-        <w:t>图2 系统设置中的运行模式和模型</w:t>
-      </w:r>
-    </w:p>
-    <w:tbl>
-      <w:tblPr>
-        <w:tblW w:type="auto" w:w="0"/>
-        <w:tblLayout w:type="fixed"/>
-        <w:tblLook w:firstColumn="1" w:firstRow="1" w:lastColumn="0" w:lastRow="0" w:noHBand="0" w:noVBand="1" w:val="04A0"/>
-      </w:tblPr>
-      <w:tblGrid>
-        <w:gridCol w:w="1800"/>
-        <w:gridCol w:w="2880"/>
-        <w:gridCol w:w="5544"/>
-      </w:tblGrid>
-      <w:tr>
-        <w:trPr>
-          <w:tblHeader/>
-          <w:cantSplit/>
-        </w:trPr>
-        <w:tc>
-          <w:tcPr>
-            <w:tcW w:type="dxa" w:w="1800"/>
-            <w:vAlign w:val="center"/>
-            <w:tcBorders>
-              <w:top w:val="single" w:sz="4" w:color="D9D9D9"/>
-              <w:left w:val="single" w:sz="4" w:color="D9D9D9"/>
-              <w:bottom w:val="single" w:sz="4" w:color="D9D9D9"/>
-              <w:right w:val="single" w:sz="4" w:color="D9D9D9"/>
-            </w:tcBorders>
-            <w:tcMar>
-              <w:top w:w="85" w:type="dxa"/>
-              <w:bottom w:w="85" w:type="dxa"/>
-              <w:left w:w="105" w:type="dxa"/>
-              <w:right w:w="105" w:type="dxa"/>
-            </w:tcMar>
-            <w:shd w:fill="E8EEF3"/>
-          </w:tcPr>
-          <w:p>
-            <w:pPr>
-              <w:spacing w:after="20" w:line="254" w:lineRule="auto"/>
-            </w:pPr>
-            <w:r>
-              <w:rPr>
-                <w:b/>
-                <w:sz w:val="20"/>
-              </w:rPr>
-              <w:t>入口</w:t>
-            </w:r>
-          </w:p>
-        </w:tc>
-        <w:tc>
-          <w:tcPr>
-            <w:tcW w:type="dxa" w:w="2880"/>
-            <w:vAlign w:val="center"/>
-            <w:tcBorders>
-              <w:top w:val="single" w:sz="4" w:color="D9D9D9"/>
-              <w:left w:val="single" w:sz="4" w:color="D9D9D9"/>
-              <w:bottom w:val="single" w:sz="4" w:color="D9D9D9"/>
-              <w:right w:val="single" w:sz="4" w:color="D9D9D9"/>
-            </w:tcBorders>
-            <w:tcMar>
-              <w:top w:w="85" w:type="dxa"/>
-              <w:bottom w:w="85" w:type="dxa"/>
-              <w:left w:w="105" w:type="dxa"/>
-              <w:right w:w="105" w:type="dxa"/>
-            </w:tcMar>
-            <w:shd w:fill="E8EEF3"/>
-          </w:tcPr>
-          <w:p>
-            <w:pPr>
-              <w:spacing w:after="20" w:line="254" w:lineRule="auto"/>
-            </w:pPr>
-            <w:r>
-              <w:rPr>
-                <w:b/>
-                <w:sz w:val="20"/>
-              </w:rPr>
-              <w:t>用途</w:t>
-            </w:r>
-          </w:p>
-        </w:tc>
-        <w:tc>
-          <w:tcPr>
-            <w:tcW w:type="dxa" w:w="5544"/>
-            <w:vAlign w:val="center"/>
-            <w:tcBorders>
-              <w:top w:val="single" w:sz="4" w:color="D9D9D9"/>
-              <w:left w:val="single" w:sz="4" w:color="D9D9D9"/>
-              <w:bottom w:val="single" w:sz="4" w:color="D9D9D9"/>
-              <w:right w:val="single" w:sz="4" w:color="D9D9D9"/>
-            </w:tcBorders>
-            <w:tcMar>
-              <w:top w:w="85" w:type="dxa"/>
-              <w:bottom w:w="85" w:type="dxa"/>
-              <w:left w:w="105" w:type="dxa"/>
-              <w:right w:w="105" w:type="dxa"/>
-            </w:tcMar>
-            <w:shd w:fill="E8EEF3"/>
-          </w:tcPr>
-          <w:p>
-            <w:pPr>
-              <w:spacing w:after="20" w:line="254" w:lineRule="auto"/>
-            </w:pPr>
-            <w:r>
-              <w:rPr>
-                <w:b/>
-                <w:sz w:val="20"/>
-              </w:rPr>
-              <w:t>数据说明</w:t>
-            </w:r>
-          </w:p>
-        </w:tc>
-      </w:tr>
-      <w:tr>
-        <w:trPr>
-          <w:cantSplit/>
-        </w:trPr>
-        <w:tc>
-          <w:tcPr>
-            <w:tcW w:type="dxa" w:w="1800"/>
-            <w:vAlign w:val="center"/>
-            <w:tcBorders>
-              <w:top w:val="single" w:sz="4" w:color="D9D9D9"/>
-              <w:left w:val="single" w:sz="4" w:color="D9D9D9"/>
-              <w:bottom w:val="single" w:sz="4" w:color="D9D9D9"/>
-              <w:right w:val="single" w:sz="4" w:color="D9D9D9"/>
-            </w:tcBorders>
-            <w:tcMar>
-              <w:top w:w="85" w:type="dxa"/>
-              <w:bottom w:w="85" w:type="dxa"/>
-              <w:left w:w="105" w:type="dxa"/>
-              <w:right w:w="105" w:type="dxa"/>
-            </w:tcMar>
-            <w:shd w:fill="FFFFFF"/>
-          </w:tcPr>
-          <w:p>
-            <w:pPr>
-              <w:spacing w:after="20" w:line="254" w:lineRule="auto"/>
-            </w:pPr>
-            <w:r>
-              <w:rPr>
-                <w:b w:val="0"/>
-                <w:sz w:val="20"/>
-              </w:rPr>
-              <w:t>18501</w:t>
-            </w:r>
-          </w:p>
-        </w:tc>
-        <w:tc>
-          <w:tcPr>
-            <w:tcW w:type="dxa" w:w="2880"/>
-            <w:vAlign w:val="center"/>
-            <w:tcBorders>
-              <w:top w:val="single" w:sz="4" w:color="D9D9D9"/>
-              <w:left w:val="single" w:sz="4" w:color="D9D9D9"/>
-              <w:bottom w:val="single" w:sz="4" w:color="D9D9D9"/>
-              <w:right w:val="single" w:sz="4" w:color="D9D9D9"/>
-            </w:tcBorders>
-            <w:tcMar>
-              <w:top w:w="85" w:type="dxa"/>
-              <w:bottom w:w="85" w:type="dxa"/>
-              <w:left w:w="105" w:type="dxa"/>
-              <w:right w:w="105" w:type="dxa"/>
-            </w:tcMar>
-            <w:shd w:fill="FFFFFF"/>
-          </w:tcPr>
-          <w:p>
-            <w:pPr>
-              <w:spacing w:after="20" w:line="254" w:lineRule="auto"/>
-            </w:pPr>
-            <w:r>
-              <w:rPr>
-                <w:b w:val="0"/>
-                <w:sz w:val="20"/>
-              </w:rPr>
-              <w:t>现有正式使用界面</w:t>
-            </w:r>
-          </w:p>
-        </w:tc>
-        <w:tc>
-          <w:tcPr>
-            <w:tcW w:type="dxa" w:w="5544"/>
-            <w:vAlign w:val="center"/>
-            <w:tcBorders>
-              <w:top w:val="single" w:sz="4" w:color="D9D9D9"/>
-              <w:left w:val="single" w:sz="4" w:color="D9D9D9"/>
-              <w:bottom w:val="single" w:sz="4" w:color="D9D9D9"/>
-              <w:right w:val="single" w:sz="4" w:color="D9D9D9"/>
-            </w:tcBorders>
-            <w:tcMar>
-              <w:top w:w="85" w:type="dxa"/>
-              <w:bottom w:w="85" w:type="dxa"/>
-              <w:left w:w="105" w:type="dxa"/>
-              <w:right w:w="105" w:type="dxa"/>
-            </w:tcMar>
-            <w:shd w:fill="FFFFFF"/>
-          </w:tcPr>
-          <w:p>
-            <w:pPr>
-              <w:spacing w:after="20" w:line="254" w:lineRule="auto"/>
-            </w:pPr>
-            <w:r>
-              <w:rPr>
-                <w:b w:val="0"/>
-                <w:sz w:val="20"/>
-              </w:rPr>
-              <w:t>保留原部署与馆藏</w:t>
-            </w:r>
-          </w:p>
-        </w:tc>
-      </w:tr>
-      <w:tr>
-        <w:trPr>
-          <w:cantSplit/>
-        </w:trPr>
-        <w:tc>
-          <w:tcPr>
-            <w:tcW w:type="dxa" w:w="1800"/>
-            <w:vAlign w:val="center"/>
-            <w:tcBorders>
-              <w:top w:val="single" w:sz="4" w:color="D9D9D9"/>
-              <w:left w:val="single" w:sz="4" w:color="D9D9D9"/>
-              <w:bottom w:val="single" w:sz="4" w:color="D9D9D9"/>
-              <w:right w:val="single" w:sz="4" w:color="D9D9D9"/>
-            </w:tcBorders>
-            <w:tcMar>
-              <w:top w:w="85" w:type="dxa"/>
-              <w:bottom w:w="85" w:type="dxa"/>
-              <w:left w:w="105" w:type="dxa"/>
-              <w:right w:w="105" w:type="dxa"/>
-            </w:tcMar>
-            <w:shd w:fill="F7F9FB"/>
-          </w:tcPr>
-          <w:p>
-            <w:pPr>
-              <w:spacing w:after="20" w:line="254" w:lineRule="auto"/>
-            </w:pPr>
-            <w:r>
-              <w:rPr>
-                <w:b w:val="0"/>
-                <w:sz w:val="20"/>
-              </w:rPr>
-              <w:t>19501</w:t>
-            </w:r>
-          </w:p>
-        </w:tc>
-        <w:tc>
-          <w:tcPr>
-            <w:tcW w:type="dxa" w:w="2880"/>
-            <w:vAlign w:val="center"/>
-            <w:tcBorders>
-              <w:top w:val="single" w:sz="4" w:color="D9D9D9"/>
-              <w:left w:val="single" w:sz="4" w:color="D9D9D9"/>
-              <w:bottom w:val="single" w:sz="4" w:color="D9D9D9"/>
-              <w:right w:val="single" w:sz="4" w:color="D9D9D9"/>
-            </w:tcBorders>
-            <w:tcMar>
-              <w:top w:w="85" w:type="dxa"/>
-              <w:bottom w:w="85" w:type="dxa"/>
-              <w:left w:w="105" w:type="dxa"/>
-              <w:right w:w="105" w:type="dxa"/>
-            </w:tcMar>
-            <w:shd w:fill="F7F9FB"/>
-          </w:tcPr>
-          <w:p>
-            <w:pPr>
-              <w:spacing w:after="20" w:line="254" w:lineRule="auto"/>
-            </w:pPr>
-            <w:r>
-              <w:rPr>
-                <w:b w:val="0"/>
-                <w:sz w:val="20"/>
-              </w:rPr>
-              <w:t>既有跨学科 dev 界面</w:t>
-            </w:r>
-          </w:p>
-        </w:tc>
-        <w:tc>
-          <w:tcPr>
-            <w:tcW w:type="dxa" w:w="5544"/>
-            <w:vAlign w:val="center"/>
-            <w:tcBorders>
-              <w:top w:val="single" w:sz="4" w:color="D9D9D9"/>
-              <w:left w:val="single" w:sz="4" w:color="D9D9D9"/>
-              <w:bottom w:val="single" w:sz="4" w:color="D9D9D9"/>
-              <w:right w:val="single" w:sz="4" w:color="D9D9D9"/>
-            </w:tcBorders>
-            <w:tcMar>
-              <w:top w:w="85" w:type="dxa"/>
-              <w:bottom w:w="85" w:type="dxa"/>
-              <w:left w:w="105" w:type="dxa"/>
-              <w:right w:w="105" w:type="dxa"/>
-            </w:tcMar>
-            <w:shd w:fill="F7F9FB"/>
-          </w:tcPr>
-          <w:p>
-            <w:pPr>
-              <w:spacing w:after="20" w:line="254" w:lineRule="auto"/>
-            </w:pPr>
-            <w:r>
-              <w:rPr>
-                <w:b w:val="0"/>
-                <w:sz w:val="20"/>
-              </w:rPr>
-              <w:t>历史检测基线，含质量问题样本</w:t>
-            </w:r>
-          </w:p>
-        </w:tc>
-      </w:tr>
-      <w:tr>
-        <w:trPr>
-          <w:cantSplit/>
-        </w:trPr>
-        <w:tc>
-          <w:tcPr>
-            <w:tcW w:type="dxa" w:w="1800"/>
-            <w:vAlign w:val="center"/>
-            <w:tcBorders>
-              <w:top w:val="single" w:sz="4" w:color="D9D9D9"/>
-              <w:left w:val="single" w:sz="4" w:color="D9D9D9"/>
-              <w:bottom w:val="single" w:sz="4" w:color="D9D9D9"/>
-              <w:right w:val="single" w:sz="4" w:color="D9D9D9"/>
-            </w:tcBorders>
-            <w:tcMar>
-              <w:top w:w="85" w:type="dxa"/>
-              <w:bottom w:w="85" w:type="dxa"/>
-              <w:left w:w="105" w:type="dxa"/>
-              <w:right w:w="105" w:type="dxa"/>
-            </w:tcMar>
-            <w:shd w:fill="FFFFFF"/>
-          </w:tcPr>
-          <w:p>
-            <w:pPr>
-              <w:spacing w:after="20" w:line="254" w:lineRule="auto"/>
-            </w:pPr>
-            <w:r>
-              <w:rPr>
-                <w:b w:val="0"/>
-                <w:sz w:val="20"/>
-              </w:rPr>
-              <w:t>19520</w:t>
-            </w:r>
-          </w:p>
-        </w:tc>
-        <w:tc>
-          <w:tcPr>
-            <w:tcW w:type="dxa" w:w="2880"/>
-            <w:vAlign w:val="center"/>
-            <w:tcBorders>
-              <w:top w:val="single" w:sz="4" w:color="D9D9D9"/>
-              <w:left w:val="single" w:sz="4" w:color="D9D9D9"/>
-              <w:bottom w:val="single" w:sz="4" w:color="D9D9D9"/>
-              <w:right w:val="single" w:sz="4" w:color="D9D9D9"/>
-            </w:tcBorders>
-            <w:tcMar>
-              <w:top w:w="85" w:type="dxa"/>
-              <w:bottom w:w="85" w:type="dxa"/>
-              <w:left w:w="105" w:type="dxa"/>
-              <w:right w:w="105" w:type="dxa"/>
-            </w:tcMar>
-            <w:shd w:fill="FFFFFF"/>
-          </w:tcPr>
-          <w:p>
-            <w:pPr>
-              <w:spacing w:after="20" w:line="254" w:lineRule="auto"/>
-            </w:pPr>
-            <w:r>
-              <w:rPr>
-                <w:b w:val="0"/>
-                <w:sz w:val="20"/>
-              </w:rPr>
-              <w:t>本手册演示界面</w:t>
-            </w:r>
-          </w:p>
-        </w:tc>
-        <w:tc>
-          <w:tcPr>
-            <w:tcW w:type="dxa" w:w="5544"/>
-            <w:vAlign w:val="center"/>
-            <w:tcBorders>
-              <w:top w:val="single" w:sz="4" w:color="D9D9D9"/>
-              <w:left w:val="single" w:sz="4" w:color="D9D9D9"/>
-              <w:bottom w:val="single" w:sz="4" w:color="D9D9D9"/>
-              <w:right w:val="single" w:sz="4" w:color="D9D9D9"/>
-            </w:tcBorders>
-            <w:tcMar>
-              <w:top w:w="85" w:type="dxa"/>
-              <w:bottom w:w="85" w:type="dxa"/>
-              <w:left w:w="105" w:type="dxa"/>
-              <w:right w:w="105" w:type="dxa"/>
-            </w:tcMar>
-            <w:shd w:fill="FFFFFF"/>
-          </w:tcPr>
-          <w:p>
-            <w:pPr>
-              <w:spacing w:after="20" w:line="254" w:lineRule="auto"/>
-            </w:pPr>
-            <w:r>
-              <w:rPr>
-                <w:b w:val="0"/>
-                <w:sz w:val="20"/>
-              </w:rPr>
-              <w:t>独立小馆藏，含两份正文审核示例</w:t>
-            </w:r>
-          </w:p>
-        </w:tc>
-      </w:tr>
-      <w:tr>
-        <w:trPr>
-          <w:cantSplit/>
-        </w:trPr>
-        <w:tc>
-          <w:tcPr>
-            <w:tcW w:type="dxa" w:w="1800"/>
-            <w:vAlign w:val="center"/>
-            <w:tcBorders>
-              <w:top w:val="single" w:sz="4" w:color="D9D9D9"/>
-              <w:left w:val="single" w:sz="4" w:color="D9D9D9"/>
-              <w:bottom w:val="single" w:sz="4" w:color="D9D9D9"/>
-              <w:right w:val="single" w:sz="4" w:color="D9D9D9"/>
-            </w:tcBorders>
-            <w:tcMar>
-              <w:top w:w="85" w:type="dxa"/>
-              <w:bottom w:w="85" w:type="dxa"/>
-              <w:left w:w="105" w:type="dxa"/>
-              <w:right w:w="105" w:type="dxa"/>
-            </w:tcMar>
-            <w:shd w:fill="F7F9FB"/>
-          </w:tcPr>
-          <w:p>
-            <w:pPr>
-              <w:spacing w:after="20" w:line="254" w:lineRule="auto"/>
-            </w:pPr>
-            <w:r>
-              <w:rPr>
-                <w:b w:val="0"/>
-                <w:sz w:val="20"/>
-              </w:rPr>
-              <w:t>18502</w:t>
-            </w:r>
-          </w:p>
-        </w:tc>
-        <w:tc>
-          <w:tcPr>
-            <w:tcW w:type="dxa" w:w="2880"/>
-            <w:vAlign w:val="center"/>
-            <w:tcBorders>
-              <w:top w:val="single" w:sz="4" w:color="D9D9D9"/>
-              <w:left w:val="single" w:sz="4" w:color="D9D9D9"/>
-              <w:bottom w:val="single" w:sz="4" w:color="D9D9D9"/>
-              <w:right w:val="single" w:sz="4" w:color="D9D9D9"/>
-            </w:tcBorders>
-            <w:tcMar>
-              <w:top w:w="85" w:type="dxa"/>
-              <w:bottom w:w="85" w:type="dxa"/>
-              <w:left w:w="105" w:type="dxa"/>
-              <w:right w:w="105" w:type="dxa"/>
-            </w:tcMar>
-            <w:shd w:fill="F7F9FB"/>
-          </w:tcPr>
-          <w:p>
-            <w:pPr>
-              <w:spacing w:after="20" w:line="254" w:lineRule="auto"/>
-            </w:pPr>
-            <w:r>
-              <w:rPr>
-                <w:b w:val="0"/>
-                <w:sz w:val="20"/>
-              </w:rPr>
-              <w:t>MOCK 流程演示</w:t>
-            </w:r>
-          </w:p>
-        </w:tc>
-        <w:tc>
-          <w:tcPr>
-            <w:tcW w:type="dxa" w:w="5544"/>
-            <w:vAlign w:val="center"/>
-            <w:tcBorders>
-              <w:top w:val="single" w:sz="4" w:color="D9D9D9"/>
-              <w:left w:val="single" w:sz="4" w:color="D9D9D9"/>
-              <w:bottom w:val="single" w:sz="4" w:color="D9D9D9"/>
-              <w:right w:val="single" w:sz="4" w:color="D9D9D9"/>
-            </w:tcBorders>
-            <w:tcMar>
-              <w:top w:w="85" w:type="dxa"/>
-              <w:bottom w:w="85" w:type="dxa"/>
-              <w:left w:w="105" w:type="dxa"/>
-              <w:right w:w="105" w:type="dxa"/>
-            </w:tcMar>
-            <w:shd w:fill="F7F9FB"/>
-          </w:tcPr>
-          <w:p>
-            <w:pPr>
-              <w:spacing w:after="20" w:line="254" w:lineRule="auto"/>
-            </w:pPr>
-            <w:r>
-              <w:rPr>
-                <w:b w:val="0"/>
-                <w:sz w:val="20"/>
-              </w:rPr>
-              <w:t>合成资料与脚本问答，不代表真实模型效果</w:t>
-            </w:r>
-          </w:p>
-        </w:tc>
-      </w:tr>
-    </w:tbl>
-    <w:p>
-      <w:pPr>
-        <w:spacing w:after="20"/>
-      </w:pPr>
-    </w:p>
-    <w:p>
-      <w:r>
-        <w:t>REAL 表示使用真实服务。当前交付版本通过硅基流动生成向量和回答；历史截图保留当时模型身份，操作流程仍可参照。</w:t>
-      </w:r>
-    </w:p>
-    <w:p>
-      <w:pPr>
-        <w:pStyle w:val="Heading1"/>
-        <w:pageBreakBefore/>
-      </w:pPr>
-      <w:r>
-        <w:t>3 浏览馆藏与阅读文献</w:t>
+        <w:t>图2 按学科浏览文献</w:t>
       </w:r>
     </w:p>
     <w:p>
       <w:r>
-        <w:t>在左侧选择“馆藏展示 → 馆藏文献分类”。顶部数字与饼图显示当前筛选范围内的馆藏分布；向下找到“浏览所属学科”，可选择自然科学、社会科学、哲学与人文科学、全部或待分类。</w:t>
+        <w:t>文献卡片会列出题名、作者、年份、主题和来源。找到感兴趣的文献后，点击“阅读原文 ↗”打开 PDF。</w:t>
+      </w:r>
+    </w:p>
+    <w:p>
+      <w:r>
+        <w:t>喜欢按封面寻找资料时，可以切换到“热门电子文献资源”，点击封面或文献卡片进入原文。</w:t>
       </w:r>
     </w:p>
     <w:p>
@@ -703,7 +187,7 @@
         <w:drawing>
           <wp:inline xmlns:a="http://schemas.openxmlformats.org/drawingml/2006/main" xmlns:pic="http://schemas.openxmlformats.org/drawingml/2006/picture">
             <wp:extent cx="4937760" cy="2777490"/>
-            <wp:docPr id="3" name="Picture 3" descr="图3 馆藏分类与筛选范围"/>
+            <wp:docPr id="3" name="Picture 3" descr="图3 按封面浏览文献"/>
             <wp:cNvGraphicFramePr>
               <a:graphicFrameLocks noChangeAspect="1"/>
             </wp:cNvGraphicFramePr>
@@ -711,7 +195,7 @@
               <a:graphicData uri="http://schemas.openxmlformats.org/drawingml/2006/picture">
                 <pic:pic>
                   <pic:nvPicPr>
-                    <pic:cNvPr id="0" name="01b-classification.jpg"/>
+                    <pic:cNvPr id="0" name="02-covers.jpg"/>
                     <pic:cNvPicPr/>
                   </pic:nvPicPr>
                   <pic:blipFill>
@@ -740,67 +224,7 @@
         <w:jc w:val="center"/>
       </w:pPr>
       <w:r>
-        <w:t>图3 馆藏分类与筛选范围</w:t>
-      </w:r>
-    </w:p>
-    <w:p>
-      <w:r>
-        <w:t>每条文献显示题名、作者、版本年份、主题和来源。点击“阅读原文 ↗”打开 PDF。年份没有可靠依据时允许留空；“年份未标注”不会阻止质量合格的正文进入馆藏。</w:t>
-      </w:r>
-    </w:p>
-    <w:p>
-      <w:r>
-        <w:t>切换“热门电子文献资源”可按 PDF 首页封面浏览，点击封面或卡片阅读原文。该页面尚未统计访问热度，排列顺序不代表阅读量排名。</w:t>
-      </w:r>
-    </w:p>
-    <w:p>
-      <w:pPr>
-        <w:keepNext/>
-        <w:spacing w:after="60"/>
-        <w:jc w:val="center"/>
-      </w:pPr>
-      <w:r>
-        <w:drawing>
-          <wp:inline xmlns:a="http://schemas.openxmlformats.org/drawingml/2006/main" xmlns:pic="http://schemas.openxmlformats.org/drawingml/2006/picture">
-            <wp:extent cx="4937760" cy="2777490"/>
-            <wp:docPr id="4" name="Picture 4" descr="图4 文献封面与原文入口"/>
-            <wp:cNvGraphicFramePr>
-              <a:graphicFrameLocks noChangeAspect="1"/>
-            </wp:cNvGraphicFramePr>
-            <a:graphic>
-              <a:graphicData uri="http://schemas.openxmlformats.org/drawingml/2006/picture">
-                <pic:pic>
-                  <pic:nvPicPr>
-                    <pic:cNvPr id="0" name="02-covers.jpg"/>
-                    <pic:cNvPicPr/>
-                  </pic:nvPicPr>
-                  <pic:blipFill>
-                    <a:blip r:embed="rId14"/>
-                    <a:stretch>
-                      <a:fillRect/>
-                    </a:stretch>
-                  </pic:blipFill>
-                  <pic:spPr>
-                    <a:xfrm>
-                      <a:off x="0" y="0"/>
-                      <a:ext cx="4937760" cy="2777490"/>
-                    </a:xfrm>
-                    <a:prstGeom prst="rect"/>
-                  </pic:spPr>
-                </pic:pic>
-              </a:graphicData>
-            </a:graphic>
-          </wp:inline>
-        </w:drawing>
-      </w:r>
-    </w:p>
-    <w:p>
-      <w:pPr>
-        <w:pStyle w:val="Caption"/>
-        <w:jc w:val="center"/>
-      </w:pPr>
-      <w:r>
-        <w:t>图4 文献封面与原文入口</w:t>
+        <w:t>图3 按封面浏览文献</w:t>
       </w:r>
     </w:p>
     <w:p>
@@ -809,12 +233,12 @@
         <w:pageBreakBefore/>
       </w:pPr>
       <w:r>
-        <w:t>4 选择检索方式并提交搜索</w:t>
+        <w:t>3 搜索文献</w:t>
       </w:r>
     </w:p>
     <w:p>
       <w:r>
-        <w:t>进入“搜索与问答”，在“想查找或了解什么？”中输入题名、术语或自然语言需求，将“操作”选为“搜索”，选择检索方式，点击“提交”。初次使用可先采用默认的“混合检索”。</w:t>
+        <w:t>进入“搜索与问答”，在“想查找或了解什么？”中输入题名、关键词或想了解的内容，将“操作”选为“搜索”，然后点击“提交”。第一次搜索可以使用默认的“混合检索”。</w:t>
       </w:r>
     </w:p>
     <w:p>
@@ -827,7 +251,7 @@
         <w:drawing>
           <wp:inline xmlns:a="http://schemas.openxmlformats.org/drawingml/2006/main" xmlns:pic="http://schemas.openxmlformats.org/drawingml/2006/picture">
             <wp:extent cx="6400800" cy="3600450"/>
-            <wp:docPr id="5" name="Picture 5" descr="图5 搜索输入与年份主题筛选"/>
+            <wp:docPr id="4" name="Picture 4" descr="图4 填写搜索内容和筛选条件"/>
             <wp:cNvGraphicFramePr>
               <a:graphicFrameLocks noChangeAspect="1"/>
             </wp:cNvGraphicFramePr>
@@ -839,7 +263,7 @@
                     <pic:cNvPicPr/>
                   </pic:nvPicPr>
                   <pic:blipFill>
-                    <a:blip r:embed="rId15"/>
+                    <a:blip r:embed="rId14"/>
                     <a:stretch>
                       <a:fillRect/>
                     </a:stretch>
@@ -864,7 +288,7 @@
         <w:jc w:val="center"/>
       </w:pPr>
       <w:r>
-        <w:t>图5 搜索输入与年份主题筛选</w:t>
+        <w:t>图4 填写搜索内容和筛选条件</w:t>
       </w:r>
     </w:p>
     <w:tbl>
@@ -874,9 +298,9 @@
         <w:tblLook w:firstColumn="1" w:firstRow="1" w:lastColumn="0" w:lastRow="0" w:noHBand="0" w:noVBand="1" w:val="04A0"/>
       </w:tblPr>
       <w:tblGrid>
-        <w:gridCol w:w="1800"/>
-        <w:gridCol w:w="4464"/>
-        <w:gridCol w:w="3960"/>
+        <w:gridCol w:w="1656"/>
+        <w:gridCol w:w="4392"/>
+        <w:gridCol w:w="4176"/>
       </w:tblGrid>
       <w:tr>
         <w:trPr>
@@ -885,7 +309,7 @@
         </w:trPr>
         <w:tc>
           <w:tcPr>
-            <w:tcW w:type="dxa" w:w="1800"/>
+            <w:tcW w:type="dxa" w:w="1656"/>
             <w:vAlign w:val="center"/>
             <w:tcBorders>
               <w:top w:val="single" w:sz="4" w:color="D9D9D9"/>
@@ -910,13 +334,13 @@
                 <w:b/>
                 <w:sz w:val="20"/>
               </w:rPr>
-              <w:t>搜索方式</w:t>
+              <w:t>方式</w:t>
             </w:r>
           </w:p>
         </w:tc>
         <w:tc>
           <w:tcPr>
-            <w:tcW w:type="dxa" w:w="4464"/>
+            <w:tcW w:type="dxa" w:w="4392"/>
             <w:vAlign w:val="center"/>
             <w:tcBorders>
               <w:top w:val="single" w:sz="4" w:color="D9D9D9"/>
@@ -941,13 +365,13 @@
                 <w:b/>
                 <w:sz w:val="20"/>
               </w:rPr>
-              <w:t>适用情况</w:t>
+              <w:t>什么时候用</w:t>
             </w:r>
           </w:p>
         </w:tc>
         <w:tc>
           <w:tcPr>
-            <w:tcW w:type="dxa" w:w="3960"/>
+            <w:tcW w:type="dxa" w:w="4176"/>
             <w:vAlign w:val="center"/>
             <w:tcBorders>
               <w:top w:val="single" w:sz="4" w:color="D9D9D9"/>
@@ -983,7 +407,7 @@
         </w:trPr>
         <w:tc>
           <w:tcPr>
-            <w:tcW w:type="dxa" w:w="1800"/>
+            <w:tcW w:type="dxa" w:w="1656"/>
             <w:vAlign w:val="center"/>
             <w:tcBorders>
               <w:top w:val="single" w:sz="4" w:color="D9D9D9"/>
@@ -1014,7 +438,7 @@
         </w:tc>
         <w:tc>
           <w:tcPr>
-            <w:tcW w:type="dxa" w:w="4464"/>
+            <w:tcW w:type="dxa" w:w="4392"/>
             <w:vAlign w:val="center"/>
             <w:tcBorders>
               <w:top w:val="single" w:sz="4" w:color="D9D9D9"/>
@@ -1039,13 +463,13 @@
                 <w:b w:val="0"/>
                 <w:sz w:val="20"/>
               </w:rPr>
-              <w:t>已知准确题名、缩写或专业术语</w:t>
+              <w:t>已知题名、缩写或专业术语</w:t>
             </w:r>
           </w:p>
         </w:tc>
         <w:tc>
           <w:tcPr>
-            <w:tcW w:type="dxa" w:w="3960"/>
+            <w:tcW w:type="dxa" w:w="4176"/>
             <w:vAlign w:val="center"/>
             <w:tcBorders>
               <w:top w:val="single" w:sz="4" w:color="D9D9D9"/>
@@ -1081,7 +505,7 @@
         </w:trPr>
         <w:tc>
           <w:tcPr>
-            <w:tcW w:type="dxa" w:w="1800"/>
+            <w:tcW w:type="dxa" w:w="1656"/>
             <w:vAlign w:val="center"/>
             <w:tcBorders>
               <w:top w:val="single" w:sz="4" w:color="D9D9D9"/>
@@ -1112,7 +536,7 @@
         </w:tc>
         <w:tc>
           <w:tcPr>
-            <w:tcW w:type="dxa" w:w="4464"/>
+            <w:tcW w:type="dxa" w:w="4392"/>
             <w:vAlign w:val="center"/>
             <w:tcBorders>
               <w:top w:val="single" w:sz="4" w:color="D9D9D9"/>
@@ -1137,13 +561,13 @@
                 <w:b w:val="0"/>
                 <w:sz w:val="20"/>
               </w:rPr>
-              <w:t>表达与原文用词不同，希望按含义寻找</w:t>
+              <w:t>想按含义寻找资料</w:t>
             </w:r>
           </w:p>
         </w:tc>
         <w:tc>
           <w:tcPr>
-            <w:tcW w:type="dxa" w:w="3960"/>
+            <w:tcW w:type="dxa" w:w="4176"/>
             <w:vAlign w:val="center"/>
             <w:tcBorders>
               <w:top w:val="single" w:sz="4" w:color="D9D9D9"/>
@@ -1179,7 +603,7 @@
         </w:trPr>
         <w:tc>
           <w:tcPr>
-            <w:tcW w:type="dxa" w:w="1800"/>
+            <w:tcW w:type="dxa" w:w="1656"/>
             <w:vAlign w:val="center"/>
             <w:tcBorders>
               <w:top w:val="single" w:sz="4" w:color="D9D9D9"/>
@@ -1210,7 +634,7 @@
         </w:tc>
         <w:tc>
           <w:tcPr>
-            <w:tcW w:type="dxa" w:w="4464"/>
+            <w:tcW w:type="dxa" w:w="4392"/>
             <w:vAlign w:val="center"/>
             <w:tcBorders>
               <w:top w:val="single" w:sz="4" w:color="D9D9D9"/>
@@ -1235,13 +659,13 @@
                 <w:b w:val="0"/>
                 <w:sz w:val="20"/>
               </w:rPr>
-              <w:t>同时利用关键词与语义线索</w:t>
+              <w:t>同时参考关键词和内容含义</w:t>
             </w:r>
           </w:p>
         </w:tc>
         <w:tc>
           <w:tcPr>
-            <w:tcW w:type="dxa" w:w="3960"/>
+            <w:tcW w:type="dxa" w:w="4176"/>
             <w:vAlign w:val="center"/>
             <w:tcBorders>
               <w:top w:val="single" w:sz="4" w:color="D9D9D9"/>
@@ -1279,12 +703,12 @@
     </w:p>
     <w:p>
       <w:r>
-        <w:t>左侧展开“筛选文献”，可填写起始年份、结束年份和主题。年份需为整数，起始年份不能晚于结束年份；不限制时留空。主题按馆藏已有标签填写，多个主题用逗号分隔。填写后按 Enter 或移开焦点使筛选生效，再提交搜索。</w:t>
+        <w:t>需要缩小范围时，在左侧展开“筛选文献”，填写起止年份或主题。年份留空表示不限年份；多个主题用逗号分隔。填写后按 Enter，再提交搜索。</w:t>
       </w:r>
     </w:p>
     <w:p>
       <w:r>
-        <w:t>图中使用 2023 至 2023 年及“视觉Transformer”主题，对应所收录的 FQ-ViT 修订版本。这里筛选的是馆藏的版本年份。找不到文献时，先清空筛选再试，尤其注意年份为空的资料可能被年份条件排除。</w:t>
+        <w:t>例如，寻找某篇文献的修订版时，可以用题名配合版本年份筛选。若结果太少，先放宽年份和主题，再尝试更简短的关键词。</w:t>
       </w:r>
     </w:p>
     <w:p>
@@ -1293,12 +717,12 @@
         <w:pageBreakBefore/>
       </w:pPr>
       <w:r>
-        <w:t>5 阅读搜索结果与定位页面</w:t>
+        <w:t>4 阅读搜索结果</w:t>
       </w:r>
     </w:p>
     <w:p>
       <w:r>
-        <w:t>提交后，先看结果顶部的文献数与片段数。文献卡片将同一文献的结果聚合展示；下方各片段带有排名、题名和 PDF 文件页码。搜索结果用于帮助发现资料，仍需打开正文判断是否满足需求。</w:t>
+        <w:t>结果顶部显示命中的文献数和片段数。同一篇文献的内容集中在一张卡片中，便于比较和阅读。</w:t>
       </w:r>
     </w:p>
     <w:p>
@@ -1311,7 +735,7 @@
         <w:drawing>
           <wp:inline xmlns:a="http://schemas.openxmlformats.org/drawingml/2006/main" xmlns:pic="http://schemas.openxmlformats.org/drawingml/2006/picture">
             <wp:extent cx="6400800" cy="3600450"/>
-            <wp:docPr id="6" name="Picture 6" descr="图6 文献聚合结果和页面片段"/>
+            <wp:docPr id="5" name="Picture 5" descr="图5 文献卡片与命中片段"/>
             <wp:cNvGraphicFramePr>
               <a:graphicFrameLocks noChangeAspect="1"/>
             </wp:cNvGraphicFramePr>
@@ -1323,7 +747,7 @@
                     <pic:cNvPicPr/>
                   </pic:nvPicPr>
                   <pic:blipFill>
-                    <a:blip r:embed="rId16"/>
+                    <a:blip r:embed="rId15"/>
                     <a:stretch>
                       <a:fillRect/>
                     </a:stretch>
@@ -1348,7 +772,7 @@
         <w:jc w:val="center"/>
       </w:pPr>
       <w:r>
-        <w:t>图6 文献聚合结果和页面片段</w:t>
+        <w:t>图5 文献卡片与命中片段</w:t>
       </w:r>
     </w:p>
     <w:p>
@@ -1356,7 +780,7 @@
         <w:ind w:left="259" w:hanging="259"/>
       </w:pPr>
       <w:r>
-        <w:t>1. 查看题名、作者、年份和预览文字，确认结果是否相关。</w:t>
+        <w:t>1. 浏览题名、作者、年份和预览文字，选择感兴趣的文献。</w:t>
       </w:r>
     </w:p>
     <w:p>
@@ -1364,7 +788,7 @@
         <w:ind w:left="259" w:hanging="259"/>
       </w:pPr>
       <w:r>
-        <w:t>2. 展开所需的“片段”，阅读该段完整提取文字。</w:t>
+        <w:t>2. 展开“片段”，阅读与搜索内容相关的段落。</w:t>
       </w:r>
     </w:p>
     <w:p>
@@ -1372,7 +796,7 @@
         <w:ind w:left="259" w:hanging="259"/>
       </w:pPr>
       <w:r>
-        <w:t>3. 点击“打开该页”，在浏览器中查看对应 PDF。</w:t>
+        <w:t>3. 点击“打开该页”，继续阅读对应的 PDF 页面。</w:t>
       </w:r>
     </w:p>
     <w:p>
@@ -1380,17 +804,17 @@
         <w:ind w:left="259" w:hanging="259"/>
       </w:pPr>
       <w:r>
-        <w:t>4. 如果检索结果不合适，调整关键词或检索方式，清除过窄的筛选条件后再次提交。</w:t>
+        <w:t>4. 想换一个角度查找时，修改关键词或检索方式，再次提交。</w:t>
       </w:r>
     </w:p>
     <w:p>
       <w:r>
-        <w:t>页码按 PDF 文件第一页开始计数，可能与论文印刷页码不同。搜索结果的“打开该页”依赖浏览器对页码链接的支持；未自动跳转时，按显示的 PDF 文件页码手动定位。这一入口不提供问答支持句高亮。</w:t>
+        <w:t>页面中的页码从 PDF 文件的第一页开始计算。若浏览器打开文件后没有跳到指定页面，按卡片显示的页码手动翻页即可。</w:t>
       </w:r>
     </w:p>
     <w:p>
       <w:r>
-        <w:t>同一篇文献可能命中多个片段，因此片段数量大于文献数量并不表示重复入库。图中的排名、条数和用时只描述本次演示，不能作为整体检索准确率。</w:t>
+        <w:t>一篇文献可以命中多个段落，所以片段数通常多于文献数。</w:t>
       </w:r>
     </w:p>
     <w:p>
@@ -1399,12 +823,12 @@
         <w:pageBreakBefore/>
       </w:pPr>
       <w:r>
-        <w:t>6 选择 PDF 并进行增强识别</w:t>
+        <w:t>5 上传 PDF</w:t>
       </w:r>
     </w:p>
     <w:p>
       <w:r>
-        <w:t>进入“上传与管理 → 上传文献”。准备一份有权用于本项目的 PDF，核对文件完整性，再点击“Upload”选择文件。当前单份文件上限为 25 MB，界面一次处理一份文献。</w:t>
+        <w:t>进入“上传与管理 → 上传文献”，点击“Upload”选择 PDF。系统一次处理一份文献，默认支持 25 MB 以内的文件。</w:t>
       </w:r>
     </w:p>
     <w:p>
@@ -1417,7 +841,7 @@
         <w:drawing>
           <wp:inline xmlns:a="http://schemas.openxmlformats.org/drawingml/2006/main" xmlns:pic="http://schemas.openxmlformats.org/drawingml/2006/picture">
             <wp:extent cx="4937760" cy="2777490"/>
-            <wp:docPr id="7" name="Picture 7" descr="图7 上传入口和识别选项"/>
+            <wp:docPr id="6" name="Picture 6" descr="图6 选择文献并设置识别方式"/>
             <wp:cNvGraphicFramePr>
               <a:graphicFrameLocks noChangeAspect="1"/>
             </wp:cNvGraphicFramePr>
@@ -1429,7 +853,7 @@
                     <pic:cNvPicPr/>
                   </pic:nvPicPr>
                   <pic:blipFill>
-                    <a:blip r:embed="rId17"/>
+                    <a:blip r:embed="rId16"/>
                     <a:stretch>
                       <a:fillRect/>
                     </a:stretch>
@@ -1454,12 +878,12 @@
         <w:jc w:val="center"/>
       </w:pPr>
       <w:r>
-        <w:t>图7 上传入口和识别选项</w:t>
+        <w:t>图6 选择文献并设置识别方式</w:t>
       </w:r>
     </w:p>
     <w:p>
       <w:r>
-        <w:t>默认开启“增强识别（推荐）”。它将 PDF 前两页的图像和文字交给已配置的模型服务，辅助识别题名、作者、语言、来源和版本年份。上传后会显示实际阶段与用时，等待识别完成再核对表单。</w:t>
+        <w:t>保持“增强识别（推荐）”开启，系统会读取 PDF 前两页的图像和文字，填写题名、作者、年份等信息。上传后，页面会显示识别进度和已用时间。</w:t>
       </w:r>
     </w:p>
     <w:p>
@@ -1472,7 +896,7 @@
         <w:drawing>
           <wp:inline xmlns:a="http://schemas.openxmlformats.org/drawingml/2006/main" xmlns:pic="http://schemas.openxmlformats.org/drawingml/2006/picture">
             <wp:extent cx="4937760" cy="1893743"/>
-            <wp:docPr id="8" name="Picture 8" descr="图8 真实增强识别的阶段进度"/>
+            <wp:docPr id="7" name="Picture 7" descr="图7 文献信息识别进度"/>
             <wp:cNvGraphicFramePr>
               <a:graphicFrameLocks noChangeAspect="1"/>
             </wp:cNvGraphicFramePr>
@@ -1484,7 +908,7 @@
                     <pic:cNvPicPr/>
                   </pic:nvPicPr>
                   <pic:blipFill>
-                    <a:blip r:embed="rId18"/>
+                    <a:blip r:embed="rId17"/>
                     <a:srcRect l="28000" r="6000" t="55000" b="0"/>
                     <a:stretch>
                       <a:fillRect/>
@@ -1510,17 +934,17 @@
         <w:jc w:val="center"/>
       </w:pPr>
       <w:r>
-        <w:t>图8 真实增强识别的阶段进度 局部</w:t>
+        <w:t>图7 文献信息识别进度 局部</w:t>
       </w:r>
     </w:p>
     <w:p>
       <w:r>
-        <w:t>“联网补全出版资料”默认关闭。开启后会将题名和前两位作者姓名发送至 Crossref 查询，不发送 PDF，用于补充出版来源及满足版本条件的缺失信息。更改识别选项后，点击“重新识别文献信息”使选项应用到当前文件。</w:t>
+        <w:t>需要补充出版来源时，勾选“联网补全出版资料”。系统会用题名和前两位作者姓名查询 Crossref，补充可匹配的书目信息。更改识别选项后，点击“重新识别文献信息”更新结果。</w:t>
       </w:r>
     </w:p>
     <w:p>
       <w:r>
-        <w:t>关闭增强识别后，系统只尝试本机提取。两种方式都只是元数据预填，不能替代全文 OCR。增强服务失败时，可能保留本机候选；此时按页面提示人工核对，不能把它视为增强识别已成功。</w:t>
+        <w:t>识别完成后，向下查看表单，按下一节核对信息。如果识别未完成，也可以直接对照 PDF 填写。</w:t>
       </w:r>
     </w:p>
     <w:p>
@@ -1529,12 +953,12 @@
         <w:pageBreakBefore/>
       </w:pPr>
       <w:r>
-        <w:t>7 核对识别来源和版本年份</w:t>
+        <w:t>6 核对识别结果</w:t>
       </w:r>
     </w:p>
     <w:p>
       <w:r>
-        <w:t>识别完成后展开“识别结果与来源”，按字段查看识别方法、PDF 页码及依据文字。识别预览本身不会将文献加入可检索馆藏，仍需检查下方表单并点击“导入文献”。</w:t>
+        <w:t>展开“识别结果与来源”，可以看到每个字段的识别结果、所在页码和参考文字。对照 PDF 首页检查题名与作者，再确认年份和来源。</w:t>
       </w:r>
     </w:p>
     <w:p>
@@ -1547,7 +971,7 @@
         <w:drawing>
           <wp:inline xmlns:a="http://schemas.openxmlformats.org/drawingml/2006/main" xmlns:pic="http://schemas.openxmlformats.org/drawingml/2006/picture">
             <wp:extent cx="6400800" cy="3600450"/>
-            <wp:docPr id="9" name="Picture 9" descr="图9 题名作者与版本年份的出处"/>
+            <wp:docPr id="8" name="Picture 8" descr="图8 查看识别结果的来源"/>
             <wp:cNvGraphicFramePr>
               <a:graphicFrameLocks noChangeAspect="1"/>
             </wp:cNvGraphicFramePr>
@@ -1559,7 +983,7 @@
                     <pic:cNvPicPr/>
                   </pic:nvPicPr>
                   <pic:blipFill>
-                    <a:blip r:embed="rId19"/>
+                    <a:blip r:embed="rId18"/>
                     <a:stretch>
                       <a:fillRect/>
                     </a:stretch>
@@ -1584,48 +1008,22 @@
         <w:jc w:val="center"/>
       </w:pPr>
       <w:r>
-        <w:t>图9 题名作者与版本年份的出处</w:t>
-      </w:r>
-    </w:p>
-    <w:p>
-      <w:r/>
-      <w:r>
-        <w:rPr>
-          <w:b/>
-        </w:rPr>
-        <w:t>题名与作者。</w:t>
-      </w:r>
-      <w:r>
-        <w:t xml:space="preserve"> 对照 PDF 首页，检查完整题名、作者总数、姓名拼写和顺序。作者框每行一位；作者较多时要在输入框中滚动检查，不能只核对可见的前几行。</w:t>
-      </w:r>
-    </w:p>
-    <w:p>
-      <w:r/>
-      <w:r>
-        <w:rPr>
-          <w:b/>
-        </w:rPr>
-        <w:t>版本年份。</w:t>
-      </w:r>
-      <w:r>
-        <w:t xml:space="preserve"> 填写与当前收录 PDF 对应的年份。预印本、公开稿和修订版均可收录；无需为了填写正式发表年份而更换已有明确的版本年份。图中的 FQ-ViT 文件标有“17 Feb 2023”的版本戳，因此本次填写 2023。</w:t>
-      </w:r>
-    </w:p>
-    <w:p>
-      <w:r/>
-      <w:r>
-        <w:rPr>
-          <w:b/>
-        </w:rPr>
-        <w:t>依据不足时。</w:t>
-      </w:r>
-      <w:r>
-        <w:t xml:space="preserve"> 允许年份留空；不要将参考文献年份、文件下载时间或无关版权年份猜作本文件年份。外部出版记录与文件版本不一致时，先保留文件版本信息并人工核对，不能直接覆盖。</w:t>
+        <w:t>图8 查看识别结果的来源</w:t>
       </w:r>
     </w:p>
     <w:p>
       <w:r>
-        <w:t>如果开启联网补全，界面可能显示相关出版记录或冲突。补全结果仍是候选。外部服务没有匹配到记录，并不表示这份论文不能收录。</w:t>
+        <w:t>题名应包含完整的主标题和副标题。作者按原文顺序填写，每行一位；名单较长时，滚动查看后面的姓名。</w:t>
+      </w:r>
+    </w:p>
+    <w:p>
+      <w:r>
+        <w:t>年份填写当前这份 PDF 对应的版本年份。预印本、公开稿和修订版都可以收录。例如，图中的文件带有“17 Feb 2023”版本日期，填写 2023 即可。暂时找不到年份时，可以留空，其他信息照常填写。</w:t>
+      </w:r>
+    </w:p>
+    <w:p>
+      <w:r>
+        <w:t>如果联网补全找到了不同年份的出版记录，可以先比较它与手中 PDF 的版本，再决定采用哪一项。</w:t>
       </w:r>
     </w:p>
     <w:p>
@@ -1634,12 +1032,12 @@
         <w:pageBreakBefore/>
       </w:pPr>
       <w:r>
-        <w:t>8 填写编目信息并导入</w:t>
+        <w:t>7 填写编目信息</w:t>
       </w:r>
     </w:p>
     <w:p>
       <w:r>
-        <w:t>在表单中修正候选信息，选择一个所属学科，补充主题和使用说明，然后点击“导入文献”。“重新识别文献信息”会重新预填识别字段，可能替换人工修改；手工修订后不要随意再次识别。</w:t>
+        <w:t>在表单中修正识别结果，选择所属学科，并补充主题、语言等信息。下面的表格可以作为填写时的参考。</w:t>
       </w:r>
     </w:p>
     <w:p>
@@ -1652,7 +1050,7 @@
         <w:drawing>
           <wp:inline xmlns:a="http://schemas.openxmlformats.org/drawingml/2006/main" xmlns:pic="http://schemas.openxmlformats.org/drawingml/2006/picture">
             <wp:extent cx="5669280" cy="3188970"/>
-            <wp:docPr id="10" name="Picture 10" descr="图10 编目表单和与文件对应的年份"/>
+            <wp:docPr id="9" name="Picture 9" descr="图9 文献编目表单"/>
             <wp:cNvGraphicFramePr>
               <a:graphicFrameLocks noChangeAspect="1"/>
             </wp:cNvGraphicFramePr>
@@ -1664,7 +1062,7 @@
                     <pic:cNvPicPr/>
                   </pic:nvPicPr>
                   <pic:blipFill>
-                    <a:blip r:embed="rId20"/>
+                    <a:blip r:embed="rId19"/>
                     <a:stretch>
                       <a:fillRect/>
                     </a:stretch>
@@ -1689,7 +1087,7 @@
         <w:jc w:val="center"/>
       </w:pPr>
       <w:r>
-        <w:t>图10 编目表单和与文件对应的年份</w:t>
+        <w:t>图9 文献编目表单</w:t>
       </w:r>
     </w:p>
     <w:tbl>
@@ -1765,7 +1163,7 @@
                 <w:b/>
                 <w:sz w:val="20"/>
               </w:rPr>
-              <w:t>填写方法</w:t>
+              <w:t>填写示例或方法</w:t>
             </w:r>
           </w:p>
         </w:tc>
@@ -1832,7 +1230,7 @@
                 <w:b w:val="0"/>
                 <w:sz w:val="20"/>
               </w:rPr>
-              <w:t>与 PDF 一致；留空会标为待核验，不推荐作为常规做法</w:t>
+              <w:t>按 PDF 首页填写完整题名</w:t>
             </w:r>
           </w:p>
         </w:tc>
@@ -1899,7 +1297,7 @@
                 <w:b w:val="0"/>
                 <w:sz w:val="20"/>
               </w:rPr>
-              <w:t>每行一位，保留原始顺序；滚动检查长名单</w:t>
+              <w:t>每行一位，保持原文顺序</w:t>
             </w:r>
           </w:p>
         </w:tc>
@@ -1966,7 +1364,7 @@
                 <w:b w:val="0"/>
                 <w:sz w:val="20"/>
               </w:rPr>
-              <w:t>整数或留空，与本 PDF 版本对应</w:t>
+              <w:t>如 2023；暂不确定时留空</w:t>
             </w:r>
           </w:p>
         </w:tc>
@@ -2033,7 +1431,7 @@
                 <w:b w:val="0"/>
                 <w:sz w:val="20"/>
               </w:rPr>
-              <w:t>必选，从三个学科方向中选择一项</w:t>
+              <w:t>选择最贴近文献内容的学科</w:t>
             </w:r>
           </w:p>
         </w:tc>
@@ -2100,7 +1498,7 @@
                 <w:b w:val="0"/>
                 <w:sz w:val="20"/>
               </w:rPr>
-              <w:t>用逗号分隔，如“模型量化,视觉Transformer”</w:t>
+              <w:t>如“模型量化,视觉Transformer”</w:t>
             </w:r>
           </w:p>
         </w:tc>
@@ -2167,7 +1565,7 @@
                 <w:b w:val="0"/>
                 <w:sz w:val="20"/>
               </w:rPr>
-              <w:t>选择中文、英文、中英混合或未确定</w:t>
+              <w:t>中文、英文、中英混合或未确定</w:t>
             </w:r>
           </w:p>
         </w:tc>
@@ -2234,7 +1632,7 @@
                 <w:b w:val="0"/>
                 <w:sz w:val="20"/>
               </w:rPr>
-              <w:t>可选，填写可核对的来源或 DOI 地址</w:t>
+              <w:t>文献主页或 DOI 地址，可留空</w:t>
             </w:r>
           </w:p>
         </w:tc>
@@ -2301,7 +1699,7 @@
                 <w:b w:val="0"/>
                 <w:sz w:val="20"/>
               </w:rPr>
-              <w:t>如实说明用途和许可条件，不把“公开可下载”等同于可再分发</w:t>
+              <w:t>如“课程研究使用”及适用的许可信息</w:t>
             </w:r>
           </w:p>
         </w:tc>
@@ -2314,7 +1712,12 @@
     </w:p>
     <w:p>
       <w:r>
-        <w:t>点击导入后，系统解析正文、准备检索并建立索引。等待结果提示，再到“文献管理”确认状态。识别进度完成与正文入库成功是两个不同阶段，不能只凭识别完成判断文献已经可检索。</w:t>
+        <w:t>确认后点击“导入文献”。系统会解析正文并建立检索索引，完成后可在“文献管理”查看状态。</w:t>
+      </w:r>
+    </w:p>
+    <w:p>
+      <w:r>
+        <w:t>“重新识别文献信息”会重新填写识别字段。已经手工修改表单时，先保留需要的内容，再重新识别。</w:t>
       </w:r>
     </w:p>
     <w:p>
@@ -2323,12 +1726,12 @@
         <w:pageBreakBefore/>
       </w:pPr>
       <w:r>
-        <w:t>9 确认入库并处理正文审核</w:t>
+        <w:t>8 查看入库状态</w:t>
       </w:r>
     </w:p>
     <w:p>
       <w:r>
-        <w:t>进入“上传与管理 → 文献管理”，检查刚导入的题名和状态。只有“可阅读”的文献进入公开馆藏与检索；管理页也会保留未完成和待核对的记录，便于查原因。</w:t>
+        <w:t>进入“上传与管理 → 文献管理”，找到刚添加的文献。状态为“可阅读”时，就可以在馆藏中浏览、搜索和提问。</w:t>
       </w:r>
     </w:p>
     <w:p>
@@ -2341,7 +1744,7 @@
         <w:drawing>
           <wp:inline xmlns:a="http://schemas.openxmlformats.org/drawingml/2006/main" xmlns:pic="http://schemas.openxmlformats.org/drawingml/2006/picture">
             <wp:extent cx="5669280" cy="2657475"/>
-            <wp:docPr id="11" name="Picture 11" descr="图11 混合扫描正文暂停入库的提示"/>
+            <wp:docPr id="10" name="Picture 10" descr="图10 文献状态与正文核对提示"/>
             <wp:cNvGraphicFramePr>
               <a:graphicFrameLocks noChangeAspect="1"/>
             </wp:cNvGraphicFramePr>
@@ -2353,7 +1756,7 @@
                     <pic:cNvPicPr/>
                   </pic:nvPicPr>
                   <pic:blipFill>
-                    <a:blip r:embed="rId21"/>
+                    <a:blip r:embed="rId20"/>
                     <a:srcRect l="28000" r="6000" t="20000" b="25000"/>
                     <a:stretch>
                       <a:fillRect/>
@@ -2379,7 +1782,7 @@
         <w:jc w:val="center"/>
       </w:pPr>
       <w:r>
-        <w:t>图11 混合扫描正文暂停入库的提示 局部</w:t>
+        <w:t>图10 文献状态与正文核对提示 局部</w:t>
       </w:r>
     </w:p>
     <w:tbl>
@@ -2424,7 +1827,7 @@
                 <w:b/>
                 <w:sz w:val="20"/>
               </w:rPr>
-              <w:t>显示状态</w:t>
+              <w:t>状态</w:t>
             </w:r>
           </w:p>
         </w:tc>
@@ -2455,7 +1858,7 @@
                 <w:b/>
                 <w:sz w:val="20"/>
               </w:rPr>
-              <w:t>含义与下一步</w:t>
+              <w:t>接下来怎么做</w:t>
             </w:r>
           </w:p>
         </w:tc>
@@ -2522,7 +1925,7 @@
                 <w:b w:val="0"/>
                 <w:sz w:val="20"/>
               </w:rPr>
-              <w:t>已完成入库；到搜索页用题名验证，并打开原文检查</w:t>
+              <w:t>用题名搜索文献，打开原文阅读</w:t>
             </w:r>
           </w:p>
         </w:tc>
@@ -2589,7 +1992,7 @@
                 <w:b w:val="0"/>
                 <w:sz w:val="20"/>
               </w:rPr>
-              <w:t>等待完成，避免连续重复上传</w:t>
+              <w:t>等待处理完成，再刷新查看</w:t>
             </w:r>
           </w:p>
         </w:tc>
@@ -2656,7 +2059,7 @@
                 <w:b w:val="0"/>
                 <w:sz w:val="20"/>
               </w:rPr>
-              <w:t>按提示核对具体页码，修复 OCR 或文字层后重传</w:t>
+              <w:t>打开提示页码，检查扫描页或乱码</w:t>
             </w:r>
           </w:p>
         </w:tc>
@@ -2723,7 +2126,7 @@
                 <w:b w:val="0"/>
                 <w:sz w:val="20"/>
               </w:rPr>
-              <w:t>阅读原因；排查文件、服务或配置后再处理</w:t>
+              <w:t>查看错误提示，处理后重新上传</w:t>
             </w:r>
           </w:p>
         </w:tc>
@@ -2736,17 +2139,12 @@
     </w:p>
     <w:p>
       <w:r>
-        <w:t>图中 Job Market Signaling 的第 2 至 21 页缺少可用文字层，因此停止导入。Modern Moral Philosophy 的文字层疑似乱码，同样需要核对。这两份原件专用于展示审核提示，通过现有接口准备，不是本轮在浏览器中逐份上传的实验。</w:t>
+        <w:t>“待核对正文”通常表示部分页面缺少可提取文字，或提取出的文字存在乱码。图中提示了需要检查的具体页码。打开 PDF 查看这些页面，需要时使用 OCR 工具识别文字，或换用文字清晰的版本后重新上传。</w:t>
       </w:r>
     </w:p>
     <w:p>
       <w:r>
-        <w:t>请打开原 PDF，检查页面是否有正文、是否扫描、复制出来的文字是否正常。需要时用外部工具做 OCR 或换用可提取文字的版本，再逐页抽查正文顺序和完整性。本项目没有“一键忽略审核”或内置全文 OCR 按钮。</w:t>
-      </w:r>
-    </w:p>
-    <w:p>
-      <w:r>
-        <w:t>同一 PDF 重复导入会保留已有记录及原元数据，不能用重传同一文件来修改既有编目。当前界面没有直接修改已入库元数据、删除馆藏或批量审批的入口，需要维护者另行处理。</w:t>
+        <w:t>重复上传同一份 PDF 时，系统会保留已有文献记录。如果需要修改已入库的编目信息，可联系维护者处理。</w:t>
       </w:r>
     </w:p>
     <w:p>
@@ -2755,17 +2153,17 @@
         <w:pageBreakBefore/>
       </w:pPr>
       <w:r>
-        <w:t>10 发起有证据的问答</w:t>
+        <w:t>9 向馆藏提问</w:t>
       </w:r>
     </w:p>
     <w:p>
       <w:r>
-        <w:t>进入“搜索与问答”，将“操作”改为“问答”，输入一个范围明确的问题并点击“提交”。“搜索方式”下拉框用于搜索操作；问答会自动组织检索。当前每次提交都是独立请求，补问时请保留必要上下文。</w:t>
+        <w:t>进入“搜索与问答”，将“操作”改为“问答”，输入问题并点击“提交”。系统会从馆藏中寻找相关内容，组织回答，并为回答附上引用。</w:t>
       </w:r>
     </w:p>
     <w:p>
       <w:r>
-        <w:t>可复用示例：FQ-ViT 中 Power-of-Two Factor 解决什么问题？请用两句话概括，并引用原文。</w:t>
+        <w:t>例如，馆藏已有 FQ-ViT 论文时，可以问：“FQ-ViT 中 Power-of-Two Factor 解决什么问题？请用两句话概括，并引用原文。”也可以把题名和问题换成你正在阅读的文献。</w:t>
       </w:r>
     </w:p>
     <w:p>
@@ -2778,7 +2176,7 @@
         <w:drawing>
           <wp:inline xmlns:a="http://schemas.openxmlformats.org/drawingml/2006/main" xmlns:pic="http://schemas.openxmlformats.org/drawingml/2006/picture">
             <wp:extent cx="6400800" cy="3600450"/>
-            <wp:docPr id="12" name="Picture 12" descr="图12 真实问答结果和引用角标"/>
+            <wp:docPr id="11" name="Picture 11" descr="图11 查看回答与引用"/>
             <wp:cNvGraphicFramePr>
               <a:graphicFrameLocks noChangeAspect="1"/>
             </wp:cNvGraphicFramePr>
@@ -2790,7 +2188,7 @@
                     <pic:cNvPicPr/>
                   </pic:nvPicPr>
                   <pic:blipFill>
-                    <a:blip r:embed="rId22"/>
+                    <a:blip r:embed="rId21"/>
                     <a:stretch>
                       <a:fillRect/>
                     </a:stretch>
@@ -2815,22 +2213,17 @@
         <w:jc w:val="center"/>
       </w:pPr>
       <w:r>
-        <w:t>图12 真实问答结果和引用角标</w:t>
+        <w:t>图11 查看回答与引用</w:t>
       </w:r>
     </w:p>
     <w:p>
       <w:r>
-        <w:t>右侧依次显示理解问题、检索、选择证据、整合回答、核验引用与句子定位等阶段。模型响应速度会变化，演示中的约 34 秒不是时限承诺。等待期间不要连续提交；超过等待时限时，先查看状态再决定重试。</w:t>
+        <w:t>右侧会依次显示理解问题、检索、选择证据和整理回答等进度。完成后，先阅读回答，再展开“系统理解”和“问题要点与回答范围”，查看系统如何理解这次提问。</w:t>
       </w:r>
     </w:p>
     <w:p>
       <w:r>
-        <w:t>回答显示后，展开“系统理解”检查系统是否正确理解问题，再阅读“问题要点与回答范围”和限制提示。若要求澄清，选择选项或补充说明后重新提问；若提示证据不足，先补充馆藏或缩小问题，不应将没有证据的内容作为结论。</w:t>
-      </w:r>
-    </w:p>
-    <w:p>
-      <w:r>
-        <w:t>本节实拍时 PR6 仍为修复候选，现已通过验收合入 main。旧版本在较慢阶段可能因进度区重复标识报错；部署更新前仍可能遇到该问题，本节截图不代表旧实例已更新。</w:t>
+        <w:t>每次提问单独处理。继续追问时，在问题中写明文献和讨论对象，会更容易得到相关回答。如果系统需要澄清，选择合适的选项后再次提交；如果馆藏内容不足，可以缩小问题范围，或补充相关文献后再问。</w:t>
       </w:r>
     </w:p>
     <w:p>
@@ -2839,12 +2232,12 @@
         <w:pageBreakBefore/>
       </w:pPr>
       <w:r>
-        <w:t>11 核对引用并查看 PDF 原页</w:t>
+        <w:t>10 查看引用和原文</w:t>
       </w:r>
     </w:p>
     <w:p>
       <w:r>
-        <w:t>点击回答中的引用角标，可打开对应的原文页。也可先点击“核对原文”下的“[1] 查看原文”，展开同编号证据卡片，阅读支持文字、作者、版本年份和 PDF 文件页码。</w:t>
+        <w:t>点击回答中的引用角标，可以打开对应的原文页。也可以在“核对原文”中点击“[1] 查看原文”，先阅读证据卡片中的支持文字和文献信息。</w:t>
       </w:r>
     </w:p>
     <w:p>
@@ -2857,7 +2250,7 @@
         <w:drawing>
           <wp:inline xmlns:a="http://schemas.openxmlformats.org/drawingml/2006/main" xmlns:pic="http://schemas.openxmlformats.org/drawingml/2006/picture">
             <wp:extent cx="4937760" cy="2777490"/>
-            <wp:docPr id="13" name="Picture 13" descr="图13 展开的引用证据和原文件入口"/>
+            <wp:docPr id="12" name="Picture 12" descr="图12 展开引用内容"/>
             <wp:cNvGraphicFramePr>
               <a:graphicFrameLocks noChangeAspect="1"/>
             </wp:cNvGraphicFramePr>
@@ -2869,7 +2262,7 @@
                     <pic:cNvPicPr/>
                   </pic:nvPicPr>
                   <pic:blipFill>
-                    <a:blip r:embed="rId23"/>
+                    <a:blip r:embed="rId22"/>
                     <a:stretch>
                       <a:fillRect/>
                     </a:stretch>
@@ -2894,12 +2287,12 @@
         <w:jc w:val="center"/>
       </w:pPr>
       <w:r>
-        <w:t>图13 展开的引用证据和原文件入口</w:t>
+        <w:t>图12 展开引用内容</w:t>
       </w:r>
     </w:p>
     <w:p>
       <w:r>
-        <w:t>在证据卡片点击“查看高亮原文与 PDF 原页”，进入独立核验页。黄色区域是该引用选中的支持句子，下方提供对应 PDF 原页预览；点击“打开 PDF 原文件”可继续阅读完整上下文。</w:t>
+        <w:t>在证据卡片中点击“查看高亮原文与 PDF 原页”，进入原文页面。黄色区域标出了回答引用的句子，下方提供对应的 PDF 页面预览。</w:t>
       </w:r>
     </w:p>
     <w:p>
@@ -2912,7 +2305,7 @@
         <w:drawing>
           <wp:inline xmlns:a="http://schemas.openxmlformats.org/drawingml/2006/main" xmlns:pic="http://schemas.openxmlformats.org/drawingml/2006/picture">
             <wp:extent cx="4937760" cy="2779198"/>
-            <wp:docPr id="14" name="Picture 14" descr="图14 高亮原文和 PDF 原页核验入口"/>
+            <wp:docPr id="13" name="Picture 13" descr="图13 阅读高亮句子和 PDF 原页"/>
             <wp:cNvGraphicFramePr>
               <a:graphicFrameLocks noChangeAspect="1"/>
             </wp:cNvGraphicFramePr>
@@ -2924,7 +2317,7 @@
                     <pic:cNvPicPr/>
                   </pic:nvPicPr>
                   <pic:blipFill>
-                    <a:blip r:embed="rId24"/>
+                    <a:blip r:embed="rId23"/>
                     <a:stretch>
                       <a:fillRect/>
                     </a:stretch>
@@ -2949,12 +2342,12 @@
         <w:jc w:val="center"/>
       </w:pPr>
       <w:r>
-        <w:t>图14 高亮原文和 PDF 原页核验入口</w:t>
+        <w:t>图13 阅读高亮句子和 PDF 原页</w:t>
       </w:r>
     </w:p>
     <w:p>
       <w:r>
-        <w:t>核对时依次确认文献、文件页码、支持句与上下文。出现高亮不等于结论必然正确；原文是否支持回答仍需读者判断。遇到索引版本变化导致旧链接失效，应重新搜索或提问获取当前引用。PDF 页码始终按文件计数。</w:t>
+        <w:t>阅读高亮句子及前后段落，可以判断回答是否符合原意。想继续阅读全文时，点击“打开 PDF 原文件”。</w:t>
       </w:r>
     </w:p>
     <w:p>
@@ -2963,7 +2356,7 @@
         <w:pageBreakBefore/>
       </w:pPr>
       <w:r>
-        <w:t>12 常见问题与视频演示顺序</w:t>
+        <w:t>11 常见问题和演示顺序</w:t>
       </w:r>
     </w:p>
     <w:tbl>
@@ -3039,7 +2432,7 @@
                 <w:b/>
                 <w:sz w:val="20"/>
               </w:rPr>
-              <w:t>建议处理</w:t>
+              <w:t>处理方法</w:t>
             </w:r>
           </w:p>
         </w:tc>
@@ -3075,7 +2468,7 @@
                 <w:b w:val="0"/>
                 <w:sz w:val="20"/>
               </w:rPr>
-              <w:t>网页打不开或提示后端连接失败</w:t>
+              <w:t>网页打不开</w:t>
             </w:r>
           </w:p>
         </w:tc>
@@ -3106,7 +2499,7 @@
                 <w:b w:val="0"/>
                 <w:sz w:val="20"/>
               </w:rPr>
-              <w:t>检查访问入口和服务状态；不要随意结束占用端口的其他进程</w:t>
+              <w:t>确认图书馆已启动，并检查浏览器地址</w:t>
             </w:r>
           </w:p>
         </w:tc>
@@ -3142,7 +2535,7 @@
                 <w:b w:val="0"/>
                 <w:sz w:val="20"/>
               </w:rPr>
-              <w:t>增强识别超时或未成功</w:t>
+              <w:t>提示后端连接失败</w:t>
             </w:r>
           </w:p>
         </w:tc>
@@ -3173,7 +2566,22 @@
                 <w:b w:val="0"/>
                 <w:sz w:val="20"/>
               </w:rPr>
-              <w:t>检查增强识别服务配置与网络；阅读提示，核对保留下来的本机候选或稍后重试</w:t>
+              <w:t xml:space="preserve">在项目目录运行 </w:t>
+            </w:r>
+            <w:r>
+              <w:rPr>
+                <w:rFonts w:ascii="Consolas" w:hAnsi="Consolas"/>
+                <w:b w:val="0"/>
+                <w:sz w:val="20"/>
+              </w:rPr>
+              <w:t>./Status-Library.ps1 -Mode real</w:t>
+            </w:r>
+            <w:r>
+              <w:rPr>
+                <w:b w:val="0"/>
+                <w:sz w:val="20"/>
+              </w:rPr>
+              <w:t xml:space="preserve"> 查看状态</w:t>
             </w:r>
           </w:p>
         </w:tc>
@@ -3209,7 +2617,7 @@
                 <w:b w:val="0"/>
                 <w:sz w:val="20"/>
               </w:rPr>
-              <w:t>题名作者不完整或年份为空</w:t>
+              <w:t>识别没有完成</w:t>
             </w:r>
           </w:p>
         </w:tc>
@@ -3240,7 +2648,7 @@
                 <w:b w:val="0"/>
                 <w:sz w:val="20"/>
               </w:rPr>
-              <w:t>对照当前 PDF 人工填写；有依据再填年份</w:t>
+              <w:t>稍后点击“重新识别文献信息”，或对照 PDF 填写表单</w:t>
             </w:r>
           </w:p>
         </w:tc>
@@ -3276,7 +2684,7 @@
                 <w:b w:val="0"/>
                 <w:sz w:val="20"/>
               </w:rPr>
-              <w:t>搜索结果为空</w:t>
+              <w:t>题名或作者识别不完整</w:t>
             </w:r>
           </w:p>
         </w:tc>
@@ -3307,7 +2715,7 @@
                 <w:b w:val="0"/>
                 <w:sz w:val="20"/>
               </w:rPr>
-              <w:t>清空年份与主题限制，再用准确题名和关键词搜索</w:t>
+              <w:t>在导入前直接修改对应字段</w:t>
             </w:r>
           </w:p>
         </w:tc>
@@ -3343,7 +2751,7 @@
                 <w:b w:val="0"/>
                 <w:sz w:val="20"/>
               </w:rPr>
-              <w:t>正文待核对</w:t>
+              <w:t>搜索不到资料</w:t>
             </w:r>
           </w:p>
         </w:tc>
@@ -3374,7 +2782,7 @@
                 <w:b w:val="0"/>
                 <w:sz w:val="20"/>
               </w:rPr>
-              <w:t>按页码检查扫描或乱码，完成外部 OCR 或更换版本后重传</w:t>
+              <w:t>放宽年份与主题筛选，再用题名或关键词搜索</w:t>
             </w:r>
           </w:p>
         </w:tc>
@@ -3410,7 +2818,7 @@
                 <w:b w:val="0"/>
                 <w:sz w:val="20"/>
               </w:rPr>
-              <w:t>问答页面报重复标识错误</w:t>
+              <w:t>提示正文待核对</w:t>
             </w:r>
           </w:p>
         </w:tc>
@@ -3441,7 +2849,7 @@
                 <w:b w:val="0"/>
                 <w:sz w:val="20"/>
               </w:rPr>
-              <w:t>PR6 已合入 main；核对是否仍在运行旧版本，交由维护者部署更新</w:t>
+              <w:t>查看提示页码，完成 OCR 或更换 PDF 后重传</w:t>
             </w:r>
           </w:p>
         </w:tc>
@@ -3477,7 +2885,7 @@
                 <w:b w:val="0"/>
                 <w:sz w:val="20"/>
               </w:rPr>
-              <w:t>重传后元数据没有变化</w:t>
+              <w:t>问答提示证据不足</w:t>
             </w:r>
           </w:p>
         </w:tc>
@@ -3508,7 +2916,74 @@
                 <w:b w:val="0"/>
                 <w:sz w:val="20"/>
               </w:rPr>
-              <w:t>同一文件去重保留原记录；需要维护者处理，不要重复提交</w:t>
+              <w:t>写清问题中的文献和主题，或补充相关馆藏</w:t>
+            </w:r>
+          </w:p>
+        </w:tc>
+      </w:tr>
+      <w:tr>
+        <w:trPr>
+          <w:cantSplit/>
+        </w:trPr>
+        <w:tc>
+          <w:tcPr>
+            <w:tcW w:type="dxa" w:w="2448"/>
+            <w:vAlign w:val="center"/>
+            <w:tcBorders>
+              <w:top w:val="single" w:sz="4" w:color="D9D9D9"/>
+              <w:left w:val="single" w:sz="4" w:color="D9D9D9"/>
+              <w:bottom w:val="single" w:sz="4" w:color="D9D9D9"/>
+              <w:right w:val="single" w:sz="4" w:color="D9D9D9"/>
+            </w:tcBorders>
+            <w:tcMar>
+              <w:top w:w="85" w:type="dxa"/>
+              <w:bottom w:w="85" w:type="dxa"/>
+              <w:left w:w="105" w:type="dxa"/>
+              <w:right w:w="105" w:type="dxa"/>
+            </w:tcMar>
+            <w:shd w:fill="F7F9FB"/>
+          </w:tcPr>
+          <w:p>
+            <w:pPr>
+              <w:spacing w:after="20" w:line="254" w:lineRule="auto"/>
+            </w:pPr>
+            <w:r>
+              <w:rPr>
+                <w:b w:val="0"/>
+                <w:sz w:val="20"/>
+              </w:rPr>
+              <w:t>已入库的信息需要修改</w:t>
+            </w:r>
+          </w:p>
+        </w:tc>
+        <w:tc>
+          <w:tcPr>
+            <w:tcW w:type="dxa" w:w="7776"/>
+            <w:vAlign w:val="center"/>
+            <w:tcBorders>
+              <w:top w:val="single" w:sz="4" w:color="D9D9D9"/>
+              <w:left w:val="single" w:sz="4" w:color="D9D9D9"/>
+              <w:bottom w:val="single" w:sz="4" w:color="D9D9D9"/>
+              <w:right w:val="single" w:sz="4" w:color="D9D9D9"/>
+            </w:tcBorders>
+            <w:tcMar>
+              <w:top w:w="85" w:type="dxa"/>
+              <w:bottom w:w="85" w:type="dxa"/>
+              <w:left w:w="105" w:type="dxa"/>
+              <w:right w:w="105" w:type="dxa"/>
+            </w:tcMar>
+            <w:shd w:fill="F7F9FB"/>
+          </w:tcPr>
+          <w:p>
+            <w:pPr>
+              <w:spacing w:after="20" w:line="254" w:lineRule="auto"/>
+            </w:pPr>
+            <w:r>
+              <w:rPr>
+                <w:b w:val="0"/>
+                <w:sz w:val="20"/>
+              </w:rPr>
+              <w:t>联系维护者调整现有记录</w:t>
             </w:r>
           </w:p>
         </w:tc>
@@ -3521,7 +2996,7 @@
     </w:p>
     <w:p>
       <w:r>
-        <w:t>建议录制 6 至 8 分钟的操作视频，按以下顺序展示。录制前先完整预演一次，准备一份正常 PDF 和一份已知扫描问题样本；按实际情况呈现等待与失败。</w:t>
+        <w:t>演示系统时，可以选一篇文献，把下面几个步骤连起来：</w:t>
       </w:r>
     </w:p>
     <w:p>
@@ -3529,7 +3004,7 @@
         <w:ind w:left="259" w:hanging="259"/>
       </w:pPr>
       <w:r>
-        <w:t>1. 约 40 秒：说明项目用途，展示当前环境、运行模式和馆藏分类。</w:t>
+        <w:t>1. 从馆藏首页浏览学科分类，打开一篇文献。</w:t>
       </w:r>
     </w:p>
     <w:p>
@@ -3537,7 +3012,7 @@
         <w:ind w:left="259" w:hanging="259"/>
       </w:pPr>
       <w:r>
-        <w:t>2. 约 60 秒：用准确题名搜索，再演示年份或主题筛选及 PDF 页码定位。</w:t>
+        <w:t>2. 用题名搜索，再尝试语义或混合检索，并打开命中页。</w:t>
       </w:r>
     </w:p>
     <w:p>
@@ -3545,7 +3020,7 @@
         <w:ind w:left="259" w:hanging="259"/>
       </w:pPr>
       <w:r>
-        <w:t>3. 约 2 分钟：上传 PDF，展示增强识别，解释来源、作者顺序和版本年份，再提交导入。</w:t>
+        <w:t>3. 上传一份 PDF，查看增强识别结果，修正信息后导入。</w:t>
       </w:r>
     </w:p>
     <w:p>
@@ -3553,7 +3028,7 @@
         <w:ind w:left="259" w:hanging="259"/>
       </w:pPr>
       <w:r>
-        <w:t>4. 约 60 秒：在文献管理确认“可阅读”，搜索新题名并打开原文。</w:t>
+        <w:t>4. 在文献管理确认“可阅读”，再搜索新加入的文献。</w:t>
       </w:r>
     </w:p>
     <w:p>
@@ -3561,121 +3036,12 @@
         <w:ind w:left="259" w:hanging="259"/>
       </w:pPr>
       <w:r>
-        <w:t>5. 约 2 分钟：提交一个明确问题，展示实际进度、回答角标及高亮原文核验。</w:t>
-      </w:r>
-    </w:p>
-    <w:p>
-      <w:pPr>
-        <w:ind w:left="259" w:hanging="259"/>
-      </w:pPr>
-      <w:r>
-        <w:t>6. 约 40 秒：展示“待核对正文”的页码提示，说明人工复核与外部 OCR 的边界。</w:t>
+        <w:t>5. 提出一个与该文献有关的问题，展开引用并阅读高亮原文。</w:t>
       </w:r>
     </w:p>
     <w:p>
       <w:r>
-        <w:t>录制内容不应包含私有配置、登录凭证或代理口令。可以剪短等待，但需说明有剪辑；单次演示成功不能替代正式评测。课程要求个人讲解 10 至 15 分钟，可另用 4 至 7 分钟解释元数据质量评价方法、缺陷与修复证据。</w:t>
-      </w:r>
-    </w:p>
-    <w:p>
-      <w:pPr>
-        <w:pStyle w:val="Heading1"/>
-        <w:pageBreakBefore/>
-      </w:pPr>
-      <w:r>
-        <w:t>13 维护入口与可追溯记录</w:t>
-      </w:r>
-    </w:p>
-    <w:p>
-      <w:r>
-        <w:t>日常使用以浏览器界面为主。维护者可在已配置的部署根目录查看状态、启动或停止所需模式。停止前等待正在进行的上传与问答结束；图书馆停止脚本不等同于停止共享模型服务。</w:t>
-      </w:r>
-    </w:p>
-    <w:p>
-      <w:pPr>
-        <w:spacing w:after="100"/>
-      </w:pPr>
-      <w:r>
-        <w:rPr>
-          <w:rFonts w:ascii="Consolas" w:hAnsi="Consolas"/>
-          <w:sz w:val="20"/>
-        </w:rPr>
-        <w:t>.\Status-Library.ps1</w:t>
-      </w:r>
-    </w:p>
-    <w:p>
-      <w:pPr>
-        <w:spacing w:after="100"/>
-      </w:pPr>
-      <w:r>
-        <w:rPr>
-          <w:rFonts w:ascii="Consolas" w:hAnsi="Consolas"/>
-          <w:sz w:val="20"/>
-        </w:rPr>
-        <w:t>.\Start-Library.ps1 -Mode real</w:t>
-      </w:r>
-    </w:p>
-    <w:p>
-      <w:pPr>
-        <w:spacing w:after="100"/>
-      </w:pPr>
-      <w:r>
-        <w:rPr>
-          <w:rFonts w:ascii="Consolas" w:hAnsi="Consolas"/>
-          <w:sz w:val="20"/>
-        </w:rPr>
-        <w:t>.\Stop-Library.ps1 -Mode real</w:t>
-      </w:r>
-    </w:p>
-    <w:p>
-      <w:r>
-        <w:t>独立文档演示环境不使用上述正式端口启动入口。拍摄记录及数据位置见同目录的 verification.json，本轮验收见 acceptance-20261019.json；正式馆藏与历史 dev 数据未迁移或重建。</w:t>
-      </w:r>
-    </w:p>
-    <w:p>
-      <w:r/>
-      <w:r>
-        <w:rPr>
-          <w:b/>
-        </w:rPr>
-        <w:t>记录一次馆藏新增。</w:t>
-      </w:r>
-      <w:r>
-        <w:t xml:space="preserve"> 为批次指定工作项与环境，保留原文件哈希、识别候选、人工修改及理由、最终元数据、导入状态、题名检索结果和正文抽查页码。注明谁实际核查了哪些内容，区分人工审核、模型辅助与自动检查。</w:t>
-      </w:r>
-    </w:p>
-    <w:p>
-      <w:r/>
-      <w:r>
-        <w:rPr>
-          <w:b/>
-        </w:rPr>
-        <w:t>记录一次缺陷修复。</w:t>
-      </w:r>
-      <w:r>
-        <w:t xml:space="preserve"> 保存可复现输入、失败现象、原因、修复提交、目标检查和回归结果。每项修复独立分支、独立 PR；使用手册也作为独立文档工作项提交，审核后再决定合并。</w:t>
-      </w:r>
-    </w:p>
-    <w:p>
-      <w:r>
-        <w:t>本手册的页面截图均由真实浏览器采集，没有绘制或伪造成功页面。演示正常馆藏为 4 篇，另有 2 篇待核对记录；早期首页截图只有 4 篇，后续管理页显示 6 条记录，差异来自审核样本的加入。问答取自真实 BGE 与 Luna 调用，未将 MOCK 结果充作真实结果。</w:t>
-      </w:r>
-    </w:p>
-    <w:p>
-      <w:r/>
-      <w:r>
-        <w:rPr>
-          <w:b/>
-        </w:rPr>
-        <w:t>版本与边界。</w:t>
-      </w:r>
-      <w:r>
-        <w:t xml:space="preserve"> 主功能截图基线为 b9565b482d8cf4f085235c9aba2d18e8303554ee，问答界面使用 UI001 提交 a401cf5。PR6 已验收合并，截图及首版核验记录仍保留当时身份；本轮更新文档状态并记录新输出哈希。旧的 18501 或 19501 实例尚未部署更新，本文也未重新执行总体检索准确率或回答质量评测。</w:t>
-      </w:r>
-    </w:p>
-    <w:p>
-      <w:r>
-        <w:t>维护参考：仓库根 README.md；docs/deployment/siliconflow.md；docs/workflow/catalog-ingestion.md；docs/workflow/test-task-isolation.md。PDF 文献、数据库、索引和认证配置不随文档 PR 分发。</w:t>
+        <w:t>这条流程适合录制约 6 至 8 分钟的操作视频。讲解时可结合题名、作者和年份的核对，说明文献信息质量如何影响查找和阅读体验。</w:t>
       </w:r>
     </w:p>
     <w:sectPr>
@@ -3701,7 +3067,7 @@
       <w:rPr>
         <w:sz w:val="16"/>
       </w:rPr>
-      <w:t xml:space="preserve">版本 1.1  ·  </w:t>
+      <w:t xml:space="preserve">版本 1.2  ·  </w:t>
     </w:r>
     <w:fldSimple w:instr="PAGE"/>
   </w:p>

</xml_diff>

<commit_message>
docs: update illustrated Chinese guide and add English edition
</commit_message>
<xml_diff>
--- a/docs/user-guide/专题数字图书馆使用手册.docx
+++ b/docs/user-guide/专题数字图书馆使用手册.docx
@@ -17,7 +17,7 @@
     </w:p>
     <w:p>
       <w:r>
-        <w:t>文档版本为 1.2，更新日期为 2026 年 10 月 19 日。</w:t>
+        <w:t>文档版本为 1.3，更新日期为 2026 年 10 月 19 日。</w:t>
       </w:r>
     </w:p>
     <w:p>
@@ -43,7 +43,7 @@
       <w:r>
         <w:drawing>
           <wp:inline xmlns:a="http://schemas.openxmlformats.org/drawingml/2006/main" xmlns:pic="http://schemas.openxmlformats.org/drawingml/2006/picture">
-            <wp:extent cx="6400800" cy="3600450"/>
+            <wp:extent cx="5348223" cy="3008375"/>
             <wp:docPr id="1" name="Picture 1" descr="图1 图书馆首页"/>
             <wp:cNvGraphicFramePr>
               <a:graphicFrameLocks noChangeAspect="1"/>
@@ -52,7 +52,7 @@
               <a:graphicData uri="http://schemas.openxmlformats.org/drawingml/2006/picture">
                 <pic:pic>
                   <pic:nvPicPr>
-                    <pic:cNvPr id="0" name="01-home.jpg"/>
+                    <pic:cNvPr id="0" name="01-home-zh.jpg"/>
                     <pic:cNvPicPr/>
                   </pic:nvPicPr>
                   <pic:blipFill>
@@ -64,7 +64,7 @@
                   <pic:spPr>
                     <a:xfrm>
                       <a:off x="0" y="0"/>
-                      <a:ext cx="6400800" cy="3600450"/>
+                      <a:ext cx="5348223" cy="3008375"/>
                     </a:xfrm>
                     <a:prstGeom prst="rect"/>
                   </pic:spPr>
@@ -109,7 +109,113 @@
         <w:pageBreakBefore/>
       </w:pPr>
       <w:r>
-        <w:t>2 浏览馆藏</w:t>
+        <w:t>2 切换界面语言</w:t>
+      </w:r>
+    </w:p>
+    <w:p>
+      <w:r>
+        <w:t>左侧顶部的“界面语言 / Interface language”可以选择“简体中文”或“English”。选择后，菜单、按钮、学科名称和操作提示会立即切换。</w:t>
+      </w:r>
+    </w:p>
+    <w:p>
+      <w:pPr>
+        <w:keepNext/>
+        <w:spacing w:after="60"/>
+        <w:jc w:val="center"/>
+      </w:pPr>
+      <w:r>
+        <w:drawing>
+          <wp:inline xmlns:a="http://schemas.openxmlformats.org/drawingml/2006/main" xmlns:pic="http://schemas.openxmlformats.org/drawingml/2006/picture">
+            <wp:extent cx="5348223" cy="3008375"/>
+            <wp:docPr id="2" name="Picture 2" descr="图2 切换到英文界面"/>
+            <wp:cNvGraphicFramePr>
+              <a:graphicFrameLocks noChangeAspect="1"/>
+            </wp:cNvGraphicFramePr>
+            <a:graphic>
+              <a:graphicData uri="http://schemas.openxmlformats.org/drawingml/2006/picture">
+                <pic:pic>
+                  <pic:nvPicPr>
+                    <pic:cNvPr id="0" name="02-home-en.jpg"/>
+                    <pic:cNvPicPr/>
+                  </pic:nvPicPr>
+                  <pic:blipFill>
+                    <a:blip r:embed="rId12"/>
+                    <a:stretch>
+                      <a:fillRect/>
+                    </a:stretch>
+                  </pic:blipFill>
+                  <pic:spPr>
+                    <a:xfrm>
+                      <a:off x="0" y="0"/>
+                      <a:ext cx="5348223" cy="3008375"/>
+                    </a:xfrm>
+                    <a:prstGeom prst="rect"/>
+                  </pic:spPr>
+                </pic:pic>
+              </a:graphicData>
+            </a:graphic>
+          </wp:inline>
+        </w:drawing>
+      </w:r>
+    </w:p>
+    <w:p>
+      <w:pPr>
+        <w:pStyle w:val="Caption"/>
+        <w:jc w:val="center"/>
+      </w:pPr>
+      <w:r>
+        <w:t>图2 切换到英文界面</w:t>
+      </w:r>
+    </w:p>
+    <w:p>
+      <w:r>
+        <w:t>切换时会保留当前页面、筛选条件、搜索结果、回答和正在填写的上传信息。可以先用中文查找资料，再切到英文介绍操作；也可以在核对编目信息时随时切换，继续填写。</w:t>
+      </w:r>
+    </w:p>
+    <w:p>
+      <w:r>
+        <w:t>文献题名、作者、原文和已有回答保留原来的语言。上传表单中的“语言”表示文献本身的语言，与界面选择分别设置。</w:t>
+      </w:r>
+    </w:p>
+    <w:p>
+      <w:r>
+        <w:t xml:space="preserve">选择会保存在当前页面地址中，刷新后仍使用所选语言。分享英文入口时，在图书馆地址末尾加上 </w:t>
+      </w:r>
+      <w:r>
+        <w:rPr>
+          <w:rFonts w:ascii="Consolas" w:hAnsi="Consolas"/>
+        </w:rPr>
+        <w:t>?lang=en</w:t>
+      </w:r>
+      <w:r>
+        <w:t xml:space="preserve">，如 </w:t>
+      </w:r>
+      <w:r>
+        <w:rPr>
+          <w:rFonts w:ascii="Consolas" w:hAnsi="Consolas"/>
+        </w:rPr>
+        <w:t>http://127.0.0.1:18501/?lang=en</w:t>
+      </w:r>
+      <w:r>
+        <w:t xml:space="preserve">；中文版可使用 </w:t>
+      </w:r>
+      <w:r>
+        <w:rPr>
+          <w:rFonts w:ascii="Consolas" w:hAnsi="Consolas"/>
+        </w:rPr>
+        <w:t>?lang=zh</w:t>
+      </w:r>
+      <w:r>
+        <w:t>。新窗口打开未带语言参数的地址时，默认显示中文。</w:t>
+      </w:r>
+    </w:p>
+    <w:p>
+      <w:pPr>
+        <w:pStyle w:val="Heading1"/>
+        <w:pageBreakBefore/>
+      </w:pPr>
+      <w:r>
+        <w:t>3 浏览馆藏</w:t>
       </w:r>
     </w:p>
     <w:p>
@@ -126,8 +232,8 @@
       <w:r>
         <w:drawing>
           <wp:inline xmlns:a="http://schemas.openxmlformats.org/drawingml/2006/main" xmlns:pic="http://schemas.openxmlformats.org/drawingml/2006/picture">
-            <wp:extent cx="4937760" cy="2777490"/>
-            <wp:docPr id="2" name="Picture 2" descr="图2 按学科浏览文献"/>
+            <wp:extent cx="4641494" cy="2610840"/>
+            <wp:docPr id="3" name="Picture 3" descr="图3 按学科浏览文献"/>
             <wp:cNvGraphicFramePr>
               <a:graphicFrameLocks noChangeAspect="1"/>
             </wp:cNvGraphicFramePr>
@@ -139,7 +245,7 @@
                     <pic:cNvPicPr/>
                   </pic:nvPicPr>
                   <pic:blipFill>
-                    <a:blip r:embed="rId12"/>
+                    <a:blip r:embed="rId13"/>
                     <a:stretch>
                       <a:fillRect/>
                     </a:stretch>
@@ -147,7 +253,7 @@
                   <pic:spPr>
                     <a:xfrm>
                       <a:off x="0" y="0"/>
-                      <a:ext cx="4937760" cy="2777490"/>
+                      <a:ext cx="4641494" cy="2610840"/>
                     </a:xfrm>
                     <a:prstGeom prst="rect"/>
                   </pic:spPr>
@@ -164,7 +270,7 @@
         <w:jc w:val="center"/>
       </w:pPr>
       <w:r>
-        <w:t>图2 按学科浏览文献</w:t>
+        <w:t>图3 按学科浏览文献</w:t>
       </w:r>
     </w:p>
     <w:p>
@@ -186,8 +292,8 @@
       <w:r>
         <w:drawing>
           <wp:inline xmlns:a="http://schemas.openxmlformats.org/drawingml/2006/main" xmlns:pic="http://schemas.openxmlformats.org/drawingml/2006/picture">
-            <wp:extent cx="4937760" cy="2777490"/>
-            <wp:docPr id="3" name="Picture 3" descr="图3 按封面浏览文献"/>
+            <wp:extent cx="4641494" cy="2610840"/>
+            <wp:docPr id="4" name="Picture 4" descr="图4 按封面浏览文献"/>
             <wp:cNvGraphicFramePr>
               <a:graphicFrameLocks noChangeAspect="1"/>
             </wp:cNvGraphicFramePr>
@@ -199,7 +305,7 @@
                     <pic:cNvPicPr/>
                   </pic:nvPicPr>
                   <pic:blipFill>
-                    <a:blip r:embed="rId13"/>
+                    <a:blip r:embed="rId14"/>
                     <a:stretch>
                       <a:fillRect/>
                     </a:stretch>
@@ -207,7 +313,7 @@
                   <pic:spPr>
                     <a:xfrm>
                       <a:off x="0" y="0"/>
-                      <a:ext cx="4937760" cy="2777490"/>
+                      <a:ext cx="4641494" cy="2610840"/>
                     </a:xfrm>
                     <a:prstGeom prst="rect"/>
                   </pic:spPr>
@@ -224,7 +330,7 @@
         <w:jc w:val="center"/>
       </w:pPr>
       <w:r>
-        <w:t>图3 按封面浏览文献</w:t>
+        <w:t>图4 按封面浏览文献</w:t>
       </w:r>
     </w:p>
     <w:p>
@@ -233,7 +339,7 @@
         <w:pageBreakBefore/>
       </w:pPr>
       <w:r>
-        <w:t>3 搜索文献</w:t>
+        <w:t>4 搜索文献</w:t>
       </w:r>
     </w:p>
     <w:p>
@@ -250,8 +356,8 @@
       <w:r>
         <w:drawing>
           <wp:inline xmlns:a="http://schemas.openxmlformats.org/drawingml/2006/main" xmlns:pic="http://schemas.openxmlformats.org/drawingml/2006/picture">
-            <wp:extent cx="6400800" cy="3600450"/>
-            <wp:docPr id="4" name="Picture 4" descr="图4 填写搜索内容和筛选条件"/>
+            <wp:extent cx="6016752" cy="3384423"/>
+            <wp:docPr id="5" name="Picture 5" descr="图5 填写搜索内容和筛选条件"/>
             <wp:cNvGraphicFramePr>
               <a:graphicFrameLocks noChangeAspect="1"/>
             </wp:cNvGraphicFramePr>
@@ -263,7 +369,7 @@
                     <pic:cNvPicPr/>
                   </pic:nvPicPr>
                   <pic:blipFill>
-                    <a:blip r:embed="rId14"/>
+                    <a:blip r:embed="rId15"/>
                     <a:stretch>
                       <a:fillRect/>
                     </a:stretch>
@@ -271,7 +377,7 @@
                   <pic:spPr>
                     <a:xfrm>
                       <a:off x="0" y="0"/>
-                      <a:ext cx="6400800" cy="3600450"/>
+                      <a:ext cx="6016752" cy="3384423"/>
                     </a:xfrm>
                     <a:prstGeom prst="rect"/>
                   </pic:spPr>
@@ -288,7 +394,7 @@
         <w:jc w:val="center"/>
       </w:pPr>
       <w:r>
-        <w:t>图4 填写搜索内容和筛选条件</w:t>
+        <w:t>图5 填写搜索内容和筛选条件</w:t>
       </w:r>
     </w:p>
     <w:tbl>
@@ -717,7 +823,7 @@
         <w:pageBreakBefore/>
       </w:pPr>
       <w:r>
-        <w:t>4 阅读搜索结果</w:t>
+        <w:t>5 阅读搜索结果</w:t>
       </w:r>
     </w:p>
     <w:p>
@@ -734,8 +840,8 @@
       <w:r>
         <w:drawing>
           <wp:inline xmlns:a="http://schemas.openxmlformats.org/drawingml/2006/main" xmlns:pic="http://schemas.openxmlformats.org/drawingml/2006/picture">
-            <wp:extent cx="6400800" cy="3600450"/>
-            <wp:docPr id="5" name="Picture 5" descr="图5 文献卡片与命中片段"/>
+            <wp:extent cx="6016752" cy="3384423"/>
+            <wp:docPr id="6" name="Picture 6" descr="图6 文献卡片与命中片段"/>
             <wp:cNvGraphicFramePr>
               <a:graphicFrameLocks noChangeAspect="1"/>
             </wp:cNvGraphicFramePr>
@@ -747,7 +853,7 @@
                     <pic:cNvPicPr/>
                   </pic:nvPicPr>
                   <pic:blipFill>
-                    <a:blip r:embed="rId15"/>
+                    <a:blip r:embed="rId16"/>
                     <a:stretch>
                       <a:fillRect/>
                     </a:stretch>
@@ -755,7 +861,7 @@
                   <pic:spPr>
                     <a:xfrm>
                       <a:off x="0" y="0"/>
-                      <a:ext cx="6400800" cy="3600450"/>
+                      <a:ext cx="6016752" cy="3384423"/>
                     </a:xfrm>
                     <a:prstGeom prst="rect"/>
                   </pic:spPr>
@@ -772,7 +878,7 @@
         <w:jc w:val="center"/>
       </w:pPr>
       <w:r>
-        <w:t>图5 文献卡片与命中片段</w:t>
+        <w:t>图6 文献卡片与命中片段</w:t>
       </w:r>
     </w:p>
     <w:p>
@@ -823,7 +929,7 @@
         <w:pageBreakBefore/>
       </w:pPr>
       <w:r>
-        <w:t>5 上传 PDF</w:t>
+        <w:t>6 上传 PDF</w:t>
       </w:r>
     </w:p>
     <w:p>
@@ -840,8 +946,8 @@
       <w:r>
         <w:drawing>
           <wp:inline xmlns:a="http://schemas.openxmlformats.org/drawingml/2006/main" xmlns:pic="http://schemas.openxmlformats.org/drawingml/2006/picture">
-            <wp:extent cx="4937760" cy="2777490"/>
-            <wp:docPr id="6" name="Picture 6" descr="图6 选择文献并设置识别方式"/>
+            <wp:extent cx="4641494" cy="2610840"/>
+            <wp:docPr id="7" name="Picture 7" descr="图7 选择文献并设置识别方式"/>
             <wp:cNvGraphicFramePr>
               <a:graphicFrameLocks noChangeAspect="1"/>
             </wp:cNvGraphicFramePr>
@@ -853,7 +959,7 @@
                     <pic:cNvPicPr/>
                   </pic:nvPicPr>
                   <pic:blipFill>
-                    <a:blip r:embed="rId16"/>
+                    <a:blip r:embed="rId17"/>
                     <a:stretch>
                       <a:fillRect/>
                     </a:stretch>
@@ -861,7 +967,7 @@
                   <pic:spPr>
                     <a:xfrm>
                       <a:off x="0" y="0"/>
-                      <a:ext cx="4937760" cy="2777490"/>
+                      <a:ext cx="4641494" cy="2610840"/>
                     </a:xfrm>
                     <a:prstGeom prst="rect"/>
                   </pic:spPr>
@@ -878,7 +984,7 @@
         <w:jc w:val="center"/>
       </w:pPr>
       <w:r>
-        <w:t>图6 选择文献并设置识别方式</w:t>
+        <w:t>图7 选择文献并设置识别方式</w:t>
       </w:r>
     </w:p>
     <w:p>
@@ -895,8 +1001,8 @@
       <w:r>
         <w:drawing>
           <wp:inline xmlns:a="http://schemas.openxmlformats.org/drawingml/2006/main" xmlns:pic="http://schemas.openxmlformats.org/drawingml/2006/picture">
-            <wp:extent cx="4937760" cy="1893743"/>
-            <wp:docPr id="7" name="Picture 7" descr="图7 文献信息识别进度"/>
+            <wp:extent cx="4641494" cy="1780118"/>
+            <wp:docPr id="8" name="Picture 8" descr="图8 文献信息识别进度"/>
             <wp:cNvGraphicFramePr>
               <a:graphicFrameLocks noChangeAspect="1"/>
             </wp:cNvGraphicFramePr>
@@ -908,7 +1014,7 @@
                     <pic:cNvPicPr/>
                   </pic:nvPicPr>
                   <pic:blipFill>
-                    <a:blip r:embed="rId17"/>
+                    <a:blip r:embed="rId18"/>
                     <a:srcRect l="28000" r="6000" t="55000" b="0"/>
                     <a:stretch>
                       <a:fillRect/>
@@ -917,7 +1023,7 @@
                   <pic:spPr>
                     <a:xfrm>
                       <a:off x="0" y="0"/>
-                      <a:ext cx="4937760" cy="1893743"/>
+                      <a:ext cx="4641494" cy="1780118"/>
                     </a:xfrm>
                     <a:prstGeom prst="rect"/>
                   </pic:spPr>
@@ -934,7 +1040,7 @@
         <w:jc w:val="center"/>
       </w:pPr>
       <w:r>
-        <w:t>图7 文献信息识别进度 局部</w:t>
+        <w:t>图8 文献信息识别进度 局部</w:t>
       </w:r>
     </w:p>
     <w:p>
@@ -953,7 +1059,7 @@
         <w:pageBreakBefore/>
       </w:pPr>
       <w:r>
-        <w:t>6 核对识别结果</w:t>
+        <w:t>7 核对识别结果</w:t>
       </w:r>
     </w:p>
     <w:p>
@@ -970,8 +1076,8 @@
       <w:r>
         <w:drawing>
           <wp:inline xmlns:a="http://schemas.openxmlformats.org/drawingml/2006/main" xmlns:pic="http://schemas.openxmlformats.org/drawingml/2006/picture">
-            <wp:extent cx="6400800" cy="3600450"/>
-            <wp:docPr id="8" name="Picture 8" descr="图8 查看识别结果的来源"/>
+            <wp:extent cx="6016752" cy="3384423"/>
+            <wp:docPr id="9" name="Picture 9" descr="图9 查看识别结果的来源"/>
             <wp:cNvGraphicFramePr>
               <a:graphicFrameLocks noChangeAspect="1"/>
             </wp:cNvGraphicFramePr>
@@ -983,7 +1089,7 @@
                     <pic:cNvPicPr/>
                   </pic:nvPicPr>
                   <pic:blipFill>
-                    <a:blip r:embed="rId18"/>
+                    <a:blip r:embed="rId19"/>
                     <a:stretch>
                       <a:fillRect/>
                     </a:stretch>
@@ -991,7 +1097,7 @@
                   <pic:spPr>
                     <a:xfrm>
                       <a:off x="0" y="0"/>
-                      <a:ext cx="6400800" cy="3600450"/>
+                      <a:ext cx="6016752" cy="3384423"/>
                     </a:xfrm>
                     <a:prstGeom prst="rect"/>
                   </pic:spPr>
@@ -1008,7 +1114,7 @@
         <w:jc w:val="center"/>
       </w:pPr>
       <w:r>
-        <w:t>图8 查看识别结果的来源</w:t>
+        <w:t>图9 查看识别结果的来源</w:t>
       </w:r>
     </w:p>
     <w:p>
@@ -1032,12 +1138,12 @@
         <w:pageBreakBefore/>
       </w:pPr>
       <w:r>
-        <w:t>7 填写编目信息</w:t>
+        <w:t>8 填写编目信息</w:t>
       </w:r>
     </w:p>
     <w:p>
       <w:r>
-        <w:t>在表单中修正识别结果，选择所属学科，并补充主题、语言等信息。下面的表格可以作为填写时的参考。</w:t>
+        <w:t>在表单中修正识别结果，核对所属学科，并补充主题、语言等信息。系统会先按题名和主题判断学科；开启增强识别且关键词未匹配时，再由 LLM 辅助分类并预填。暂未确定时，从下拉框中选择即可。下面的表格可以作为填写时的参考。</w:t>
       </w:r>
     </w:p>
     <w:p>
@@ -1049,8 +1155,8 @@
       <w:r>
         <w:drawing>
           <wp:inline xmlns:a="http://schemas.openxmlformats.org/drawingml/2006/main" xmlns:pic="http://schemas.openxmlformats.org/drawingml/2006/picture">
-            <wp:extent cx="5669280" cy="3188970"/>
-            <wp:docPr id="9" name="Picture 9" descr="图9 文献编目表单"/>
+            <wp:extent cx="4641494" cy="2610840"/>
+            <wp:docPr id="10" name="Picture 10" descr="图10 文献编目表单"/>
             <wp:cNvGraphicFramePr>
               <a:graphicFrameLocks noChangeAspect="1"/>
             </wp:cNvGraphicFramePr>
@@ -1062,7 +1168,7 @@
                     <pic:cNvPicPr/>
                   </pic:nvPicPr>
                   <pic:blipFill>
-                    <a:blip r:embed="rId19"/>
+                    <a:blip r:embed="rId20"/>
                     <a:stretch>
                       <a:fillRect/>
                     </a:stretch>
@@ -1070,7 +1176,7 @@
                   <pic:spPr>
                     <a:xfrm>
                       <a:off x="0" y="0"/>
-                      <a:ext cx="5669280" cy="3188970"/>
+                      <a:ext cx="4641494" cy="2610840"/>
                     </a:xfrm>
                     <a:prstGeom prst="rect"/>
                   </pic:spPr>
@@ -1087,7 +1193,7 @@
         <w:jc w:val="center"/>
       </w:pPr>
       <w:r>
-        <w:t>图9 文献编目表单</w:t>
+        <w:t>图10 文献编目表单</w:t>
       </w:r>
     </w:p>
     <w:tbl>
@@ -1726,7 +1832,7 @@
         <w:pageBreakBefore/>
       </w:pPr>
       <w:r>
-        <w:t>8 查看入库状态</w:t>
+        <w:t>9 查看入库状态</w:t>
       </w:r>
     </w:p>
     <w:p>
@@ -1743,8 +1849,8 @@
       <w:r>
         <w:drawing>
           <wp:inline xmlns:a="http://schemas.openxmlformats.org/drawingml/2006/main" xmlns:pic="http://schemas.openxmlformats.org/drawingml/2006/picture">
-            <wp:extent cx="5669280" cy="2657475"/>
-            <wp:docPr id="10" name="Picture 10" descr="图10 文献状态与正文核对提示"/>
+            <wp:extent cx="5329123" cy="2498026"/>
+            <wp:docPr id="11" name="Picture 11" descr="图11 文献状态与正文核对提示"/>
             <wp:cNvGraphicFramePr>
               <a:graphicFrameLocks noChangeAspect="1"/>
             </wp:cNvGraphicFramePr>
@@ -1756,7 +1862,7 @@
                     <pic:cNvPicPr/>
                   </pic:nvPicPr>
                   <pic:blipFill>
-                    <a:blip r:embed="rId20"/>
+                    <a:blip r:embed="rId21"/>
                     <a:srcRect l="28000" r="6000" t="20000" b="25000"/>
                     <a:stretch>
                       <a:fillRect/>
@@ -1765,7 +1871,7 @@
                   <pic:spPr>
                     <a:xfrm>
                       <a:off x="0" y="0"/>
-                      <a:ext cx="5669280" cy="2657475"/>
+                      <a:ext cx="5329123" cy="2498026"/>
                     </a:xfrm>
                     <a:prstGeom prst="rect"/>
                   </pic:spPr>
@@ -1782,7 +1888,7 @@
         <w:jc w:val="center"/>
       </w:pPr>
       <w:r>
-        <w:t>图10 文献状态与正文核对提示 局部</w:t>
+        <w:t>图11 文献状态与正文核对提示 局部</w:t>
       </w:r>
     </w:p>
     <w:tbl>
@@ -2153,7 +2259,7 @@
         <w:pageBreakBefore/>
       </w:pPr>
       <w:r>
-        <w:t>9 向馆藏提问</w:t>
+        <w:t>10 向馆藏提问</w:t>
       </w:r>
     </w:p>
     <w:p>
@@ -2175,8 +2281,8 @@
       <w:r>
         <w:drawing>
           <wp:inline xmlns:a="http://schemas.openxmlformats.org/drawingml/2006/main" xmlns:pic="http://schemas.openxmlformats.org/drawingml/2006/picture">
-            <wp:extent cx="6400800" cy="3600450"/>
-            <wp:docPr id="11" name="Picture 11" descr="图11 查看回答与引用"/>
+            <wp:extent cx="6016752" cy="3384423"/>
+            <wp:docPr id="12" name="Picture 12" descr="图12 查看回答与引用"/>
             <wp:cNvGraphicFramePr>
               <a:graphicFrameLocks noChangeAspect="1"/>
             </wp:cNvGraphicFramePr>
@@ -2188,7 +2294,7 @@
                     <pic:cNvPicPr/>
                   </pic:nvPicPr>
                   <pic:blipFill>
-                    <a:blip r:embed="rId21"/>
+                    <a:blip r:embed="rId22"/>
                     <a:stretch>
                       <a:fillRect/>
                     </a:stretch>
@@ -2196,7 +2302,7 @@
                   <pic:spPr>
                     <a:xfrm>
                       <a:off x="0" y="0"/>
-                      <a:ext cx="6400800" cy="3600450"/>
+                      <a:ext cx="6016752" cy="3384423"/>
                     </a:xfrm>
                     <a:prstGeom prst="rect"/>
                   </pic:spPr>
@@ -2213,7 +2319,7 @@
         <w:jc w:val="center"/>
       </w:pPr>
       <w:r>
-        <w:t>图11 查看回答与引用</w:t>
+        <w:t>图12 查看回答与引用</w:t>
       </w:r>
     </w:p>
     <w:p>
@@ -2232,7 +2338,7 @@
         <w:pageBreakBefore/>
       </w:pPr>
       <w:r>
-        <w:t>10 查看引用和原文</w:t>
+        <w:t>11 查看引用和原文</w:t>
       </w:r>
     </w:p>
     <w:p>
@@ -2249,8 +2355,8 @@
       <w:r>
         <w:drawing>
           <wp:inline xmlns:a="http://schemas.openxmlformats.org/drawingml/2006/main" xmlns:pic="http://schemas.openxmlformats.org/drawingml/2006/picture">
-            <wp:extent cx="4937760" cy="2777490"/>
-            <wp:docPr id="12" name="Picture 12" descr="图12 展开引用内容"/>
+            <wp:extent cx="4641494" cy="2610840"/>
+            <wp:docPr id="13" name="Picture 13" descr="图13 展开引用内容"/>
             <wp:cNvGraphicFramePr>
               <a:graphicFrameLocks noChangeAspect="1"/>
             </wp:cNvGraphicFramePr>
@@ -2262,7 +2368,7 @@
                     <pic:cNvPicPr/>
                   </pic:nvPicPr>
                   <pic:blipFill>
-                    <a:blip r:embed="rId22"/>
+                    <a:blip r:embed="rId23"/>
                     <a:stretch>
                       <a:fillRect/>
                     </a:stretch>
@@ -2270,7 +2376,7 @@
                   <pic:spPr>
                     <a:xfrm>
                       <a:off x="0" y="0"/>
-                      <a:ext cx="4937760" cy="2777490"/>
+                      <a:ext cx="4641494" cy="2610840"/>
                     </a:xfrm>
                     <a:prstGeom prst="rect"/>
                   </pic:spPr>
@@ -2287,7 +2393,7 @@
         <w:jc w:val="center"/>
       </w:pPr>
       <w:r>
-        <w:t>图12 展开引用内容</w:t>
+        <w:t>图13 展开引用内容</w:t>
       </w:r>
     </w:p>
     <w:p>
@@ -2304,8 +2410,8 @@
       <w:r>
         <w:drawing>
           <wp:inline xmlns:a="http://schemas.openxmlformats.org/drawingml/2006/main" xmlns:pic="http://schemas.openxmlformats.org/drawingml/2006/picture">
-            <wp:extent cx="4937760" cy="2779198"/>
-            <wp:docPr id="13" name="Picture 13" descr="图13 阅读高亮句子和 PDF 原页"/>
+            <wp:extent cx="4641494" cy="2612446"/>
+            <wp:docPr id="14" name="Picture 14" descr="图14 阅读高亮句子和 PDF 原页"/>
             <wp:cNvGraphicFramePr>
               <a:graphicFrameLocks noChangeAspect="1"/>
             </wp:cNvGraphicFramePr>
@@ -2317,7 +2423,7 @@
                     <pic:cNvPicPr/>
                   </pic:nvPicPr>
                   <pic:blipFill>
-                    <a:blip r:embed="rId23"/>
+                    <a:blip r:embed="rId24"/>
                     <a:stretch>
                       <a:fillRect/>
                     </a:stretch>
@@ -2325,7 +2431,7 @@
                   <pic:spPr>
                     <a:xfrm>
                       <a:off x="0" y="0"/>
-                      <a:ext cx="4937760" cy="2779198"/>
+                      <a:ext cx="4641494" cy="2612446"/>
                     </a:xfrm>
                     <a:prstGeom prst="rect"/>
                   </pic:spPr>
@@ -2342,7 +2448,7 @@
         <w:jc w:val="center"/>
       </w:pPr>
       <w:r>
-        <w:t>图13 阅读高亮句子和 PDF 原页</w:t>
+        <w:t>图14 阅读高亮句子和 PDF 原页</w:t>
       </w:r>
     </w:p>
     <w:p>
@@ -2356,7 +2462,7 @@
         <w:pageBreakBefore/>
       </w:pPr>
       <w:r>
-        <w:t>11 常见问题和演示顺序</w:t>
+        <w:t>12 常见问题和演示顺序</w:t>
       </w:r>
     </w:p>
     <w:tbl>
@@ -3048,7 +3154,7 @@
       <w:headerReference w:type="default" r:id="rId9"/>
       <w:footerReference w:type="default" r:id="rId10"/>
       <w:pgSz w:w="12240" w:h="15840"/>
-      <w:pgMar w:top="922" w:right="1008" w:bottom="893" w:left="1008" w:header="360" w:footer="360" w:gutter="0"/>
+      <w:pgMar w:top="922" w:right="1008" w:bottom="1152" w:left="1008" w:header="360" w:footer="360" w:gutter="0"/>
       <w:cols w:space="720"/>
       <w:docGrid w:linePitch="360"/>
     </w:sectPr>
@@ -3063,12 +3169,6 @@
       <w:pStyle w:val="Footer"/>
       <w:jc w:val="right"/>
     </w:pPr>
-    <w:r>
-      <w:rPr>
-        <w:sz w:val="16"/>
-      </w:rPr>
-      <w:t xml:space="preserve">版本 1.2  ·  </w:t>
-    </w:r>
     <w:fldSimple w:instr="PAGE"/>
   </w:p>
 </w:ftr>
@@ -3080,12 +3180,7 @@
     <w:pPr>
       <w:pStyle w:val="Header"/>
     </w:pPr>
-    <w:r>
-      <w:rPr>
-        <w:sz w:val="16"/>
-      </w:rPr>
-      <w:t>专题数字图书馆  使用手册</w:t>
-    </w:r>
+    <w:r/>
   </w:p>
 </w:hdr>
 </file>
@@ -3523,7 +3618,7 @@
       <w:snapToGrid w:val="0"/>
     </w:pPr>
     <w:rPr>
-      <w:rFonts w:asciiTheme="majorHAnsi" w:eastAsiaTheme="majorEastAsia" w:hAnsiTheme="majorHAnsi" w:cstheme="majorBidi" w:ascii="Microsoft YaHei" w:hAnsi="Microsoft YaHei" w:eastAsia="Microsoft YaHei"/>
+      <w:rFonts w:ascii="Microsoft YaHei" w:hAnsi="Microsoft YaHei" w:eastAsia="Microsoft YaHei"/>
       <w:b/>
       <w:bCs/>
       <w:color w:val="000000"/>
@@ -3548,7 +3643,7 @@
       <w:snapToGrid w:val="0"/>
     </w:pPr>
     <w:rPr>
-      <w:rFonts w:asciiTheme="majorHAnsi" w:eastAsiaTheme="majorEastAsia" w:hAnsiTheme="majorHAnsi" w:cstheme="majorBidi" w:ascii="Microsoft YaHei" w:hAnsi="Microsoft YaHei" w:eastAsia="Microsoft YaHei"/>
+      <w:rFonts w:ascii="Microsoft YaHei" w:hAnsi="Microsoft YaHei" w:eastAsia="Microsoft YaHei"/>
       <w:b/>
       <w:bCs/>
       <w:color w:val="000000"/>
@@ -3811,7 +3906,7 @@
       <w:snapToGrid w:val="0"/>
     </w:pPr>
     <w:rPr>
-      <w:rFonts w:asciiTheme="majorHAnsi" w:eastAsiaTheme="majorEastAsia" w:hAnsiTheme="majorHAnsi" w:cstheme="majorBidi" w:ascii="Microsoft YaHei" w:hAnsi="Microsoft YaHei" w:eastAsia="Microsoft YaHei"/>
+      <w:rFonts w:ascii="Microsoft YaHei" w:hAnsi="Microsoft YaHei" w:eastAsia="Microsoft YaHei"/>
       <w:color w:val="000000"/>
       <w:spacing w:val="5"/>
       <w:kern w:val="28"/>
@@ -3849,7 +3944,7 @@
       <w:snapToGrid w:val="0"/>
     </w:pPr>
     <w:rPr>
-      <w:rFonts w:asciiTheme="majorHAnsi" w:eastAsiaTheme="majorEastAsia" w:hAnsiTheme="majorHAnsi" w:cstheme="majorBidi" w:ascii="Microsoft YaHei" w:hAnsi="Microsoft YaHei" w:eastAsia="Microsoft YaHei"/>
+      <w:rFonts w:ascii="Microsoft YaHei" w:hAnsi="Microsoft YaHei" w:eastAsia="Microsoft YaHei"/>
       <w:i/>
       <w:iCs/>
       <w:color w:val="000000"/>

</xml_diff>

<commit_message>
revert: withdraw UI-002 revision rejected for changing the original interface
</commit_message>
<xml_diff>
--- a/docs/user-guide/专题数字图书馆使用手册.docx
+++ b/docs/user-guide/专题数字图书馆使用手册.docx
@@ -17,7 +17,7 @@
     </w:p>
     <w:p>
       <w:r>
-        <w:t>文档版本为 1.3，更新日期为 2026 年 10 月 19 日。</w:t>
+        <w:t>文档版本为 1.2，更新日期为 2026 年 10 月 19 日。</w:t>
       </w:r>
     </w:p>
     <w:p>
@@ -43,7 +43,7 @@
       <w:r>
         <w:drawing>
           <wp:inline xmlns:a="http://schemas.openxmlformats.org/drawingml/2006/main" xmlns:pic="http://schemas.openxmlformats.org/drawingml/2006/picture">
-            <wp:extent cx="5348223" cy="3008375"/>
+            <wp:extent cx="6400800" cy="3600450"/>
             <wp:docPr id="1" name="Picture 1" descr="图1 图书馆首页"/>
             <wp:cNvGraphicFramePr>
               <a:graphicFrameLocks noChangeAspect="1"/>
@@ -52,7 +52,7 @@
               <a:graphicData uri="http://schemas.openxmlformats.org/drawingml/2006/picture">
                 <pic:pic>
                   <pic:nvPicPr>
-                    <pic:cNvPr id="0" name="01-home-zh.jpg"/>
+                    <pic:cNvPr id="0" name="01-home.jpg"/>
                     <pic:cNvPicPr/>
                   </pic:nvPicPr>
                   <pic:blipFill>
@@ -64,7 +64,7 @@
                   <pic:spPr>
                     <a:xfrm>
                       <a:off x="0" y="0"/>
-                      <a:ext cx="5348223" cy="3008375"/>
+                      <a:ext cx="6400800" cy="3600450"/>
                     </a:xfrm>
                     <a:prstGeom prst="rect"/>
                   </pic:spPr>
@@ -109,12 +109,12 @@
         <w:pageBreakBefore/>
       </w:pPr>
       <w:r>
-        <w:t>2 切换界面语言</w:t>
+        <w:t>2 浏览馆藏</w:t>
       </w:r>
     </w:p>
     <w:p>
       <w:r>
-        <w:t>左侧顶部的“界面语言 / Interface language”可以选择“简体中文”或“English”。选择后，菜单、按钮、学科名称和操作提示会立即切换。</w:t>
+        <w:t>选择“馆藏展示 → 馆藏文献分类”。页面顶部展示馆藏数量和学科分布；在“浏览所属学科”中选择自然科学、社会科学或哲学与人文科学，可以缩小浏览范围。</w:t>
       </w:r>
     </w:p>
     <w:p>
@@ -126,8 +126,8 @@
       <w:r>
         <w:drawing>
           <wp:inline xmlns:a="http://schemas.openxmlformats.org/drawingml/2006/main" xmlns:pic="http://schemas.openxmlformats.org/drawingml/2006/picture">
-            <wp:extent cx="5348223" cy="3008375"/>
-            <wp:docPr id="2" name="Picture 2" descr="图2 切换到英文界面"/>
+            <wp:extent cx="4937760" cy="2777490"/>
+            <wp:docPr id="2" name="Picture 2" descr="图2 按学科浏览文献"/>
             <wp:cNvGraphicFramePr>
               <a:graphicFrameLocks noChangeAspect="1"/>
             </wp:cNvGraphicFramePr>
@@ -135,7 +135,7 @@
               <a:graphicData uri="http://schemas.openxmlformats.org/drawingml/2006/picture">
                 <pic:pic>
                   <pic:nvPicPr>
-                    <pic:cNvPr id="0" name="02-home-en.jpg"/>
+                    <pic:cNvPr id="0" name="01b-classification.jpg"/>
                     <pic:cNvPicPr/>
                   </pic:nvPicPr>
                   <pic:blipFill>
@@ -147,7 +147,7 @@
                   <pic:spPr>
                     <a:xfrm>
                       <a:off x="0" y="0"/>
-                      <a:ext cx="5348223" cy="3008375"/>
+                      <a:ext cx="4937760" cy="2777490"/>
                     </a:xfrm>
                     <a:prstGeom prst="rect"/>
                   </pic:spPr>
@@ -164,113 +164,7 @@
         <w:jc w:val="center"/>
       </w:pPr>
       <w:r>
-        <w:t>图2 切换到英文界面</w:t>
-      </w:r>
-    </w:p>
-    <w:p>
-      <w:r>
-        <w:t>切换时会保留当前页面、筛选条件、搜索结果、回答和正在填写的上传信息。可以先用中文查找资料，再切到英文介绍操作；也可以在核对编目信息时随时切换，继续填写。</w:t>
-      </w:r>
-    </w:p>
-    <w:p>
-      <w:r>
-        <w:t>文献题名、作者、原文和已有回答保留原来的语言。上传表单中的“语言”表示文献本身的语言，与界面选择分别设置。</w:t>
-      </w:r>
-    </w:p>
-    <w:p>
-      <w:r>
-        <w:t xml:space="preserve">选择会保存在当前页面地址中，刷新后仍使用所选语言。分享英文入口时，在图书馆地址末尾加上 </w:t>
-      </w:r>
-      <w:r>
-        <w:rPr>
-          <w:rFonts w:ascii="Consolas" w:hAnsi="Consolas"/>
-        </w:rPr>
-        <w:t>?lang=en</w:t>
-      </w:r>
-      <w:r>
-        <w:t xml:space="preserve">，如 </w:t>
-      </w:r>
-      <w:r>
-        <w:rPr>
-          <w:rFonts w:ascii="Consolas" w:hAnsi="Consolas"/>
-        </w:rPr>
-        <w:t>http://127.0.0.1:18501/?lang=en</w:t>
-      </w:r>
-      <w:r>
-        <w:t xml:space="preserve">；中文版可使用 </w:t>
-      </w:r>
-      <w:r>
-        <w:rPr>
-          <w:rFonts w:ascii="Consolas" w:hAnsi="Consolas"/>
-        </w:rPr>
-        <w:t>?lang=zh</w:t>
-      </w:r>
-      <w:r>
-        <w:t>。新窗口打开未带语言参数的地址时，默认显示中文。</w:t>
-      </w:r>
-    </w:p>
-    <w:p>
-      <w:pPr>
-        <w:pStyle w:val="Heading1"/>
-        <w:pageBreakBefore/>
-      </w:pPr>
-      <w:r>
-        <w:t>3 浏览馆藏</w:t>
-      </w:r>
-    </w:p>
-    <w:p>
-      <w:r>
-        <w:t>选择“馆藏展示 → 馆藏文献分类”。页面顶部展示馆藏数量和学科分布；在“浏览所属学科”中选择自然科学、社会科学或哲学与人文科学，可以缩小浏览范围。</w:t>
-      </w:r>
-    </w:p>
-    <w:p>
-      <w:pPr>
-        <w:keepNext/>
-        <w:spacing w:after="60"/>
-        <w:jc w:val="center"/>
-      </w:pPr>
-      <w:r>
-        <w:drawing>
-          <wp:inline xmlns:a="http://schemas.openxmlformats.org/drawingml/2006/main" xmlns:pic="http://schemas.openxmlformats.org/drawingml/2006/picture">
-            <wp:extent cx="4641494" cy="2610840"/>
-            <wp:docPr id="3" name="Picture 3" descr="图3 按学科浏览文献"/>
-            <wp:cNvGraphicFramePr>
-              <a:graphicFrameLocks noChangeAspect="1"/>
-            </wp:cNvGraphicFramePr>
-            <a:graphic>
-              <a:graphicData uri="http://schemas.openxmlformats.org/drawingml/2006/picture">
-                <pic:pic>
-                  <pic:nvPicPr>
-                    <pic:cNvPr id="0" name="01b-classification.jpg"/>
-                    <pic:cNvPicPr/>
-                  </pic:nvPicPr>
-                  <pic:blipFill>
-                    <a:blip r:embed="rId13"/>
-                    <a:stretch>
-                      <a:fillRect/>
-                    </a:stretch>
-                  </pic:blipFill>
-                  <pic:spPr>
-                    <a:xfrm>
-                      <a:off x="0" y="0"/>
-                      <a:ext cx="4641494" cy="2610840"/>
-                    </a:xfrm>
-                    <a:prstGeom prst="rect"/>
-                  </pic:spPr>
-                </pic:pic>
-              </a:graphicData>
-            </a:graphic>
-          </wp:inline>
-        </w:drawing>
-      </w:r>
-    </w:p>
-    <w:p>
-      <w:pPr>
-        <w:pStyle w:val="Caption"/>
-        <w:jc w:val="center"/>
-      </w:pPr>
-      <w:r>
-        <w:t>图3 按学科浏览文献</w:t>
+        <w:t>图2 按学科浏览文献</w:t>
       </w:r>
     </w:p>
     <w:p>
@@ -292,8 +186,8 @@
       <w:r>
         <w:drawing>
           <wp:inline xmlns:a="http://schemas.openxmlformats.org/drawingml/2006/main" xmlns:pic="http://schemas.openxmlformats.org/drawingml/2006/picture">
-            <wp:extent cx="4641494" cy="2610840"/>
-            <wp:docPr id="4" name="Picture 4" descr="图4 按封面浏览文献"/>
+            <wp:extent cx="4937760" cy="2777490"/>
+            <wp:docPr id="3" name="Picture 3" descr="图3 按封面浏览文献"/>
             <wp:cNvGraphicFramePr>
               <a:graphicFrameLocks noChangeAspect="1"/>
             </wp:cNvGraphicFramePr>
@@ -305,7 +199,7 @@
                     <pic:cNvPicPr/>
                   </pic:nvPicPr>
                   <pic:blipFill>
-                    <a:blip r:embed="rId14"/>
+                    <a:blip r:embed="rId13"/>
                     <a:stretch>
                       <a:fillRect/>
                     </a:stretch>
@@ -313,7 +207,7 @@
                   <pic:spPr>
                     <a:xfrm>
                       <a:off x="0" y="0"/>
-                      <a:ext cx="4641494" cy="2610840"/>
+                      <a:ext cx="4937760" cy="2777490"/>
                     </a:xfrm>
                     <a:prstGeom prst="rect"/>
                   </pic:spPr>
@@ -330,7 +224,7 @@
         <w:jc w:val="center"/>
       </w:pPr>
       <w:r>
-        <w:t>图4 按封面浏览文献</w:t>
+        <w:t>图3 按封面浏览文献</w:t>
       </w:r>
     </w:p>
     <w:p>
@@ -339,7 +233,7 @@
         <w:pageBreakBefore/>
       </w:pPr>
       <w:r>
-        <w:t>4 搜索文献</w:t>
+        <w:t>3 搜索文献</w:t>
       </w:r>
     </w:p>
     <w:p>
@@ -356,8 +250,8 @@
       <w:r>
         <w:drawing>
           <wp:inline xmlns:a="http://schemas.openxmlformats.org/drawingml/2006/main" xmlns:pic="http://schemas.openxmlformats.org/drawingml/2006/picture">
-            <wp:extent cx="6016752" cy="3384423"/>
-            <wp:docPr id="5" name="Picture 5" descr="图5 填写搜索内容和筛选条件"/>
+            <wp:extent cx="6400800" cy="3600450"/>
+            <wp:docPr id="4" name="Picture 4" descr="图4 填写搜索内容和筛选条件"/>
             <wp:cNvGraphicFramePr>
               <a:graphicFrameLocks noChangeAspect="1"/>
             </wp:cNvGraphicFramePr>
@@ -369,7 +263,7 @@
                     <pic:cNvPicPr/>
                   </pic:nvPicPr>
                   <pic:blipFill>
-                    <a:blip r:embed="rId15"/>
+                    <a:blip r:embed="rId14"/>
                     <a:stretch>
                       <a:fillRect/>
                     </a:stretch>
@@ -377,7 +271,7 @@
                   <pic:spPr>
                     <a:xfrm>
                       <a:off x="0" y="0"/>
-                      <a:ext cx="6016752" cy="3384423"/>
+                      <a:ext cx="6400800" cy="3600450"/>
                     </a:xfrm>
                     <a:prstGeom prst="rect"/>
                   </pic:spPr>
@@ -394,7 +288,7 @@
         <w:jc w:val="center"/>
       </w:pPr>
       <w:r>
-        <w:t>图5 填写搜索内容和筛选条件</w:t>
+        <w:t>图4 填写搜索内容和筛选条件</w:t>
       </w:r>
     </w:p>
     <w:tbl>
@@ -823,7 +717,7 @@
         <w:pageBreakBefore/>
       </w:pPr>
       <w:r>
-        <w:t>5 阅读搜索结果</w:t>
+        <w:t>4 阅读搜索结果</w:t>
       </w:r>
     </w:p>
     <w:p>
@@ -840,8 +734,8 @@
       <w:r>
         <w:drawing>
           <wp:inline xmlns:a="http://schemas.openxmlformats.org/drawingml/2006/main" xmlns:pic="http://schemas.openxmlformats.org/drawingml/2006/picture">
-            <wp:extent cx="6016752" cy="3384423"/>
-            <wp:docPr id="6" name="Picture 6" descr="图6 文献卡片与命中片段"/>
+            <wp:extent cx="6400800" cy="3600450"/>
+            <wp:docPr id="5" name="Picture 5" descr="图5 文献卡片与命中片段"/>
             <wp:cNvGraphicFramePr>
               <a:graphicFrameLocks noChangeAspect="1"/>
             </wp:cNvGraphicFramePr>
@@ -853,7 +747,7 @@
                     <pic:cNvPicPr/>
                   </pic:nvPicPr>
                   <pic:blipFill>
-                    <a:blip r:embed="rId16"/>
+                    <a:blip r:embed="rId15"/>
                     <a:stretch>
                       <a:fillRect/>
                     </a:stretch>
@@ -861,7 +755,7 @@
                   <pic:spPr>
                     <a:xfrm>
                       <a:off x="0" y="0"/>
-                      <a:ext cx="6016752" cy="3384423"/>
+                      <a:ext cx="6400800" cy="3600450"/>
                     </a:xfrm>
                     <a:prstGeom prst="rect"/>
                   </pic:spPr>
@@ -878,7 +772,7 @@
         <w:jc w:val="center"/>
       </w:pPr>
       <w:r>
-        <w:t>图6 文献卡片与命中片段</w:t>
+        <w:t>图5 文献卡片与命中片段</w:t>
       </w:r>
     </w:p>
     <w:p>
@@ -929,7 +823,7 @@
         <w:pageBreakBefore/>
       </w:pPr>
       <w:r>
-        <w:t>6 上传 PDF</w:t>
+        <w:t>5 上传 PDF</w:t>
       </w:r>
     </w:p>
     <w:p>
@@ -946,8 +840,8 @@
       <w:r>
         <w:drawing>
           <wp:inline xmlns:a="http://schemas.openxmlformats.org/drawingml/2006/main" xmlns:pic="http://schemas.openxmlformats.org/drawingml/2006/picture">
-            <wp:extent cx="4641494" cy="2610840"/>
-            <wp:docPr id="7" name="Picture 7" descr="图7 选择文献并设置识别方式"/>
+            <wp:extent cx="4937760" cy="2777490"/>
+            <wp:docPr id="6" name="Picture 6" descr="图6 选择文献并设置识别方式"/>
             <wp:cNvGraphicFramePr>
               <a:graphicFrameLocks noChangeAspect="1"/>
             </wp:cNvGraphicFramePr>
@@ -959,7 +853,7 @@
                     <pic:cNvPicPr/>
                   </pic:nvPicPr>
                   <pic:blipFill>
-                    <a:blip r:embed="rId17"/>
+                    <a:blip r:embed="rId16"/>
                     <a:stretch>
                       <a:fillRect/>
                     </a:stretch>
@@ -967,7 +861,7 @@
                   <pic:spPr>
                     <a:xfrm>
                       <a:off x="0" y="0"/>
-                      <a:ext cx="4641494" cy="2610840"/>
+                      <a:ext cx="4937760" cy="2777490"/>
                     </a:xfrm>
                     <a:prstGeom prst="rect"/>
                   </pic:spPr>
@@ -984,7 +878,7 @@
         <w:jc w:val="center"/>
       </w:pPr>
       <w:r>
-        <w:t>图7 选择文献并设置识别方式</w:t>
+        <w:t>图6 选择文献并设置识别方式</w:t>
       </w:r>
     </w:p>
     <w:p>
@@ -1001,8 +895,8 @@
       <w:r>
         <w:drawing>
           <wp:inline xmlns:a="http://schemas.openxmlformats.org/drawingml/2006/main" xmlns:pic="http://schemas.openxmlformats.org/drawingml/2006/picture">
-            <wp:extent cx="4641494" cy="1780118"/>
-            <wp:docPr id="8" name="Picture 8" descr="图8 文献信息识别进度"/>
+            <wp:extent cx="4937760" cy="1893743"/>
+            <wp:docPr id="7" name="Picture 7" descr="图7 文献信息识别进度"/>
             <wp:cNvGraphicFramePr>
               <a:graphicFrameLocks noChangeAspect="1"/>
             </wp:cNvGraphicFramePr>
@@ -1014,7 +908,7 @@
                     <pic:cNvPicPr/>
                   </pic:nvPicPr>
                   <pic:blipFill>
-                    <a:blip r:embed="rId18"/>
+                    <a:blip r:embed="rId17"/>
                     <a:srcRect l="28000" r="6000" t="55000" b="0"/>
                     <a:stretch>
                       <a:fillRect/>
@@ -1023,7 +917,7 @@
                   <pic:spPr>
                     <a:xfrm>
                       <a:off x="0" y="0"/>
-                      <a:ext cx="4641494" cy="1780118"/>
+                      <a:ext cx="4937760" cy="1893743"/>
                     </a:xfrm>
                     <a:prstGeom prst="rect"/>
                   </pic:spPr>
@@ -1040,7 +934,7 @@
         <w:jc w:val="center"/>
       </w:pPr>
       <w:r>
-        <w:t>图8 文献信息识别进度 局部</w:t>
+        <w:t>图7 文献信息识别进度 局部</w:t>
       </w:r>
     </w:p>
     <w:p>
@@ -1059,7 +953,7 @@
         <w:pageBreakBefore/>
       </w:pPr>
       <w:r>
-        <w:t>7 核对识别结果</w:t>
+        <w:t>6 核对识别结果</w:t>
       </w:r>
     </w:p>
     <w:p>
@@ -1076,8 +970,8 @@
       <w:r>
         <w:drawing>
           <wp:inline xmlns:a="http://schemas.openxmlformats.org/drawingml/2006/main" xmlns:pic="http://schemas.openxmlformats.org/drawingml/2006/picture">
-            <wp:extent cx="6016752" cy="3384423"/>
-            <wp:docPr id="9" name="Picture 9" descr="图9 查看识别结果的来源"/>
+            <wp:extent cx="6400800" cy="3600450"/>
+            <wp:docPr id="8" name="Picture 8" descr="图8 查看识别结果的来源"/>
             <wp:cNvGraphicFramePr>
               <a:graphicFrameLocks noChangeAspect="1"/>
             </wp:cNvGraphicFramePr>
@@ -1089,7 +983,7 @@
                     <pic:cNvPicPr/>
                   </pic:nvPicPr>
                   <pic:blipFill>
-                    <a:blip r:embed="rId19"/>
+                    <a:blip r:embed="rId18"/>
                     <a:stretch>
                       <a:fillRect/>
                     </a:stretch>
@@ -1097,7 +991,7 @@
                   <pic:spPr>
                     <a:xfrm>
                       <a:off x="0" y="0"/>
-                      <a:ext cx="6016752" cy="3384423"/>
+                      <a:ext cx="6400800" cy="3600450"/>
                     </a:xfrm>
                     <a:prstGeom prst="rect"/>
                   </pic:spPr>
@@ -1114,7 +1008,7 @@
         <w:jc w:val="center"/>
       </w:pPr>
       <w:r>
-        <w:t>图9 查看识别结果的来源</w:t>
+        <w:t>图8 查看识别结果的来源</w:t>
       </w:r>
     </w:p>
     <w:p>
@@ -1138,12 +1032,12 @@
         <w:pageBreakBefore/>
       </w:pPr>
       <w:r>
-        <w:t>8 填写编目信息</w:t>
+        <w:t>7 填写编目信息</w:t>
       </w:r>
     </w:p>
     <w:p>
       <w:r>
-        <w:t>在表单中修正识别结果，核对所属学科，并补充主题、语言等信息。系统会先按题名和主题判断学科；开启增强识别且关键词未匹配时，再由 LLM 辅助分类并预填。暂未确定时，从下拉框中选择即可。下面的表格可以作为填写时的参考。</w:t>
+        <w:t>在表单中修正识别结果，选择所属学科，并补充主题、语言等信息。下面的表格可以作为填写时的参考。</w:t>
       </w:r>
     </w:p>
     <w:p>
@@ -1155,8 +1049,8 @@
       <w:r>
         <w:drawing>
           <wp:inline xmlns:a="http://schemas.openxmlformats.org/drawingml/2006/main" xmlns:pic="http://schemas.openxmlformats.org/drawingml/2006/picture">
-            <wp:extent cx="4641494" cy="2610840"/>
-            <wp:docPr id="10" name="Picture 10" descr="图10 文献编目表单"/>
+            <wp:extent cx="5669280" cy="3188970"/>
+            <wp:docPr id="9" name="Picture 9" descr="图9 文献编目表单"/>
             <wp:cNvGraphicFramePr>
               <a:graphicFrameLocks noChangeAspect="1"/>
             </wp:cNvGraphicFramePr>
@@ -1168,7 +1062,7 @@
                     <pic:cNvPicPr/>
                   </pic:nvPicPr>
                   <pic:blipFill>
-                    <a:blip r:embed="rId20"/>
+                    <a:blip r:embed="rId19"/>
                     <a:stretch>
                       <a:fillRect/>
                     </a:stretch>
@@ -1176,7 +1070,7 @@
                   <pic:spPr>
                     <a:xfrm>
                       <a:off x="0" y="0"/>
-                      <a:ext cx="4641494" cy="2610840"/>
+                      <a:ext cx="5669280" cy="3188970"/>
                     </a:xfrm>
                     <a:prstGeom prst="rect"/>
                   </pic:spPr>
@@ -1193,7 +1087,7 @@
         <w:jc w:val="center"/>
       </w:pPr>
       <w:r>
-        <w:t>图10 文献编目表单</w:t>
+        <w:t>图9 文献编目表单</w:t>
       </w:r>
     </w:p>
     <w:tbl>
@@ -1832,7 +1726,7 @@
         <w:pageBreakBefore/>
       </w:pPr>
       <w:r>
-        <w:t>9 查看入库状态</w:t>
+        <w:t>8 查看入库状态</w:t>
       </w:r>
     </w:p>
     <w:p>
@@ -1849,8 +1743,8 @@
       <w:r>
         <w:drawing>
           <wp:inline xmlns:a="http://schemas.openxmlformats.org/drawingml/2006/main" xmlns:pic="http://schemas.openxmlformats.org/drawingml/2006/picture">
-            <wp:extent cx="5329123" cy="2498026"/>
-            <wp:docPr id="11" name="Picture 11" descr="图11 文献状态与正文核对提示"/>
+            <wp:extent cx="5669280" cy="2657475"/>
+            <wp:docPr id="10" name="Picture 10" descr="图10 文献状态与正文核对提示"/>
             <wp:cNvGraphicFramePr>
               <a:graphicFrameLocks noChangeAspect="1"/>
             </wp:cNvGraphicFramePr>
@@ -1862,7 +1756,7 @@
                     <pic:cNvPicPr/>
                   </pic:nvPicPr>
                   <pic:blipFill>
-                    <a:blip r:embed="rId21"/>
+                    <a:blip r:embed="rId20"/>
                     <a:srcRect l="28000" r="6000" t="20000" b="25000"/>
                     <a:stretch>
                       <a:fillRect/>
@@ -1871,7 +1765,7 @@
                   <pic:spPr>
                     <a:xfrm>
                       <a:off x="0" y="0"/>
-                      <a:ext cx="5329123" cy="2498026"/>
+                      <a:ext cx="5669280" cy="2657475"/>
                     </a:xfrm>
                     <a:prstGeom prst="rect"/>
                   </pic:spPr>
@@ -1888,7 +1782,7 @@
         <w:jc w:val="center"/>
       </w:pPr>
       <w:r>
-        <w:t>图11 文献状态与正文核对提示 局部</w:t>
+        <w:t>图10 文献状态与正文核对提示 局部</w:t>
       </w:r>
     </w:p>
     <w:tbl>
@@ -2259,7 +2153,7 @@
         <w:pageBreakBefore/>
       </w:pPr>
       <w:r>
-        <w:t>10 向馆藏提问</w:t>
+        <w:t>9 向馆藏提问</w:t>
       </w:r>
     </w:p>
     <w:p>
@@ -2281,8 +2175,8 @@
       <w:r>
         <w:drawing>
           <wp:inline xmlns:a="http://schemas.openxmlformats.org/drawingml/2006/main" xmlns:pic="http://schemas.openxmlformats.org/drawingml/2006/picture">
-            <wp:extent cx="6016752" cy="3384423"/>
-            <wp:docPr id="12" name="Picture 12" descr="图12 查看回答与引用"/>
+            <wp:extent cx="6400800" cy="3600450"/>
+            <wp:docPr id="11" name="Picture 11" descr="图11 查看回答与引用"/>
             <wp:cNvGraphicFramePr>
               <a:graphicFrameLocks noChangeAspect="1"/>
             </wp:cNvGraphicFramePr>
@@ -2294,7 +2188,7 @@
                     <pic:cNvPicPr/>
                   </pic:nvPicPr>
                   <pic:blipFill>
-                    <a:blip r:embed="rId22"/>
+                    <a:blip r:embed="rId21"/>
                     <a:stretch>
                       <a:fillRect/>
                     </a:stretch>
@@ -2302,7 +2196,7 @@
                   <pic:spPr>
                     <a:xfrm>
                       <a:off x="0" y="0"/>
-                      <a:ext cx="6016752" cy="3384423"/>
+                      <a:ext cx="6400800" cy="3600450"/>
                     </a:xfrm>
                     <a:prstGeom prst="rect"/>
                   </pic:spPr>
@@ -2319,7 +2213,7 @@
         <w:jc w:val="center"/>
       </w:pPr>
       <w:r>
-        <w:t>图12 查看回答与引用</w:t>
+        <w:t>图11 查看回答与引用</w:t>
       </w:r>
     </w:p>
     <w:p>
@@ -2338,7 +2232,7 @@
         <w:pageBreakBefore/>
       </w:pPr>
       <w:r>
-        <w:t>11 查看引用和原文</w:t>
+        <w:t>10 查看引用和原文</w:t>
       </w:r>
     </w:p>
     <w:p>
@@ -2355,8 +2249,8 @@
       <w:r>
         <w:drawing>
           <wp:inline xmlns:a="http://schemas.openxmlformats.org/drawingml/2006/main" xmlns:pic="http://schemas.openxmlformats.org/drawingml/2006/picture">
-            <wp:extent cx="4641494" cy="2610840"/>
-            <wp:docPr id="13" name="Picture 13" descr="图13 展开引用内容"/>
+            <wp:extent cx="4937760" cy="2777490"/>
+            <wp:docPr id="12" name="Picture 12" descr="图12 展开引用内容"/>
             <wp:cNvGraphicFramePr>
               <a:graphicFrameLocks noChangeAspect="1"/>
             </wp:cNvGraphicFramePr>
@@ -2368,7 +2262,7 @@
                     <pic:cNvPicPr/>
                   </pic:nvPicPr>
                   <pic:blipFill>
-                    <a:blip r:embed="rId23"/>
+                    <a:blip r:embed="rId22"/>
                     <a:stretch>
                       <a:fillRect/>
                     </a:stretch>
@@ -2376,7 +2270,7 @@
                   <pic:spPr>
                     <a:xfrm>
                       <a:off x="0" y="0"/>
-                      <a:ext cx="4641494" cy="2610840"/>
+                      <a:ext cx="4937760" cy="2777490"/>
                     </a:xfrm>
                     <a:prstGeom prst="rect"/>
                   </pic:spPr>
@@ -2393,7 +2287,7 @@
         <w:jc w:val="center"/>
       </w:pPr>
       <w:r>
-        <w:t>图13 展开引用内容</w:t>
+        <w:t>图12 展开引用内容</w:t>
       </w:r>
     </w:p>
     <w:p>
@@ -2410,8 +2304,8 @@
       <w:r>
         <w:drawing>
           <wp:inline xmlns:a="http://schemas.openxmlformats.org/drawingml/2006/main" xmlns:pic="http://schemas.openxmlformats.org/drawingml/2006/picture">
-            <wp:extent cx="4641494" cy="2612446"/>
-            <wp:docPr id="14" name="Picture 14" descr="图14 阅读高亮句子和 PDF 原页"/>
+            <wp:extent cx="4937760" cy="2779198"/>
+            <wp:docPr id="13" name="Picture 13" descr="图13 阅读高亮句子和 PDF 原页"/>
             <wp:cNvGraphicFramePr>
               <a:graphicFrameLocks noChangeAspect="1"/>
             </wp:cNvGraphicFramePr>
@@ -2423,7 +2317,7 @@
                     <pic:cNvPicPr/>
                   </pic:nvPicPr>
                   <pic:blipFill>
-                    <a:blip r:embed="rId24"/>
+                    <a:blip r:embed="rId23"/>
                     <a:stretch>
                       <a:fillRect/>
                     </a:stretch>
@@ -2431,7 +2325,7 @@
                   <pic:spPr>
                     <a:xfrm>
                       <a:off x="0" y="0"/>
-                      <a:ext cx="4641494" cy="2612446"/>
+                      <a:ext cx="4937760" cy="2779198"/>
                     </a:xfrm>
                     <a:prstGeom prst="rect"/>
                   </pic:spPr>
@@ -2448,7 +2342,7 @@
         <w:jc w:val="center"/>
       </w:pPr>
       <w:r>
-        <w:t>图14 阅读高亮句子和 PDF 原页</w:t>
+        <w:t>图13 阅读高亮句子和 PDF 原页</w:t>
       </w:r>
     </w:p>
     <w:p>
@@ -2462,7 +2356,7 @@
         <w:pageBreakBefore/>
       </w:pPr>
       <w:r>
-        <w:t>12 常见问题和演示顺序</w:t>
+        <w:t>11 常见问题和演示顺序</w:t>
       </w:r>
     </w:p>
     <w:tbl>
@@ -3154,7 +3048,7 @@
       <w:headerReference w:type="default" r:id="rId9"/>
       <w:footerReference w:type="default" r:id="rId10"/>
       <w:pgSz w:w="12240" w:h="15840"/>
-      <w:pgMar w:top="922" w:right="1008" w:bottom="1152" w:left="1008" w:header="360" w:footer="360" w:gutter="0"/>
+      <w:pgMar w:top="922" w:right="1008" w:bottom="893" w:left="1008" w:header="360" w:footer="360" w:gutter="0"/>
       <w:cols w:space="720"/>
       <w:docGrid w:linePitch="360"/>
     </w:sectPr>
@@ -3169,6 +3063,12 @@
       <w:pStyle w:val="Footer"/>
       <w:jc w:val="right"/>
     </w:pPr>
+    <w:r>
+      <w:rPr>
+        <w:sz w:val="16"/>
+      </w:rPr>
+      <w:t xml:space="preserve">版本 1.2  ·  </w:t>
+    </w:r>
     <w:fldSimple w:instr="PAGE"/>
   </w:p>
 </w:ftr>
@@ -3180,7 +3080,12 @@
     <w:pPr>
       <w:pStyle w:val="Header"/>
     </w:pPr>
-    <w:r/>
+    <w:r>
+      <w:rPr>
+        <w:sz w:val="16"/>
+      </w:rPr>
+      <w:t>专题数字图书馆  使用手册</w:t>
+    </w:r>
   </w:p>
 </w:hdr>
 </file>
@@ -3618,7 +3523,7 @@
       <w:snapToGrid w:val="0"/>
     </w:pPr>
     <w:rPr>
-      <w:rFonts w:ascii="Microsoft YaHei" w:hAnsi="Microsoft YaHei" w:eastAsia="Microsoft YaHei"/>
+      <w:rFonts w:asciiTheme="majorHAnsi" w:eastAsiaTheme="majorEastAsia" w:hAnsiTheme="majorHAnsi" w:cstheme="majorBidi" w:ascii="Microsoft YaHei" w:hAnsi="Microsoft YaHei" w:eastAsia="Microsoft YaHei"/>
       <w:b/>
       <w:bCs/>
       <w:color w:val="000000"/>
@@ -3643,7 +3548,7 @@
       <w:snapToGrid w:val="0"/>
     </w:pPr>
     <w:rPr>
-      <w:rFonts w:ascii="Microsoft YaHei" w:hAnsi="Microsoft YaHei" w:eastAsia="Microsoft YaHei"/>
+      <w:rFonts w:asciiTheme="majorHAnsi" w:eastAsiaTheme="majorEastAsia" w:hAnsiTheme="majorHAnsi" w:cstheme="majorBidi" w:ascii="Microsoft YaHei" w:hAnsi="Microsoft YaHei" w:eastAsia="Microsoft YaHei"/>
       <w:b/>
       <w:bCs/>
       <w:color w:val="000000"/>
@@ -3906,7 +3811,7 @@
       <w:snapToGrid w:val="0"/>
     </w:pPr>
     <w:rPr>
-      <w:rFonts w:ascii="Microsoft YaHei" w:hAnsi="Microsoft YaHei" w:eastAsia="Microsoft YaHei"/>
+      <w:rFonts w:asciiTheme="majorHAnsi" w:eastAsiaTheme="majorEastAsia" w:hAnsiTheme="majorHAnsi" w:cstheme="majorBidi" w:ascii="Microsoft YaHei" w:hAnsi="Microsoft YaHei" w:eastAsia="Microsoft YaHei"/>
       <w:color w:val="000000"/>
       <w:spacing w:val="5"/>
       <w:kern w:val="28"/>
@@ -3944,7 +3849,7 @@
       <w:snapToGrid w:val="0"/>
     </w:pPr>
     <w:rPr>
-      <w:rFonts w:ascii="Microsoft YaHei" w:hAnsi="Microsoft YaHei" w:eastAsia="Microsoft YaHei"/>
+      <w:rFonts w:asciiTheme="majorHAnsi" w:eastAsiaTheme="majorEastAsia" w:hAnsiTheme="majorHAnsi" w:cstheme="majorBidi" w:ascii="Microsoft YaHei" w:hAnsi="Microsoft YaHei" w:eastAsia="Microsoft YaHei"/>
       <w:i/>
       <w:iCs/>
       <w:color w:val="000000"/>

</xml_diff>

<commit_message>
docs: record minimal bilingual revision and restore original manual layout
</commit_message>
<xml_diff>
--- a/docs/user-guide/专题数字图书馆使用手册.docx
+++ b/docs/user-guide/专题数字图书馆使用手册.docx
@@ -17,7 +17,7 @@
     </w:p>
     <w:p>
       <w:r>
-        <w:t>文档版本为 1.2，更新日期为 2026 年 10 月 19 日。</w:t>
+        <w:t>文档版本为 1.3，更新日期为 2026 年 10 月 20 日。</w:t>
       </w:r>
     </w:p>
     <w:p>
@@ -31,7 +31,7 @@
     </w:p>
     <w:p>
       <w:r>
-        <w:t>在浏览器打开管理员提供的图书馆地址。本机安装的默认入口是 http://127.0.0.1:18501/ 。进入首页后，从左侧选择要使用的功能。</w:t>
+        <w:t>在浏览器打开管理员提供的图书馆地址。本机安装的默认入口是 http://127.0.0.1:18501/ 。进入首页后，可在左侧“界面语言 / Interface language”中选择“简体中文”或“English”，再选择要使用的功能。语言切换只更换界面文字。</w:t>
       </w:r>
     </w:p>
     <w:p>
@@ -52,7 +52,7 @@
               <a:graphicData uri="http://schemas.openxmlformats.org/drawingml/2006/picture">
                 <pic:pic>
                   <pic:nvPicPr>
-                    <pic:cNvPr id="0" name="01-home.jpg"/>
+                    <pic:cNvPr id="0" name="home-zh.jpg"/>
                     <pic:cNvPicPr/>
                   </pic:nvPicPr>
                   <pic:blipFill>
@@ -3067,7 +3067,7 @@
       <w:rPr>
         <w:sz w:val="16"/>
       </w:rPr>
-      <w:t xml:space="preserve">版本 1.2  ·  </w:t>
+      <w:t xml:space="preserve">版本 1.3  ·  </w:t>
     </w:r>
     <w:fldSimple w:instr="PAGE"/>
   </w:p>

</xml_diff>

<commit_message>
docs: replace Japanese theme font fallback with explicit Chinese fonts
</commit_message>
<xml_diff>
--- a/docs/user-guide/专题数字图书馆使用手册.docx
+++ b/docs/user-guide/专题数字图书馆使用手册.docx
@@ -7,16 +7,25 @@
         <w:pStyle w:val="Title"/>
       </w:pPr>
       <w:r>
+        <w:rPr>
+          <w:rFonts w:ascii="Microsoft YaHei" w:hAnsi="Microsoft YaHei" w:cs="Microsoft YaHei" w:eastAsia="Microsoft YaHei"/>
+        </w:rPr>
         <w:t>专题数字图书馆使用手册</w:t>
       </w:r>
     </w:p>
     <w:p>
       <w:r>
+        <w:rPr>
+          <w:rFonts w:ascii="Microsoft YaHei" w:hAnsi="Microsoft YaHei" w:cs="Microsoft YaHei" w:eastAsia="Microsoft YaHei"/>
+        </w:rPr>
         <w:t>在图书馆中，你可以浏览 PDF 馆藏、搜索相关文献，也可以围绕馆藏内容提问，并通过回答中的引用阅读原文。本手册按实际使用顺序介绍这些操作。</w:t>
       </w:r>
     </w:p>
     <w:p>
       <w:r>
+        <w:rPr>
+          <w:rFonts w:ascii="Microsoft YaHei" w:hAnsi="Microsoft YaHei" w:cs="Microsoft YaHei" w:eastAsia="Microsoft YaHei"/>
+        </w:rPr>
         <w:t>文档版本为 1.3，更新日期为 2026 年 10 月 20 日。</w:t>
       </w:r>
     </w:p>
@@ -26,11 +35,17 @@
         <w:pageBreakBefore w:val="0"/>
       </w:pPr>
       <w:r>
+        <w:rPr>
+          <w:rFonts w:ascii="Microsoft YaHei" w:hAnsi="Microsoft YaHei" w:cs="Microsoft YaHei" w:eastAsia="Microsoft YaHei"/>
+        </w:rPr>
         <w:t>1 开始使用</w:t>
       </w:r>
     </w:p>
     <w:p>
       <w:r>
+        <w:rPr>
+          <w:rFonts w:ascii="Microsoft YaHei" w:hAnsi="Microsoft YaHei" w:cs="Microsoft YaHei" w:eastAsia="Microsoft YaHei"/>
+        </w:rPr>
         <w:t>在浏览器打开管理员提供的图书馆地址。本机安装的默认入口是 http://127.0.0.1:18501/ 。进入首页后，可在左侧“界面语言 / Interface language”中选择“简体中文”或“English”，再选择要使用的功能。语言切换只更换界面文字。</w:t>
       </w:r>
     </w:p>
@@ -41,6 +56,9 @@
         <w:jc w:val="center"/>
       </w:pPr>
       <w:r>
+        <w:rPr>
+          <w:rFonts w:ascii="Microsoft YaHei" w:hAnsi="Microsoft YaHei" w:cs="Microsoft YaHei" w:eastAsia="Microsoft YaHei"/>
+        </w:rPr>
         <w:drawing>
           <wp:inline xmlns:a="http://schemas.openxmlformats.org/drawingml/2006/main" xmlns:pic="http://schemas.openxmlformats.org/drawingml/2006/picture">
             <wp:extent cx="6400800" cy="3600450"/>
@@ -81,25 +99,37 @@
         <w:jc w:val="center"/>
       </w:pPr>
       <w:r>
+        <w:rPr>
+          <w:rFonts w:ascii="Microsoft YaHei" w:hAnsi="Microsoft YaHei" w:cs="Microsoft YaHei" w:eastAsia="Microsoft YaHei"/>
+        </w:rPr>
         <w:t>图1 图书馆首页</w:t>
       </w:r>
     </w:p>
     <w:p>
       <w:r>
+        <w:rPr>
+          <w:rFonts w:ascii="Microsoft YaHei" w:hAnsi="Microsoft YaHei" w:cs="Microsoft YaHei" w:eastAsia="Microsoft YaHei"/>
+        </w:rPr>
         <w:t>“馆藏展示”用于浏览文献，“搜索与问答”用于查找资料和提问，“上传与管理”用于添加文献、核对信息和查看入库状态。</w:t>
       </w:r>
     </w:p>
     <w:p>
       <w:r>
+        <w:rPr>
+          <w:rFonts w:ascii="Microsoft YaHei" w:hAnsi="Microsoft YaHei" w:cs="Microsoft YaHei" w:eastAsia="Microsoft YaHei"/>
+        </w:rPr>
         <w:t xml:space="preserve">如果你负责在本机启动系统，在项目文件夹中运行 </w:t>
       </w:r>
       <w:r>
         <w:rPr>
-          <w:rFonts w:ascii="Consolas" w:hAnsi="Consolas"/>
+          <w:rFonts w:ascii="Consolas" w:hAnsi="Consolas" w:cs="Consolas" w:eastAsia="Microsoft YaHei"/>
         </w:rPr>
         <w:t>./Start-Library.ps1 -Mode real</w:t>
       </w:r>
       <w:r>
+        <w:rPr>
+          <w:rFonts w:ascii="Microsoft YaHei" w:hAnsi="Microsoft YaHei" w:cs="Microsoft YaHei" w:eastAsia="Microsoft YaHei"/>
+        </w:rPr>
         <w:t>，再打开上面的地址。首次安装请按项目首页的安装说明完成配置。</w:t>
       </w:r>
     </w:p>
@@ -109,11 +139,17 @@
         <w:pageBreakBefore/>
       </w:pPr>
       <w:r>
+        <w:rPr>
+          <w:rFonts w:ascii="Microsoft YaHei" w:hAnsi="Microsoft YaHei" w:cs="Microsoft YaHei" w:eastAsia="Microsoft YaHei"/>
+        </w:rPr>
         <w:t>2 浏览馆藏</w:t>
       </w:r>
     </w:p>
     <w:p>
       <w:r>
+        <w:rPr>
+          <w:rFonts w:ascii="Microsoft YaHei" w:hAnsi="Microsoft YaHei" w:cs="Microsoft YaHei" w:eastAsia="Microsoft YaHei"/>
+        </w:rPr>
         <w:t>选择“馆藏展示 → 馆藏文献分类”。页面顶部展示馆藏数量和学科分布；在“浏览所属学科”中选择自然科学、社会科学或哲学与人文科学，可以缩小浏览范围。</w:t>
       </w:r>
     </w:p>
@@ -124,6 +160,9 @@
         <w:jc w:val="center"/>
       </w:pPr>
       <w:r>
+        <w:rPr>
+          <w:rFonts w:ascii="Microsoft YaHei" w:hAnsi="Microsoft YaHei" w:cs="Microsoft YaHei" w:eastAsia="Microsoft YaHei"/>
+        </w:rPr>
         <w:drawing>
           <wp:inline xmlns:a="http://schemas.openxmlformats.org/drawingml/2006/main" xmlns:pic="http://schemas.openxmlformats.org/drawingml/2006/picture">
             <wp:extent cx="4937760" cy="2777490"/>
@@ -164,16 +203,25 @@
         <w:jc w:val="center"/>
       </w:pPr>
       <w:r>
+        <w:rPr>
+          <w:rFonts w:ascii="Microsoft YaHei" w:hAnsi="Microsoft YaHei" w:cs="Microsoft YaHei" w:eastAsia="Microsoft YaHei"/>
+        </w:rPr>
         <w:t>图2 按学科浏览文献</w:t>
       </w:r>
     </w:p>
     <w:p>
       <w:r>
+        <w:rPr>
+          <w:rFonts w:ascii="Microsoft YaHei" w:hAnsi="Microsoft YaHei" w:cs="Microsoft YaHei" w:eastAsia="Microsoft YaHei"/>
+        </w:rPr>
         <w:t>文献卡片会列出题名、作者、年份、主题和来源。找到感兴趣的文献后，点击“阅读原文 ↗”打开 PDF。</w:t>
       </w:r>
     </w:p>
     <w:p>
       <w:r>
+        <w:rPr>
+          <w:rFonts w:ascii="Microsoft YaHei" w:hAnsi="Microsoft YaHei" w:cs="Microsoft YaHei" w:eastAsia="Microsoft YaHei"/>
+        </w:rPr>
         <w:t>喜欢按封面寻找资料时，可以切换到“热门电子文献资源”，点击封面或文献卡片进入原文。</w:t>
       </w:r>
     </w:p>
@@ -184,6 +232,9 @@
         <w:jc w:val="center"/>
       </w:pPr>
       <w:r>
+        <w:rPr>
+          <w:rFonts w:ascii="Microsoft YaHei" w:hAnsi="Microsoft YaHei" w:cs="Microsoft YaHei" w:eastAsia="Microsoft YaHei"/>
+        </w:rPr>
         <w:drawing>
           <wp:inline xmlns:a="http://schemas.openxmlformats.org/drawingml/2006/main" xmlns:pic="http://schemas.openxmlformats.org/drawingml/2006/picture">
             <wp:extent cx="4937760" cy="2777490"/>
@@ -224,6 +275,9 @@
         <w:jc w:val="center"/>
       </w:pPr>
       <w:r>
+        <w:rPr>
+          <w:rFonts w:ascii="Microsoft YaHei" w:hAnsi="Microsoft YaHei" w:cs="Microsoft YaHei" w:eastAsia="Microsoft YaHei"/>
+        </w:rPr>
         <w:t>图3 按封面浏览文献</w:t>
       </w:r>
     </w:p>
@@ -233,11 +287,17 @@
         <w:pageBreakBefore/>
       </w:pPr>
       <w:r>
+        <w:rPr>
+          <w:rFonts w:ascii="Microsoft YaHei" w:hAnsi="Microsoft YaHei" w:cs="Microsoft YaHei" w:eastAsia="Microsoft YaHei"/>
+        </w:rPr>
         <w:t>3 搜索文献</w:t>
       </w:r>
     </w:p>
     <w:p>
       <w:r>
+        <w:rPr>
+          <w:rFonts w:ascii="Microsoft YaHei" w:hAnsi="Microsoft YaHei" w:cs="Microsoft YaHei" w:eastAsia="Microsoft YaHei"/>
+        </w:rPr>
         <w:t>进入“搜索与问答”，在“想查找或了解什么？”中输入题名、关键词或想了解的内容，将“操作”选为“搜索”，然后点击“提交”。第一次搜索可以使用默认的“混合检索”。</w:t>
       </w:r>
     </w:p>
@@ -248,6 +308,9 @@
         <w:jc w:val="center"/>
       </w:pPr>
       <w:r>
+        <w:rPr>
+          <w:rFonts w:ascii="Microsoft YaHei" w:hAnsi="Microsoft YaHei" w:cs="Microsoft YaHei" w:eastAsia="Microsoft YaHei"/>
+        </w:rPr>
         <w:drawing>
           <wp:inline xmlns:a="http://schemas.openxmlformats.org/drawingml/2006/main" xmlns:pic="http://schemas.openxmlformats.org/drawingml/2006/picture">
             <wp:extent cx="6400800" cy="3600450"/>
@@ -288,6 +351,9 @@
         <w:jc w:val="center"/>
       </w:pPr>
       <w:r>
+        <w:rPr>
+          <w:rFonts w:ascii="Microsoft YaHei" w:hAnsi="Microsoft YaHei" w:cs="Microsoft YaHei" w:eastAsia="Microsoft YaHei"/>
+        </w:rPr>
         <w:t>图4 填写搜索内容和筛选条件</w:t>
       </w:r>
     </w:p>
@@ -331,6 +397,7 @@
             </w:pPr>
             <w:r>
               <w:rPr>
+                <w:rFonts w:ascii="Microsoft YaHei" w:hAnsi="Microsoft YaHei" w:cs="Microsoft YaHei" w:eastAsia="Microsoft YaHei"/>
                 <w:b/>
                 <w:sz w:val="20"/>
               </w:rPr>
@@ -362,6 +429,7 @@
             </w:pPr>
             <w:r>
               <w:rPr>
+                <w:rFonts w:ascii="Microsoft YaHei" w:hAnsi="Microsoft YaHei" w:cs="Microsoft YaHei" w:eastAsia="Microsoft YaHei"/>
                 <w:b/>
                 <w:sz w:val="20"/>
               </w:rPr>
@@ -393,6 +461,7 @@
             </w:pPr>
             <w:r>
               <w:rPr>
+                <w:rFonts w:ascii="Microsoft YaHei" w:hAnsi="Microsoft YaHei" w:cs="Microsoft YaHei" w:eastAsia="Microsoft YaHei"/>
                 <w:b/>
                 <w:sz w:val="20"/>
               </w:rPr>
@@ -429,6 +498,7 @@
             </w:pPr>
             <w:r>
               <w:rPr>
+                <w:rFonts w:ascii="Microsoft YaHei" w:hAnsi="Microsoft YaHei" w:cs="Microsoft YaHei" w:eastAsia="Microsoft YaHei"/>
                 <w:b w:val="0"/>
                 <w:sz w:val="20"/>
               </w:rPr>
@@ -460,6 +530,7 @@
             </w:pPr>
             <w:r>
               <w:rPr>
+                <w:rFonts w:ascii="Microsoft YaHei" w:hAnsi="Microsoft YaHei" w:cs="Microsoft YaHei" w:eastAsia="Microsoft YaHei"/>
                 <w:b w:val="0"/>
                 <w:sz w:val="20"/>
               </w:rPr>
@@ -491,6 +562,7 @@
             </w:pPr>
             <w:r>
               <w:rPr>
+                <w:rFonts w:ascii="Microsoft YaHei" w:hAnsi="Microsoft YaHei" w:cs="Microsoft YaHei" w:eastAsia="Microsoft YaHei"/>
                 <w:b w:val="0"/>
                 <w:sz w:val="20"/>
               </w:rPr>
@@ -527,6 +599,7 @@
             </w:pPr>
             <w:r>
               <w:rPr>
+                <w:rFonts w:ascii="Microsoft YaHei" w:hAnsi="Microsoft YaHei" w:cs="Microsoft YaHei" w:eastAsia="Microsoft YaHei"/>
                 <w:b w:val="0"/>
                 <w:sz w:val="20"/>
               </w:rPr>
@@ -558,6 +631,7 @@
             </w:pPr>
             <w:r>
               <w:rPr>
+                <w:rFonts w:ascii="Microsoft YaHei" w:hAnsi="Microsoft YaHei" w:cs="Microsoft YaHei" w:eastAsia="Microsoft YaHei"/>
                 <w:b w:val="0"/>
                 <w:sz w:val="20"/>
               </w:rPr>
@@ -589,6 +663,7 @@
             </w:pPr>
             <w:r>
               <w:rPr>
+                <w:rFonts w:ascii="Microsoft YaHei" w:hAnsi="Microsoft YaHei" w:cs="Microsoft YaHei" w:eastAsia="Microsoft YaHei"/>
                 <w:b w:val="0"/>
                 <w:sz w:val="20"/>
               </w:rPr>
@@ -625,6 +700,7 @@
             </w:pPr>
             <w:r>
               <w:rPr>
+                <w:rFonts w:ascii="Microsoft YaHei" w:hAnsi="Microsoft YaHei" w:cs="Microsoft YaHei" w:eastAsia="Microsoft YaHei"/>
                 <w:b w:val="0"/>
                 <w:sz w:val="20"/>
               </w:rPr>
@@ -656,6 +732,7 @@
             </w:pPr>
             <w:r>
               <w:rPr>
+                <w:rFonts w:ascii="Microsoft YaHei" w:hAnsi="Microsoft YaHei" w:cs="Microsoft YaHei" w:eastAsia="Microsoft YaHei"/>
                 <w:b w:val="0"/>
                 <w:sz w:val="20"/>
               </w:rPr>
@@ -687,6 +764,7 @@
             </w:pPr>
             <w:r>
               <w:rPr>
+                <w:rFonts w:ascii="Microsoft YaHei" w:hAnsi="Microsoft YaHei" w:cs="Microsoft YaHei" w:eastAsia="Microsoft YaHei"/>
                 <w:b w:val="0"/>
                 <w:sz w:val="20"/>
               </w:rPr>
@@ -703,11 +781,17 @@
     </w:p>
     <w:p>
       <w:r>
+        <w:rPr>
+          <w:rFonts w:ascii="Microsoft YaHei" w:hAnsi="Microsoft YaHei" w:cs="Microsoft YaHei" w:eastAsia="Microsoft YaHei"/>
+        </w:rPr>
         <w:t>需要缩小范围时，在左侧展开“筛选文献”，填写起止年份或主题。年份留空表示不限年份；多个主题用逗号分隔。填写后按 Enter，再提交搜索。</w:t>
       </w:r>
     </w:p>
     <w:p>
       <w:r>
+        <w:rPr>
+          <w:rFonts w:ascii="Microsoft YaHei" w:hAnsi="Microsoft YaHei" w:cs="Microsoft YaHei" w:eastAsia="Microsoft YaHei"/>
+        </w:rPr>
         <w:t>例如，寻找某篇文献的修订版时，可以用题名配合版本年份筛选。若结果太少，先放宽年份和主题，再尝试更简短的关键词。</w:t>
       </w:r>
     </w:p>
@@ -717,11 +801,17 @@
         <w:pageBreakBefore/>
       </w:pPr>
       <w:r>
+        <w:rPr>
+          <w:rFonts w:ascii="Microsoft YaHei" w:hAnsi="Microsoft YaHei" w:cs="Microsoft YaHei" w:eastAsia="Microsoft YaHei"/>
+        </w:rPr>
         <w:t>4 阅读搜索结果</w:t>
       </w:r>
     </w:p>
     <w:p>
       <w:r>
+        <w:rPr>
+          <w:rFonts w:ascii="Microsoft YaHei" w:hAnsi="Microsoft YaHei" w:cs="Microsoft YaHei" w:eastAsia="Microsoft YaHei"/>
+        </w:rPr>
         <w:t>结果顶部显示命中的文献数和片段数。同一篇文献的内容集中在一张卡片中，便于比较和阅读。</w:t>
       </w:r>
     </w:p>
@@ -732,6 +822,9 @@
         <w:jc w:val="center"/>
       </w:pPr>
       <w:r>
+        <w:rPr>
+          <w:rFonts w:ascii="Microsoft YaHei" w:hAnsi="Microsoft YaHei" w:cs="Microsoft YaHei" w:eastAsia="Microsoft YaHei"/>
+        </w:rPr>
         <w:drawing>
           <wp:inline xmlns:a="http://schemas.openxmlformats.org/drawingml/2006/main" xmlns:pic="http://schemas.openxmlformats.org/drawingml/2006/picture">
             <wp:extent cx="6400800" cy="3600450"/>
@@ -772,6 +865,9 @@
         <w:jc w:val="center"/>
       </w:pPr>
       <w:r>
+        <w:rPr>
+          <w:rFonts w:ascii="Microsoft YaHei" w:hAnsi="Microsoft YaHei" w:cs="Microsoft YaHei" w:eastAsia="Microsoft YaHei"/>
+        </w:rPr>
         <w:t>图5 文献卡片与命中片段</w:t>
       </w:r>
     </w:p>
@@ -780,6 +876,9 @@
         <w:ind w:left="259" w:hanging="259"/>
       </w:pPr>
       <w:r>
+        <w:rPr>
+          <w:rFonts w:ascii="Microsoft YaHei" w:hAnsi="Microsoft YaHei" w:cs="Microsoft YaHei" w:eastAsia="Microsoft YaHei"/>
+        </w:rPr>
         <w:t>1. 浏览题名、作者、年份和预览文字，选择感兴趣的文献。</w:t>
       </w:r>
     </w:p>
@@ -788,6 +887,9 @@
         <w:ind w:left="259" w:hanging="259"/>
       </w:pPr>
       <w:r>
+        <w:rPr>
+          <w:rFonts w:ascii="Microsoft YaHei" w:hAnsi="Microsoft YaHei" w:cs="Microsoft YaHei" w:eastAsia="Microsoft YaHei"/>
+        </w:rPr>
         <w:t>2. 展开“片段”，阅读与搜索内容相关的段落。</w:t>
       </w:r>
     </w:p>
@@ -796,6 +898,9 @@
         <w:ind w:left="259" w:hanging="259"/>
       </w:pPr>
       <w:r>
+        <w:rPr>
+          <w:rFonts w:ascii="Microsoft YaHei" w:hAnsi="Microsoft YaHei" w:cs="Microsoft YaHei" w:eastAsia="Microsoft YaHei"/>
+        </w:rPr>
         <w:t>3. 点击“打开该页”，继续阅读对应的 PDF 页面。</w:t>
       </w:r>
     </w:p>
@@ -804,16 +909,25 @@
         <w:ind w:left="259" w:hanging="259"/>
       </w:pPr>
       <w:r>
+        <w:rPr>
+          <w:rFonts w:ascii="Microsoft YaHei" w:hAnsi="Microsoft YaHei" w:cs="Microsoft YaHei" w:eastAsia="Microsoft YaHei"/>
+        </w:rPr>
         <w:t>4. 想换一个角度查找时，修改关键词或检索方式，再次提交。</w:t>
       </w:r>
     </w:p>
     <w:p>
       <w:r>
+        <w:rPr>
+          <w:rFonts w:ascii="Microsoft YaHei" w:hAnsi="Microsoft YaHei" w:cs="Microsoft YaHei" w:eastAsia="Microsoft YaHei"/>
+        </w:rPr>
         <w:t>页面中的页码从 PDF 文件的第一页开始计算。若浏览器打开文件后没有跳到指定页面，按卡片显示的页码手动翻页即可。</w:t>
       </w:r>
     </w:p>
     <w:p>
       <w:r>
+        <w:rPr>
+          <w:rFonts w:ascii="Microsoft YaHei" w:hAnsi="Microsoft YaHei" w:cs="Microsoft YaHei" w:eastAsia="Microsoft YaHei"/>
+        </w:rPr>
         <w:t>一篇文献可以命中多个段落，所以片段数通常多于文献数。</w:t>
       </w:r>
     </w:p>
@@ -823,11 +937,17 @@
         <w:pageBreakBefore/>
       </w:pPr>
       <w:r>
+        <w:rPr>
+          <w:rFonts w:ascii="Microsoft YaHei" w:hAnsi="Microsoft YaHei" w:cs="Microsoft YaHei" w:eastAsia="Microsoft YaHei"/>
+        </w:rPr>
         <w:t>5 上传 PDF</w:t>
       </w:r>
     </w:p>
     <w:p>
       <w:r>
+        <w:rPr>
+          <w:rFonts w:ascii="Microsoft YaHei" w:hAnsi="Microsoft YaHei" w:cs="Microsoft YaHei" w:eastAsia="Microsoft YaHei"/>
+        </w:rPr>
         <w:t>进入“上传与管理 → 上传文献”，点击“Upload”选择 PDF。系统一次处理一份文献，默认支持 25 MB 以内的文件。</w:t>
       </w:r>
     </w:p>
@@ -838,6 +958,9 @@
         <w:jc w:val="center"/>
       </w:pPr>
       <w:r>
+        <w:rPr>
+          <w:rFonts w:ascii="Microsoft YaHei" w:hAnsi="Microsoft YaHei" w:cs="Microsoft YaHei" w:eastAsia="Microsoft YaHei"/>
+        </w:rPr>
         <w:drawing>
           <wp:inline xmlns:a="http://schemas.openxmlformats.org/drawingml/2006/main" xmlns:pic="http://schemas.openxmlformats.org/drawingml/2006/picture">
             <wp:extent cx="4937760" cy="2777490"/>
@@ -878,11 +1001,17 @@
         <w:jc w:val="center"/>
       </w:pPr>
       <w:r>
+        <w:rPr>
+          <w:rFonts w:ascii="Microsoft YaHei" w:hAnsi="Microsoft YaHei" w:cs="Microsoft YaHei" w:eastAsia="Microsoft YaHei"/>
+        </w:rPr>
         <w:t>图6 选择文献并设置识别方式</w:t>
       </w:r>
     </w:p>
     <w:p>
       <w:r>
+        <w:rPr>
+          <w:rFonts w:ascii="Microsoft YaHei" w:hAnsi="Microsoft YaHei" w:cs="Microsoft YaHei" w:eastAsia="Microsoft YaHei"/>
+        </w:rPr>
         <w:t>保持“增强识别（推荐）”开启，系统会读取 PDF 前两页的图像和文字，填写题名、作者、年份等信息。上传后，页面会显示识别进度和已用时间。</w:t>
       </w:r>
     </w:p>
@@ -893,6 +1022,9 @@
         <w:jc w:val="center"/>
       </w:pPr>
       <w:r>
+        <w:rPr>
+          <w:rFonts w:ascii="Microsoft YaHei" w:hAnsi="Microsoft YaHei" w:cs="Microsoft YaHei" w:eastAsia="Microsoft YaHei"/>
+        </w:rPr>
         <w:drawing>
           <wp:inline xmlns:a="http://schemas.openxmlformats.org/drawingml/2006/main" xmlns:pic="http://schemas.openxmlformats.org/drawingml/2006/picture">
             <wp:extent cx="4937760" cy="1893743"/>
@@ -934,16 +1066,25 @@
         <w:jc w:val="center"/>
       </w:pPr>
       <w:r>
+        <w:rPr>
+          <w:rFonts w:ascii="Microsoft YaHei" w:hAnsi="Microsoft YaHei" w:cs="Microsoft YaHei" w:eastAsia="Microsoft YaHei"/>
+        </w:rPr>
         <w:t>图7 文献信息识别进度 局部</w:t>
       </w:r>
     </w:p>
     <w:p>
       <w:r>
+        <w:rPr>
+          <w:rFonts w:ascii="Microsoft YaHei" w:hAnsi="Microsoft YaHei" w:cs="Microsoft YaHei" w:eastAsia="Microsoft YaHei"/>
+        </w:rPr>
         <w:t>需要补充出版来源时，勾选“联网补全出版资料”。系统会用题名和前两位作者姓名查询 Crossref，补充可匹配的书目信息。更改识别选项后，点击“重新识别文献信息”更新结果。</w:t>
       </w:r>
     </w:p>
     <w:p>
       <w:r>
+        <w:rPr>
+          <w:rFonts w:ascii="Microsoft YaHei" w:hAnsi="Microsoft YaHei" w:cs="Microsoft YaHei" w:eastAsia="Microsoft YaHei"/>
+        </w:rPr>
         <w:t>识别完成后，向下查看表单，按下一节核对信息。如果识别未完成，也可以直接对照 PDF 填写。</w:t>
       </w:r>
     </w:p>
@@ -953,11 +1094,17 @@
         <w:pageBreakBefore/>
       </w:pPr>
       <w:r>
+        <w:rPr>
+          <w:rFonts w:ascii="Microsoft YaHei" w:hAnsi="Microsoft YaHei" w:cs="Microsoft YaHei" w:eastAsia="Microsoft YaHei"/>
+        </w:rPr>
         <w:t>6 核对识别结果</w:t>
       </w:r>
     </w:p>
     <w:p>
       <w:r>
+        <w:rPr>
+          <w:rFonts w:ascii="Microsoft YaHei" w:hAnsi="Microsoft YaHei" w:cs="Microsoft YaHei" w:eastAsia="Microsoft YaHei"/>
+        </w:rPr>
         <w:t>展开“识别结果与来源”，可以看到每个字段的识别结果、所在页码和参考文字。对照 PDF 首页检查题名与作者，再确认年份和来源。</w:t>
       </w:r>
     </w:p>
@@ -968,6 +1115,9 @@
         <w:jc w:val="center"/>
       </w:pPr>
       <w:r>
+        <w:rPr>
+          <w:rFonts w:ascii="Microsoft YaHei" w:hAnsi="Microsoft YaHei" w:cs="Microsoft YaHei" w:eastAsia="Microsoft YaHei"/>
+        </w:rPr>
         <w:drawing>
           <wp:inline xmlns:a="http://schemas.openxmlformats.org/drawingml/2006/main" xmlns:pic="http://schemas.openxmlformats.org/drawingml/2006/picture">
             <wp:extent cx="6400800" cy="3600450"/>
@@ -1008,21 +1158,33 @@
         <w:jc w:val="center"/>
       </w:pPr>
       <w:r>
+        <w:rPr>
+          <w:rFonts w:ascii="Microsoft YaHei" w:hAnsi="Microsoft YaHei" w:cs="Microsoft YaHei" w:eastAsia="Microsoft YaHei"/>
+        </w:rPr>
         <w:t>图8 查看识别结果的来源</w:t>
       </w:r>
     </w:p>
     <w:p>
       <w:r>
+        <w:rPr>
+          <w:rFonts w:ascii="Microsoft YaHei" w:hAnsi="Microsoft YaHei" w:cs="Microsoft YaHei" w:eastAsia="Microsoft YaHei"/>
+        </w:rPr>
         <w:t>题名应包含完整的主标题和副标题。作者按原文顺序填写，每行一位；名单较长时，滚动查看后面的姓名。</w:t>
       </w:r>
     </w:p>
     <w:p>
       <w:r>
+        <w:rPr>
+          <w:rFonts w:ascii="Microsoft YaHei" w:hAnsi="Microsoft YaHei" w:cs="Microsoft YaHei" w:eastAsia="Microsoft YaHei"/>
+        </w:rPr>
         <w:t>年份填写当前这份 PDF 对应的版本年份。预印本、公开稿和修订版都可以收录。例如，图中的文件带有“17 Feb 2023”版本日期，填写 2023 即可。暂时找不到年份时，可以留空，其他信息照常填写。</w:t>
       </w:r>
     </w:p>
     <w:p>
       <w:r>
+        <w:rPr>
+          <w:rFonts w:ascii="Microsoft YaHei" w:hAnsi="Microsoft YaHei" w:cs="Microsoft YaHei" w:eastAsia="Microsoft YaHei"/>
+        </w:rPr>
         <w:t>如果联网补全找到了不同年份的出版记录，可以先比较它与手中 PDF 的版本，再决定采用哪一项。</w:t>
       </w:r>
     </w:p>
@@ -1032,11 +1194,17 @@
         <w:pageBreakBefore/>
       </w:pPr>
       <w:r>
+        <w:rPr>
+          <w:rFonts w:ascii="Microsoft YaHei" w:hAnsi="Microsoft YaHei" w:cs="Microsoft YaHei" w:eastAsia="Microsoft YaHei"/>
+        </w:rPr>
         <w:t>7 填写编目信息</w:t>
       </w:r>
     </w:p>
     <w:p>
       <w:r>
+        <w:rPr>
+          <w:rFonts w:ascii="Microsoft YaHei" w:hAnsi="Microsoft YaHei" w:cs="Microsoft YaHei" w:eastAsia="Microsoft YaHei"/>
+        </w:rPr>
         <w:t>在表单中修正识别结果，选择所属学科，并补充主题、语言等信息。下面的表格可以作为填写时的参考。</w:t>
       </w:r>
     </w:p>
@@ -1047,6 +1215,9 @@
         <w:jc w:val="center"/>
       </w:pPr>
       <w:r>
+        <w:rPr>
+          <w:rFonts w:ascii="Microsoft YaHei" w:hAnsi="Microsoft YaHei" w:cs="Microsoft YaHei" w:eastAsia="Microsoft YaHei"/>
+        </w:rPr>
         <w:drawing>
           <wp:inline xmlns:a="http://schemas.openxmlformats.org/drawingml/2006/main" xmlns:pic="http://schemas.openxmlformats.org/drawingml/2006/picture">
             <wp:extent cx="5669280" cy="3188970"/>
@@ -1087,6 +1258,9 @@
         <w:jc w:val="center"/>
       </w:pPr>
       <w:r>
+        <w:rPr>
+          <w:rFonts w:ascii="Microsoft YaHei" w:hAnsi="Microsoft YaHei" w:cs="Microsoft YaHei" w:eastAsia="Microsoft YaHei"/>
+        </w:rPr>
         <w:t>图9 文献编目表单</w:t>
       </w:r>
     </w:p>
@@ -1129,6 +1303,7 @@
             </w:pPr>
             <w:r>
               <w:rPr>
+                <w:rFonts w:ascii="Microsoft YaHei" w:hAnsi="Microsoft YaHei" w:cs="Microsoft YaHei" w:eastAsia="Microsoft YaHei"/>
                 <w:b/>
                 <w:sz w:val="20"/>
               </w:rPr>
@@ -1160,6 +1335,7 @@
             </w:pPr>
             <w:r>
               <w:rPr>
+                <w:rFonts w:ascii="Microsoft YaHei" w:hAnsi="Microsoft YaHei" w:cs="Microsoft YaHei" w:eastAsia="Microsoft YaHei"/>
                 <w:b/>
                 <w:sz w:val="20"/>
               </w:rPr>
@@ -1196,6 +1372,7 @@
             </w:pPr>
             <w:r>
               <w:rPr>
+                <w:rFonts w:ascii="Microsoft YaHei" w:hAnsi="Microsoft YaHei" w:cs="Microsoft YaHei" w:eastAsia="Microsoft YaHei"/>
                 <w:b w:val="0"/>
                 <w:sz w:val="20"/>
               </w:rPr>
@@ -1227,6 +1404,7 @@
             </w:pPr>
             <w:r>
               <w:rPr>
+                <w:rFonts w:ascii="Microsoft YaHei" w:hAnsi="Microsoft YaHei" w:cs="Microsoft YaHei" w:eastAsia="Microsoft YaHei"/>
                 <w:b w:val="0"/>
                 <w:sz w:val="20"/>
               </w:rPr>
@@ -1263,6 +1441,7 @@
             </w:pPr>
             <w:r>
               <w:rPr>
+                <w:rFonts w:ascii="Microsoft YaHei" w:hAnsi="Microsoft YaHei" w:cs="Microsoft YaHei" w:eastAsia="Microsoft YaHei"/>
                 <w:b w:val="0"/>
                 <w:sz w:val="20"/>
               </w:rPr>
@@ -1294,6 +1473,7 @@
             </w:pPr>
             <w:r>
               <w:rPr>
+                <w:rFonts w:ascii="Microsoft YaHei" w:hAnsi="Microsoft YaHei" w:cs="Microsoft YaHei" w:eastAsia="Microsoft YaHei"/>
                 <w:b w:val="0"/>
                 <w:sz w:val="20"/>
               </w:rPr>
@@ -1330,6 +1510,7 @@
             </w:pPr>
             <w:r>
               <w:rPr>
+                <w:rFonts w:ascii="Microsoft YaHei" w:hAnsi="Microsoft YaHei" w:cs="Microsoft YaHei" w:eastAsia="Microsoft YaHei"/>
                 <w:b w:val="0"/>
                 <w:sz w:val="20"/>
               </w:rPr>
@@ -1361,6 +1542,7 @@
             </w:pPr>
             <w:r>
               <w:rPr>
+                <w:rFonts w:ascii="Microsoft YaHei" w:hAnsi="Microsoft YaHei" w:cs="Microsoft YaHei" w:eastAsia="Microsoft YaHei"/>
                 <w:b w:val="0"/>
                 <w:sz w:val="20"/>
               </w:rPr>
@@ -1397,6 +1579,7 @@
             </w:pPr>
             <w:r>
               <w:rPr>
+                <w:rFonts w:ascii="Microsoft YaHei" w:hAnsi="Microsoft YaHei" w:cs="Microsoft YaHei" w:eastAsia="Microsoft YaHei"/>
                 <w:b w:val="0"/>
                 <w:sz w:val="20"/>
               </w:rPr>
@@ -1428,6 +1611,7 @@
             </w:pPr>
             <w:r>
               <w:rPr>
+                <w:rFonts w:ascii="Microsoft YaHei" w:hAnsi="Microsoft YaHei" w:cs="Microsoft YaHei" w:eastAsia="Microsoft YaHei"/>
                 <w:b w:val="0"/>
                 <w:sz w:val="20"/>
               </w:rPr>
@@ -1464,6 +1648,7 @@
             </w:pPr>
             <w:r>
               <w:rPr>
+                <w:rFonts w:ascii="Microsoft YaHei" w:hAnsi="Microsoft YaHei" w:cs="Microsoft YaHei" w:eastAsia="Microsoft YaHei"/>
                 <w:b w:val="0"/>
                 <w:sz w:val="20"/>
               </w:rPr>
@@ -1495,6 +1680,7 @@
             </w:pPr>
             <w:r>
               <w:rPr>
+                <w:rFonts w:ascii="Microsoft YaHei" w:hAnsi="Microsoft YaHei" w:cs="Microsoft YaHei" w:eastAsia="Microsoft YaHei"/>
                 <w:b w:val="0"/>
                 <w:sz w:val="20"/>
               </w:rPr>
@@ -1531,6 +1717,7 @@
             </w:pPr>
             <w:r>
               <w:rPr>
+                <w:rFonts w:ascii="Microsoft YaHei" w:hAnsi="Microsoft YaHei" w:cs="Microsoft YaHei" w:eastAsia="Microsoft YaHei"/>
                 <w:b w:val="0"/>
                 <w:sz w:val="20"/>
               </w:rPr>
@@ -1562,6 +1749,7 @@
             </w:pPr>
             <w:r>
               <w:rPr>
+                <w:rFonts w:ascii="Microsoft YaHei" w:hAnsi="Microsoft YaHei" w:cs="Microsoft YaHei" w:eastAsia="Microsoft YaHei"/>
                 <w:b w:val="0"/>
                 <w:sz w:val="20"/>
               </w:rPr>
@@ -1598,6 +1786,7 @@
             </w:pPr>
             <w:r>
               <w:rPr>
+                <w:rFonts w:ascii="Microsoft YaHei" w:hAnsi="Microsoft YaHei" w:cs="Microsoft YaHei" w:eastAsia="Microsoft YaHei"/>
                 <w:b w:val="0"/>
                 <w:sz w:val="20"/>
               </w:rPr>
@@ -1629,6 +1818,7 @@
             </w:pPr>
             <w:r>
               <w:rPr>
+                <w:rFonts w:ascii="Microsoft YaHei" w:hAnsi="Microsoft YaHei" w:cs="Microsoft YaHei" w:eastAsia="Microsoft YaHei"/>
                 <w:b w:val="0"/>
                 <w:sz w:val="20"/>
               </w:rPr>
@@ -1665,6 +1855,7 @@
             </w:pPr>
             <w:r>
               <w:rPr>
+                <w:rFonts w:ascii="Microsoft YaHei" w:hAnsi="Microsoft YaHei" w:cs="Microsoft YaHei" w:eastAsia="Microsoft YaHei"/>
                 <w:b w:val="0"/>
                 <w:sz w:val="20"/>
               </w:rPr>
@@ -1696,6 +1887,7 @@
             </w:pPr>
             <w:r>
               <w:rPr>
+                <w:rFonts w:ascii="Microsoft YaHei" w:hAnsi="Microsoft YaHei" w:cs="Microsoft YaHei" w:eastAsia="Microsoft YaHei"/>
                 <w:b w:val="0"/>
                 <w:sz w:val="20"/>
               </w:rPr>
@@ -1712,11 +1904,17 @@
     </w:p>
     <w:p>
       <w:r>
+        <w:rPr>
+          <w:rFonts w:ascii="Microsoft YaHei" w:hAnsi="Microsoft YaHei" w:cs="Microsoft YaHei" w:eastAsia="Microsoft YaHei"/>
+        </w:rPr>
         <w:t>确认后点击“导入文献”。系统会解析正文并建立检索索引，完成后可在“文献管理”查看状态。</w:t>
       </w:r>
     </w:p>
     <w:p>
       <w:r>
+        <w:rPr>
+          <w:rFonts w:ascii="Microsoft YaHei" w:hAnsi="Microsoft YaHei" w:cs="Microsoft YaHei" w:eastAsia="Microsoft YaHei"/>
+        </w:rPr>
         <w:t>“重新识别文献信息”会重新填写识别字段。已经手工修改表单时，先保留需要的内容，再重新识别。</w:t>
       </w:r>
     </w:p>
@@ -1726,11 +1924,17 @@
         <w:pageBreakBefore/>
       </w:pPr>
       <w:r>
+        <w:rPr>
+          <w:rFonts w:ascii="Microsoft YaHei" w:hAnsi="Microsoft YaHei" w:cs="Microsoft YaHei" w:eastAsia="Microsoft YaHei"/>
+        </w:rPr>
         <w:t>8 查看入库状态</w:t>
       </w:r>
     </w:p>
     <w:p>
       <w:r>
+        <w:rPr>
+          <w:rFonts w:ascii="Microsoft YaHei" w:hAnsi="Microsoft YaHei" w:cs="Microsoft YaHei" w:eastAsia="Microsoft YaHei"/>
+        </w:rPr>
         <w:t>进入“上传与管理 → 文献管理”，找到刚添加的文献。状态为“可阅读”时，就可以在馆藏中浏览、搜索和提问。</w:t>
       </w:r>
     </w:p>
@@ -1741,6 +1945,9 @@
         <w:jc w:val="center"/>
       </w:pPr>
       <w:r>
+        <w:rPr>
+          <w:rFonts w:ascii="Microsoft YaHei" w:hAnsi="Microsoft YaHei" w:cs="Microsoft YaHei" w:eastAsia="Microsoft YaHei"/>
+        </w:rPr>
         <w:drawing>
           <wp:inline xmlns:a="http://schemas.openxmlformats.org/drawingml/2006/main" xmlns:pic="http://schemas.openxmlformats.org/drawingml/2006/picture">
             <wp:extent cx="5669280" cy="2657475"/>
@@ -1782,6 +1989,9 @@
         <w:jc w:val="center"/>
       </w:pPr>
       <w:r>
+        <w:rPr>
+          <w:rFonts w:ascii="Microsoft YaHei" w:hAnsi="Microsoft YaHei" w:cs="Microsoft YaHei" w:eastAsia="Microsoft YaHei"/>
+        </w:rPr>
         <w:t>图10 文献状态与正文核对提示 局部</w:t>
       </w:r>
     </w:p>
@@ -1824,6 +2034,7 @@
             </w:pPr>
             <w:r>
               <w:rPr>
+                <w:rFonts w:ascii="Microsoft YaHei" w:hAnsi="Microsoft YaHei" w:cs="Microsoft YaHei" w:eastAsia="Microsoft YaHei"/>
                 <w:b/>
                 <w:sz w:val="20"/>
               </w:rPr>
@@ -1855,6 +2066,7 @@
             </w:pPr>
             <w:r>
               <w:rPr>
+                <w:rFonts w:ascii="Microsoft YaHei" w:hAnsi="Microsoft YaHei" w:cs="Microsoft YaHei" w:eastAsia="Microsoft YaHei"/>
                 <w:b/>
                 <w:sz w:val="20"/>
               </w:rPr>
@@ -1891,6 +2103,7 @@
             </w:pPr>
             <w:r>
               <w:rPr>
+                <w:rFonts w:ascii="Microsoft YaHei" w:hAnsi="Microsoft YaHei" w:cs="Microsoft YaHei" w:eastAsia="Microsoft YaHei"/>
                 <w:b w:val="0"/>
                 <w:sz w:val="20"/>
               </w:rPr>
@@ -1922,6 +2135,7 @@
             </w:pPr>
             <w:r>
               <w:rPr>
+                <w:rFonts w:ascii="Microsoft YaHei" w:hAnsi="Microsoft YaHei" w:cs="Microsoft YaHei" w:eastAsia="Microsoft YaHei"/>
                 <w:b w:val="0"/>
                 <w:sz w:val="20"/>
               </w:rPr>
@@ -1958,6 +2172,7 @@
             </w:pPr>
             <w:r>
               <w:rPr>
+                <w:rFonts w:ascii="Microsoft YaHei" w:hAnsi="Microsoft YaHei" w:cs="Microsoft YaHei" w:eastAsia="Microsoft YaHei"/>
                 <w:b w:val="0"/>
                 <w:sz w:val="20"/>
               </w:rPr>
@@ -1989,6 +2204,7 @@
             </w:pPr>
             <w:r>
               <w:rPr>
+                <w:rFonts w:ascii="Microsoft YaHei" w:hAnsi="Microsoft YaHei" w:cs="Microsoft YaHei" w:eastAsia="Microsoft YaHei"/>
                 <w:b w:val="0"/>
                 <w:sz w:val="20"/>
               </w:rPr>
@@ -2025,6 +2241,7 @@
             </w:pPr>
             <w:r>
               <w:rPr>
+                <w:rFonts w:ascii="Microsoft YaHei" w:hAnsi="Microsoft YaHei" w:cs="Microsoft YaHei" w:eastAsia="Microsoft YaHei"/>
                 <w:b w:val="0"/>
                 <w:sz w:val="20"/>
               </w:rPr>
@@ -2056,6 +2273,7 @@
             </w:pPr>
             <w:r>
               <w:rPr>
+                <w:rFonts w:ascii="Microsoft YaHei" w:hAnsi="Microsoft YaHei" w:cs="Microsoft YaHei" w:eastAsia="Microsoft YaHei"/>
                 <w:b w:val="0"/>
                 <w:sz w:val="20"/>
               </w:rPr>
@@ -2092,6 +2310,7 @@
             </w:pPr>
             <w:r>
               <w:rPr>
+                <w:rFonts w:ascii="Microsoft YaHei" w:hAnsi="Microsoft YaHei" w:cs="Microsoft YaHei" w:eastAsia="Microsoft YaHei"/>
                 <w:b w:val="0"/>
                 <w:sz w:val="20"/>
               </w:rPr>
@@ -2123,6 +2342,7 @@
             </w:pPr>
             <w:r>
               <w:rPr>
+                <w:rFonts w:ascii="Microsoft YaHei" w:hAnsi="Microsoft YaHei" w:cs="Microsoft YaHei" w:eastAsia="Microsoft YaHei"/>
                 <w:b w:val="0"/>
                 <w:sz w:val="20"/>
               </w:rPr>
@@ -2139,11 +2359,17 @@
     </w:p>
     <w:p>
       <w:r>
+        <w:rPr>
+          <w:rFonts w:ascii="Microsoft YaHei" w:hAnsi="Microsoft YaHei" w:cs="Microsoft YaHei" w:eastAsia="Microsoft YaHei"/>
+        </w:rPr>
         <w:t>“待核对正文”通常表示部分页面缺少可提取文字，或提取出的文字存在乱码。图中提示了需要检查的具体页码。打开 PDF 查看这些页面，需要时使用 OCR 工具识别文字，或换用文字清晰的版本后重新上传。</w:t>
       </w:r>
     </w:p>
     <w:p>
       <w:r>
+        <w:rPr>
+          <w:rFonts w:ascii="Microsoft YaHei" w:hAnsi="Microsoft YaHei" w:cs="Microsoft YaHei" w:eastAsia="Microsoft YaHei"/>
+        </w:rPr>
         <w:t>重复上传同一份 PDF 时，系统会保留已有文献记录。如果需要修改已入库的编目信息，可联系维护者处理。</w:t>
       </w:r>
     </w:p>
@@ -2153,16 +2379,25 @@
         <w:pageBreakBefore/>
       </w:pPr>
       <w:r>
+        <w:rPr>
+          <w:rFonts w:ascii="Microsoft YaHei" w:hAnsi="Microsoft YaHei" w:cs="Microsoft YaHei" w:eastAsia="Microsoft YaHei"/>
+        </w:rPr>
         <w:t>9 向馆藏提问</w:t>
       </w:r>
     </w:p>
     <w:p>
       <w:r>
+        <w:rPr>
+          <w:rFonts w:ascii="Microsoft YaHei" w:hAnsi="Microsoft YaHei" w:cs="Microsoft YaHei" w:eastAsia="Microsoft YaHei"/>
+        </w:rPr>
         <w:t>进入“搜索与问答”，将“操作”改为“问答”，输入问题并点击“提交”。系统会从馆藏中寻找相关内容，组织回答，并为回答附上引用。</w:t>
       </w:r>
     </w:p>
     <w:p>
       <w:r>
+        <w:rPr>
+          <w:rFonts w:ascii="Microsoft YaHei" w:hAnsi="Microsoft YaHei" w:cs="Microsoft YaHei" w:eastAsia="Microsoft YaHei"/>
+        </w:rPr>
         <w:t>例如，馆藏已有 FQ-ViT 论文时，可以问：“FQ-ViT 中 Power-of-Two Factor 解决什么问题？请用两句话概括，并引用原文。”也可以把题名和问题换成你正在阅读的文献。</w:t>
       </w:r>
     </w:p>
@@ -2173,6 +2408,9 @@
         <w:jc w:val="center"/>
       </w:pPr>
       <w:r>
+        <w:rPr>
+          <w:rFonts w:ascii="Microsoft YaHei" w:hAnsi="Microsoft YaHei" w:cs="Microsoft YaHei" w:eastAsia="Microsoft YaHei"/>
+        </w:rPr>
         <w:drawing>
           <wp:inline xmlns:a="http://schemas.openxmlformats.org/drawingml/2006/main" xmlns:pic="http://schemas.openxmlformats.org/drawingml/2006/picture">
             <wp:extent cx="6400800" cy="3600450"/>
@@ -2213,16 +2451,25 @@
         <w:jc w:val="center"/>
       </w:pPr>
       <w:r>
+        <w:rPr>
+          <w:rFonts w:ascii="Microsoft YaHei" w:hAnsi="Microsoft YaHei" w:cs="Microsoft YaHei" w:eastAsia="Microsoft YaHei"/>
+        </w:rPr>
         <w:t>图11 查看回答与引用</w:t>
       </w:r>
     </w:p>
     <w:p>
       <w:r>
+        <w:rPr>
+          <w:rFonts w:ascii="Microsoft YaHei" w:hAnsi="Microsoft YaHei" w:cs="Microsoft YaHei" w:eastAsia="Microsoft YaHei"/>
+        </w:rPr>
         <w:t>右侧会依次显示理解问题、检索、选择证据和整理回答等进度。完成后，先阅读回答，再展开“系统理解”和“问题要点与回答范围”，查看系统如何理解这次提问。</w:t>
       </w:r>
     </w:p>
     <w:p>
       <w:r>
+        <w:rPr>
+          <w:rFonts w:ascii="Microsoft YaHei" w:hAnsi="Microsoft YaHei" w:cs="Microsoft YaHei" w:eastAsia="Microsoft YaHei"/>
+        </w:rPr>
         <w:t>每次提问单独处理。继续追问时，在问题中写明文献和讨论对象，会更容易得到相关回答。如果系统需要澄清，选择合适的选项后再次提交；如果馆藏内容不足，可以缩小问题范围，或补充相关文献后再问。</w:t>
       </w:r>
     </w:p>
@@ -2232,11 +2479,17 @@
         <w:pageBreakBefore/>
       </w:pPr>
       <w:r>
+        <w:rPr>
+          <w:rFonts w:ascii="Microsoft YaHei" w:hAnsi="Microsoft YaHei" w:cs="Microsoft YaHei" w:eastAsia="Microsoft YaHei"/>
+        </w:rPr>
         <w:t>10 查看引用和原文</w:t>
       </w:r>
     </w:p>
     <w:p>
       <w:r>
+        <w:rPr>
+          <w:rFonts w:ascii="Microsoft YaHei" w:hAnsi="Microsoft YaHei" w:cs="Microsoft YaHei" w:eastAsia="Microsoft YaHei"/>
+        </w:rPr>
         <w:t>点击回答中的引用角标，可以打开对应的原文页。也可以在“核对原文”中点击“[1] 查看原文”，先阅读证据卡片中的支持文字和文献信息。</w:t>
       </w:r>
     </w:p>
@@ -2247,6 +2500,9 @@
         <w:jc w:val="center"/>
       </w:pPr>
       <w:r>
+        <w:rPr>
+          <w:rFonts w:ascii="Microsoft YaHei" w:hAnsi="Microsoft YaHei" w:cs="Microsoft YaHei" w:eastAsia="Microsoft YaHei"/>
+        </w:rPr>
         <w:drawing>
           <wp:inline xmlns:a="http://schemas.openxmlformats.org/drawingml/2006/main" xmlns:pic="http://schemas.openxmlformats.org/drawingml/2006/picture">
             <wp:extent cx="4937760" cy="2777490"/>
@@ -2287,11 +2543,17 @@
         <w:jc w:val="center"/>
       </w:pPr>
       <w:r>
+        <w:rPr>
+          <w:rFonts w:ascii="Microsoft YaHei" w:hAnsi="Microsoft YaHei" w:cs="Microsoft YaHei" w:eastAsia="Microsoft YaHei"/>
+        </w:rPr>
         <w:t>图12 展开引用内容</w:t>
       </w:r>
     </w:p>
     <w:p>
       <w:r>
+        <w:rPr>
+          <w:rFonts w:ascii="Microsoft YaHei" w:hAnsi="Microsoft YaHei" w:cs="Microsoft YaHei" w:eastAsia="Microsoft YaHei"/>
+        </w:rPr>
         <w:t>在证据卡片中点击“查看高亮原文与 PDF 原页”，进入原文页面。黄色区域标出了回答引用的句子，下方提供对应的 PDF 页面预览。</w:t>
       </w:r>
     </w:p>
@@ -2302,6 +2564,9 @@
         <w:jc w:val="center"/>
       </w:pPr>
       <w:r>
+        <w:rPr>
+          <w:rFonts w:ascii="Microsoft YaHei" w:hAnsi="Microsoft YaHei" w:cs="Microsoft YaHei" w:eastAsia="Microsoft YaHei"/>
+        </w:rPr>
         <w:drawing>
           <wp:inline xmlns:a="http://schemas.openxmlformats.org/drawingml/2006/main" xmlns:pic="http://schemas.openxmlformats.org/drawingml/2006/picture">
             <wp:extent cx="4937760" cy="2779198"/>
@@ -2342,11 +2607,17 @@
         <w:jc w:val="center"/>
       </w:pPr>
       <w:r>
+        <w:rPr>
+          <w:rFonts w:ascii="Microsoft YaHei" w:hAnsi="Microsoft YaHei" w:cs="Microsoft YaHei" w:eastAsia="Microsoft YaHei"/>
+        </w:rPr>
         <w:t>图13 阅读高亮句子和 PDF 原页</w:t>
       </w:r>
     </w:p>
     <w:p>
       <w:r>
+        <w:rPr>
+          <w:rFonts w:ascii="Microsoft YaHei" w:hAnsi="Microsoft YaHei" w:cs="Microsoft YaHei" w:eastAsia="Microsoft YaHei"/>
+        </w:rPr>
         <w:t>阅读高亮句子及前后段落，可以判断回答是否符合原意。想继续阅读全文时，点击“打开 PDF 原文件”。</w:t>
       </w:r>
     </w:p>
@@ -2356,6 +2627,9 @@
         <w:pageBreakBefore/>
       </w:pPr>
       <w:r>
+        <w:rPr>
+          <w:rFonts w:ascii="Microsoft YaHei" w:hAnsi="Microsoft YaHei" w:cs="Microsoft YaHei" w:eastAsia="Microsoft YaHei"/>
+        </w:rPr>
         <w:t>11 常见问题和演示顺序</w:t>
       </w:r>
     </w:p>
@@ -2398,6 +2672,7 @@
             </w:pPr>
             <w:r>
               <w:rPr>
+                <w:rFonts w:ascii="Microsoft YaHei" w:hAnsi="Microsoft YaHei" w:cs="Microsoft YaHei" w:eastAsia="Microsoft YaHei"/>
                 <w:b/>
                 <w:sz w:val="20"/>
               </w:rPr>
@@ -2429,6 +2704,7 @@
             </w:pPr>
             <w:r>
               <w:rPr>
+                <w:rFonts w:ascii="Microsoft YaHei" w:hAnsi="Microsoft YaHei" w:cs="Microsoft YaHei" w:eastAsia="Microsoft YaHei"/>
                 <w:b/>
                 <w:sz w:val="20"/>
               </w:rPr>
@@ -2465,6 +2741,7 @@
             </w:pPr>
             <w:r>
               <w:rPr>
+                <w:rFonts w:ascii="Microsoft YaHei" w:hAnsi="Microsoft YaHei" w:cs="Microsoft YaHei" w:eastAsia="Microsoft YaHei"/>
                 <w:b w:val="0"/>
                 <w:sz w:val="20"/>
               </w:rPr>
@@ -2496,6 +2773,7 @@
             </w:pPr>
             <w:r>
               <w:rPr>
+                <w:rFonts w:ascii="Microsoft YaHei" w:hAnsi="Microsoft YaHei" w:cs="Microsoft YaHei" w:eastAsia="Microsoft YaHei"/>
                 <w:b w:val="0"/>
                 <w:sz w:val="20"/>
               </w:rPr>
@@ -2532,6 +2810,7 @@
             </w:pPr>
             <w:r>
               <w:rPr>
+                <w:rFonts w:ascii="Microsoft YaHei" w:hAnsi="Microsoft YaHei" w:cs="Microsoft YaHei" w:eastAsia="Microsoft YaHei"/>
                 <w:b w:val="0"/>
                 <w:sz w:val="20"/>
               </w:rPr>
@@ -2563,6 +2842,7 @@
             </w:pPr>
             <w:r>
               <w:rPr>
+                <w:rFonts w:ascii="Microsoft YaHei" w:hAnsi="Microsoft YaHei" w:cs="Microsoft YaHei" w:eastAsia="Microsoft YaHei"/>
                 <w:b w:val="0"/>
                 <w:sz w:val="20"/>
               </w:rPr>
@@ -2570,7 +2850,7 @@
             </w:r>
             <w:r>
               <w:rPr>
-                <w:rFonts w:ascii="Consolas" w:hAnsi="Consolas"/>
+                <w:rFonts w:ascii="Consolas" w:hAnsi="Consolas" w:cs="Consolas" w:eastAsia="Microsoft YaHei"/>
                 <w:b w:val="0"/>
                 <w:sz w:val="20"/>
               </w:rPr>
@@ -2578,6 +2858,7 @@
             </w:r>
             <w:r>
               <w:rPr>
+                <w:rFonts w:ascii="Microsoft YaHei" w:hAnsi="Microsoft YaHei" w:cs="Microsoft YaHei" w:eastAsia="Microsoft YaHei"/>
                 <w:b w:val="0"/>
                 <w:sz w:val="20"/>
               </w:rPr>
@@ -2614,6 +2895,7 @@
             </w:pPr>
             <w:r>
               <w:rPr>
+                <w:rFonts w:ascii="Microsoft YaHei" w:hAnsi="Microsoft YaHei" w:cs="Microsoft YaHei" w:eastAsia="Microsoft YaHei"/>
                 <w:b w:val="0"/>
                 <w:sz w:val="20"/>
               </w:rPr>
@@ -2645,6 +2927,7 @@
             </w:pPr>
             <w:r>
               <w:rPr>
+                <w:rFonts w:ascii="Microsoft YaHei" w:hAnsi="Microsoft YaHei" w:cs="Microsoft YaHei" w:eastAsia="Microsoft YaHei"/>
                 <w:b w:val="0"/>
                 <w:sz w:val="20"/>
               </w:rPr>
@@ -2681,6 +2964,7 @@
             </w:pPr>
             <w:r>
               <w:rPr>
+                <w:rFonts w:ascii="Microsoft YaHei" w:hAnsi="Microsoft YaHei" w:cs="Microsoft YaHei" w:eastAsia="Microsoft YaHei"/>
                 <w:b w:val="0"/>
                 <w:sz w:val="20"/>
               </w:rPr>
@@ -2712,6 +2996,7 @@
             </w:pPr>
             <w:r>
               <w:rPr>
+                <w:rFonts w:ascii="Microsoft YaHei" w:hAnsi="Microsoft YaHei" w:cs="Microsoft YaHei" w:eastAsia="Microsoft YaHei"/>
                 <w:b w:val="0"/>
                 <w:sz w:val="20"/>
               </w:rPr>
@@ -2748,6 +3033,7 @@
             </w:pPr>
             <w:r>
               <w:rPr>
+                <w:rFonts w:ascii="Microsoft YaHei" w:hAnsi="Microsoft YaHei" w:cs="Microsoft YaHei" w:eastAsia="Microsoft YaHei"/>
                 <w:b w:val="0"/>
                 <w:sz w:val="20"/>
               </w:rPr>
@@ -2779,6 +3065,7 @@
             </w:pPr>
             <w:r>
               <w:rPr>
+                <w:rFonts w:ascii="Microsoft YaHei" w:hAnsi="Microsoft YaHei" w:cs="Microsoft YaHei" w:eastAsia="Microsoft YaHei"/>
                 <w:b w:val="0"/>
                 <w:sz w:val="20"/>
               </w:rPr>
@@ -2815,6 +3102,7 @@
             </w:pPr>
             <w:r>
               <w:rPr>
+                <w:rFonts w:ascii="Microsoft YaHei" w:hAnsi="Microsoft YaHei" w:cs="Microsoft YaHei" w:eastAsia="Microsoft YaHei"/>
                 <w:b w:val="0"/>
                 <w:sz w:val="20"/>
               </w:rPr>
@@ -2846,6 +3134,7 @@
             </w:pPr>
             <w:r>
               <w:rPr>
+                <w:rFonts w:ascii="Microsoft YaHei" w:hAnsi="Microsoft YaHei" w:cs="Microsoft YaHei" w:eastAsia="Microsoft YaHei"/>
                 <w:b w:val="0"/>
                 <w:sz w:val="20"/>
               </w:rPr>
@@ -2882,6 +3171,7 @@
             </w:pPr>
             <w:r>
               <w:rPr>
+                <w:rFonts w:ascii="Microsoft YaHei" w:hAnsi="Microsoft YaHei" w:cs="Microsoft YaHei" w:eastAsia="Microsoft YaHei"/>
                 <w:b w:val="0"/>
                 <w:sz w:val="20"/>
               </w:rPr>
@@ -2913,6 +3203,7 @@
             </w:pPr>
             <w:r>
               <w:rPr>
+                <w:rFonts w:ascii="Microsoft YaHei" w:hAnsi="Microsoft YaHei" w:cs="Microsoft YaHei" w:eastAsia="Microsoft YaHei"/>
                 <w:b w:val="0"/>
                 <w:sz w:val="20"/>
               </w:rPr>
@@ -2949,6 +3240,7 @@
             </w:pPr>
             <w:r>
               <w:rPr>
+                <w:rFonts w:ascii="Microsoft YaHei" w:hAnsi="Microsoft YaHei" w:cs="Microsoft YaHei" w:eastAsia="Microsoft YaHei"/>
                 <w:b w:val="0"/>
                 <w:sz w:val="20"/>
               </w:rPr>
@@ -2980,6 +3272,7 @@
             </w:pPr>
             <w:r>
               <w:rPr>
+                <w:rFonts w:ascii="Microsoft YaHei" w:hAnsi="Microsoft YaHei" w:cs="Microsoft YaHei" w:eastAsia="Microsoft YaHei"/>
                 <w:b w:val="0"/>
                 <w:sz w:val="20"/>
               </w:rPr>
@@ -2996,6 +3289,9 @@
     </w:p>
     <w:p>
       <w:r>
+        <w:rPr>
+          <w:rFonts w:ascii="Microsoft YaHei" w:hAnsi="Microsoft YaHei" w:cs="Microsoft YaHei" w:eastAsia="Microsoft YaHei"/>
+        </w:rPr>
         <w:t>演示系统时，可以选一篇文献，把下面几个步骤连起来：</w:t>
       </w:r>
     </w:p>
@@ -3004,6 +3300,9 @@
         <w:ind w:left="259" w:hanging="259"/>
       </w:pPr>
       <w:r>
+        <w:rPr>
+          <w:rFonts w:ascii="Microsoft YaHei" w:hAnsi="Microsoft YaHei" w:cs="Microsoft YaHei" w:eastAsia="Microsoft YaHei"/>
+        </w:rPr>
         <w:t>1. 从馆藏首页浏览学科分类，打开一篇文献。</w:t>
       </w:r>
     </w:p>
@@ -3012,6 +3311,9 @@
         <w:ind w:left="259" w:hanging="259"/>
       </w:pPr>
       <w:r>
+        <w:rPr>
+          <w:rFonts w:ascii="Microsoft YaHei" w:hAnsi="Microsoft YaHei" w:cs="Microsoft YaHei" w:eastAsia="Microsoft YaHei"/>
+        </w:rPr>
         <w:t>2. 用题名搜索，再尝试语义或混合检索，并打开命中页。</w:t>
       </w:r>
     </w:p>
@@ -3020,6 +3322,9 @@
         <w:ind w:left="259" w:hanging="259"/>
       </w:pPr>
       <w:r>
+        <w:rPr>
+          <w:rFonts w:ascii="Microsoft YaHei" w:hAnsi="Microsoft YaHei" w:cs="Microsoft YaHei" w:eastAsia="Microsoft YaHei"/>
+        </w:rPr>
         <w:t>3. 上传一份 PDF，查看增强识别结果，修正信息后导入。</w:t>
       </w:r>
     </w:p>
@@ -3028,6 +3333,9 @@
         <w:ind w:left="259" w:hanging="259"/>
       </w:pPr>
       <w:r>
+        <w:rPr>
+          <w:rFonts w:ascii="Microsoft YaHei" w:hAnsi="Microsoft YaHei" w:cs="Microsoft YaHei" w:eastAsia="Microsoft YaHei"/>
+        </w:rPr>
         <w:t>4. 在文献管理确认“可阅读”，再搜索新加入的文献。</w:t>
       </w:r>
     </w:p>
@@ -3036,11 +3344,17 @@
         <w:ind w:left="259" w:hanging="259"/>
       </w:pPr>
       <w:r>
+        <w:rPr>
+          <w:rFonts w:ascii="Microsoft YaHei" w:hAnsi="Microsoft YaHei" w:cs="Microsoft YaHei" w:eastAsia="Microsoft YaHei"/>
+        </w:rPr>
         <w:t>5. 提出一个与该文献有关的问题，展开引用并阅读高亮原文。</w:t>
       </w:r>
     </w:p>
     <w:p>
       <w:r>
+        <w:rPr>
+          <w:rFonts w:ascii="Microsoft YaHei" w:hAnsi="Microsoft YaHei" w:cs="Microsoft YaHei" w:eastAsia="Microsoft YaHei"/>
+        </w:rPr>
         <w:t>这条流程适合录制约 6 至 8 分钟的操作视频。讲解时可结合题名、作者和年份的核对，说明文献信息质量如何影响查找和阅读体验。</w:t>
       </w:r>
     </w:p>
@@ -3065,6 +3379,7 @@
     </w:pPr>
     <w:r>
       <w:rPr>
+        <w:rFonts w:ascii="Microsoft YaHei" w:hAnsi="Microsoft YaHei" w:cs="Microsoft YaHei" w:eastAsia="Microsoft YaHei"/>
         <w:sz w:val="16"/>
       </w:rPr>
       <w:t xml:space="preserve">版本 1.3  ·  </w:t>
@@ -3082,6 +3397,7 @@
     </w:pPr>
     <w:r>
       <w:rPr>
+        <w:rFonts w:ascii="Microsoft YaHei" w:hAnsi="Microsoft YaHei" w:cs="Microsoft YaHei" w:eastAsia="Microsoft YaHei"/>
         <w:sz w:val="16"/>
       </w:rPr>
       <w:t>专题数字图书馆  使用手册</w:t>
@@ -3178,7 +3494,7 @@
         <w:ind w:left="1440" w:hanging="360"/>
       </w:pPr>
       <w:rPr>
-        <w:rFonts w:ascii="Symbol" w:hAnsi="Symbol" w:hint="default"/>
+        <w:rFonts w:ascii="Microsoft YaHei" w:hAnsi="Microsoft YaHei" w:hint="default" w:cs="Microsoft YaHei" w:eastAsia="Microsoft YaHei"/>
       </w:rPr>
     </w:lvl>
   </w:abstractNum>
@@ -3199,7 +3515,7 @@
         <w:ind w:left="1080" w:hanging="360"/>
       </w:pPr>
       <w:rPr>
-        <w:rFonts w:ascii="Symbol" w:hAnsi="Symbol" w:hint="default"/>
+        <w:rFonts w:ascii="Microsoft YaHei" w:hAnsi="Microsoft YaHei" w:hint="default" w:cs="Microsoft YaHei" w:eastAsia="Microsoft YaHei"/>
       </w:rPr>
     </w:lvl>
   </w:abstractNum>
@@ -3220,7 +3536,7 @@
         <w:ind w:left="720" w:hanging="360"/>
       </w:pPr>
       <w:rPr>
-        <w:rFonts w:ascii="Symbol" w:hAnsi="Symbol" w:hint="default"/>
+        <w:rFonts w:ascii="Microsoft YaHei" w:hAnsi="Microsoft YaHei" w:hint="default" w:cs="Microsoft YaHei" w:eastAsia="Microsoft YaHei"/>
       </w:rPr>
     </w:lvl>
   </w:abstractNum>
@@ -3259,7 +3575,7 @@
         <w:ind w:left="360" w:hanging="360"/>
       </w:pPr>
       <w:rPr>
-        <w:rFonts w:ascii="Symbol" w:hAnsi="Symbol" w:hint="default"/>
+        <w:rFonts w:ascii="Microsoft YaHei" w:hAnsi="Microsoft YaHei" w:hint="default" w:cs="Microsoft YaHei" w:eastAsia="Microsoft YaHei"/>
       </w:rPr>
     </w:lvl>
   </w:abstractNum>
@@ -3298,10 +3614,10 @@
   <w:docDefaults>
     <w:rPrDefault>
       <w:rPr>
-        <w:rFonts w:asciiTheme="minorHAnsi" w:eastAsiaTheme="minorEastAsia" w:hAnsiTheme="minorHAnsi" w:cstheme="minorBidi"/>
+        <w:rFonts w:ascii="Microsoft YaHei" w:hAnsi="Microsoft YaHei" w:cs="Microsoft YaHei" w:eastAsia="Microsoft YaHei"/>
         <w:sz w:val="22"/>
         <w:szCs w:val="22"/>
-        <w:lang w:val="en-US" w:eastAsia="en-US" w:bidi="ar-SA"/>
+        <w:lang w:val="en-US" w:eastAsia="zh-CN" w:bidi="ar-SA"/>
       </w:rPr>
     </w:rPrDefault>
     <w:pPrDefault>
@@ -3458,7 +3774,7 @@
       <w:spacing w:line="269" w:lineRule="auto" w:after="120"/>
     </w:pPr>
     <w:rPr>
-      <w:rFonts w:ascii="Microsoft YaHei" w:hAnsi="Microsoft YaHei" w:eastAsia="Microsoft YaHei"/>
+      <w:rFonts w:ascii="Microsoft YaHei" w:hAnsi="Microsoft YaHei" w:eastAsia="Microsoft YaHei" w:cs="Microsoft YaHei"/>
       <w:color w:val="000000"/>
       <w:sz w:val="22"/>
     </w:rPr>
@@ -3523,7 +3839,7 @@
       <w:snapToGrid w:val="0"/>
     </w:pPr>
     <w:rPr>
-      <w:rFonts w:asciiTheme="majorHAnsi" w:eastAsiaTheme="majorEastAsia" w:hAnsiTheme="majorHAnsi" w:cstheme="majorBidi" w:ascii="Microsoft YaHei" w:hAnsi="Microsoft YaHei" w:eastAsia="Microsoft YaHei"/>
+      <w:rFonts w:ascii="Microsoft YaHei" w:hAnsi="Microsoft YaHei" w:eastAsia="Microsoft YaHei" w:cs="Microsoft YaHei"/>
       <w:b/>
       <w:bCs/>
       <w:color w:val="000000"/>
@@ -3548,7 +3864,7 @@
       <w:snapToGrid w:val="0"/>
     </w:pPr>
     <w:rPr>
-      <w:rFonts w:asciiTheme="majorHAnsi" w:eastAsiaTheme="majorEastAsia" w:hAnsiTheme="majorHAnsi" w:cstheme="majorBidi" w:ascii="Microsoft YaHei" w:hAnsi="Microsoft YaHei" w:eastAsia="Microsoft YaHei"/>
+      <w:rFonts w:ascii="Microsoft YaHei" w:hAnsi="Microsoft YaHei" w:eastAsia="Microsoft YaHei" w:cs="Microsoft YaHei"/>
       <w:b/>
       <w:bCs/>
       <w:color w:val="000000"/>
@@ -3572,7 +3888,7 @@
       <w:outlineLvl w:val="2"/>
     </w:pPr>
     <w:rPr>
-      <w:rFonts w:asciiTheme="majorHAnsi" w:eastAsiaTheme="majorEastAsia" w:hAnsiTheme="majorHAnsi" w:cstheme="majorBidi"/>
+      <w:rFonts w:ascii="Microsoft YaHei" w:hAnsi="Microsoft YaHei" w:cs="Microsoft YaHei" w:eastAsia="Microsoft YaHei"/>
       <w:b/>
       <w:bCs/>
       <w:color w:val="4F81BD" w:themeColor="accent1"/>
@@ -3595,7 +3911,7 @@
       <w:outlineLvl w:val="3"/>
     </w:pPr>
     <w:rPr>
-      <w:rFonts w:asciiTheme="majorHAnsi" w:eastAsiaTheme="majorEastAsia" w:hAnsiTheme="majorHAnsi" w:cstheme="majorBidi"/>
+      <w:rFonts w:ascii="Microsoft YaHei" w:hAnsi="Microsoft YaHei" w:cs="Microsoft YaHei" w:eastAsia="Microsoft YaHei"/>
       <w:b/>
       <w:bCs/>
       <w:i/>
@@ -3620,7 +3936,7 @@
       <w:outlineLvl w:val="4"/>
     </w:pPr>
     <w:rPr>
-      <w:rFonts w:asciiTheme="majorHAnsi" w:eastAsiaTheme="majorEastAsia" w:hAnsiTheme="majorHAnsi" w:cstheme="majorBidi"/>
+      <w:rFonts w:ascii="Microsoft YaHei" w:hAnsi="Microsoft YaHei" w:cs="Microsoft YaHei" w:eastAsia="Microsoft YaHei"/>
       <w:color w:val="243F60" w:themeColor="accent1" w:themeShade="7F"/>
     </w:rPr>
   </w:style>
@@ -3641,7 +3957,7 @@
       <w:outlineLvl w:val="5"/>
     </w:pPr>
     <w:rPr>
-      <w:rFonts w:asciiTheme="majorHAnsi" w:eastAsiaTheme="majorEastAsia" w:hAnsiTheme="majorHAnsi" w:cstheme="majorBidi"/>
+      <w:rFonts w:ascii="Microsoft YaHei" w:hAnsi="Microsoft YaHei" w:cs="Microsoft YaHei" w:eastAsia="Microsoft YaHei"/>
       <w:i/>
       <w:iCs/>
       <w:color w:val="243F60" w:themeColor="accent1" w:themeShade="7F"/>
@@ -3664,7 +3980,7 @@
       <w:outlineLvl w:val="6"/>
     </w:pPr>
     <w:rPr>
-      <w:rFonts w:asciiTheme="majorHAnsi" w:eastAsiaTheme="majorEastAsia" w:hAnsiTheme="majorHAnsi" w:cstheme="majorBidi"/>
+      <w:rFonts w:ascii="Microsoft YaHei" w:hAnsi="Microsoft YaHei" w:cs="Microsoft YaHei" w:eastAsia="Microsoft YaHei"/>
       <w:i/>
       <w:iCs/>
       <w:color w:val="404040" w:themeColor="text1" w:themeTint="BF"/>
@@ -3687,7 +4003,7 @@
       <w:outlineLvl w:val="7"/>
     </w:pPr>
     <w:rPr>
-      <w:rFonts w:asciiTheme="majorHAnsi" w:eastAsiaTheme="majorEastAsia" w:hAnsiTheme="majorHAnsi" w:cstheme="majorBidi"/>
+      <w:rFonts w:ascii="Microsoft YaHei" w:hAnsi="Microsoft YaHei" w:cs="Microsoft YaHei" w:eastAsia="Microsoft YaHei"/>
       <w:color w:val="4F81BD" w:themeColor="accent1"/>
       <w:sz w:val="20"/>
       <w:szCs w:val="20"/>
@@ -3710,7 +4026,7 @@
       <w:outlineLvl w:val="8"/>
     </w:pPr>
     <w:rPr>
-      <w:rFonts w:asciiTheme="majorHAnsi" w:eastAsiaTheme="majorEastAsia" w:hAnsiTheme="majorHAnsi" w:cstheme="majorBidi"/>
+      <w:rFonts w:ascii="Microsoft YaHei" w:hAnsi="Microsoft YaHei" w:cs="Microsoft YaHei" w:eastAsia="Microsoft YaHei"/>
       <w:i/>
       <w:iCs/>
       <w:color w:val="404040" w:themeColor="text1" w:themeTint="BF"/>
@@ -3761,7 +4077,7 @@
     <w:uiPriority w:val="9"/>
     <w:rsid w:val="00FC693F"/>
     <w:rPr>
-      <w:rFonts w:asciiTheme="majorHAnsi" w:eastAsiaTheme="majorEastAsia" w:hAnsiTheme="majorHAnsi" w:cstheme="majorBidi"/>
+      <w:rFonts w:ascii="Microsoft YaHei" w:hAnsi="Microsoft YaHei" w:cs="Microsoft YaHei" w:eastAsia="Microsoft YaHei"/>
       <w:b/>
       <w:bCs/>
       <w:color w:val="365F91" w:themeColor="accent1" w:themeShade="BF"/>
@@ -3776,7 +4092,7 @@
     <w:uiPriority w:val="9"/>
     <w:rsid w:val="00FC693F"/>
     <w:rPr>
-      <w:rFonts w:asciiTheme="majorHAnsi" w:eastAsiaTheme="majorEastAsia" w:hAnsiTheme="majorHAnsi" w:cstheme="majorBidi"/>
+      <w:rFonts w:ascii="Microsoft YaHei" w:hAnsi="Microsoft YaHei" w:cs="Microsoft YaHei" w:eastAsia="Microsoft YaHei"/>
       <w:b/>
       <w:bCs/>
       <w:color w:val="4F81BD" w:themeColor="accent1"/>
@@ -3791,7 +4107,7 @@
     <w:uiPriority w:val="9"/>
     <w:rsid w:val="00FC693F"/>
     <w:rPr>
-      <w:rFonts w:asciiTheme="majorHAnsi" w:eastAsiaTheme="majorEastAsia" w:hAnsiTheme="majorHAnsi" w:cstheme="majorBidi"/>
+      <w:rFonts w:ascii="Microsoft YaHei" w:hAnsi="Microsoft YaHei" w:cs="Microsoft YaHei" w:eastAsia="Microsoft YaHei"/>
       <w:b/>
       <w:bCs/>
       <w:color w:val="4F81BD" w:themeColor="accent1"/>
@@ -3811,7 +4127,7 @@
       <w:snapToGrid w:val="0"/>
     </w:pPr>
     <w:rPr>
-      <w:rFonts w:asciiTheme="majorHAnsi" w:eastAsiaTheme="majorEastAsia" w:hAnsiTheme="majorHAnsi" w:cstheme="majorBidi" w:ascii="Microsoft YaHei" w:hAnsi="Microsoft YaHei" w:eastAsia="Microsoft YaHei"/>
+      <w:rFonts w:ascii="Microsoft YaHei" w:hAnsi="Microsoft YaHei" w:eastAsia="Microsoft YaHei" w:cs="Microsoft YaHei"/>
       <w:color w:val="000000"/>
       <w:spacing w:val="5"/>
       <w:kern w:val="28"/>
@@ -3826,7 +4142,7 @@
     <w:uiPriority w:val="10"/>
     <w:rsid w:val="00FC693F"/>
     <w:rPr>
-      <w:rFonts w:asciiTheme="majorHAnsi" w:eastAsiaTheme="majorEastAsia" w:hAnsiTheme="majorHAnsi" w:cstheme="majorBidi"/>
+      <w:rFonts w:ascii="Microsoft YaHei" w:hAnsi="Microsoft YaHei" w:cs="Microsoft YaHei" w:eastAsia="Microsoft YaHei"/>
       <w:color w:val="17365D" w:themeColor="text2" w:themeShade="BF"/>
       <w:spacing w:val="5"/>
       <w:kern w:val="28"/>
@@ -3849,7 +4165,7 @@
       <w:snapToGrid w:val="0"/>
     </w:pPr>
     <w:rPr>
-      <w:rFonts w:asciiTheme="majorHAnsi" w:eastAsiaTheme="majorEastAsia" w:hAnsiTheme="majorHAnsi" w:cstheme="majorBidi" w:ascii="Microsoft YaHei" w:hAnsi="Microsoft YaHei" w:eastAsia="Microsoft YaHei"/>
+      <w:rFonts w:ascii="Microsoft YaHei" w:hAnsi="Microsoft YaHei" w:eastAsia="Microsoft YaHei" w:cs="Microsoft YaHei"/>
       <w:i/>
       <w:iCs/>
       <w:color w:val="000000"/>
@@ -3865,7 +4181,7 @@
     <w:uiPriority w:val="11"/>
     <w:rsid w:val="00FC693F"/>
     <w:rPr>
-      <w:rFonts w:asciiTheme="majorHAnsi" w:eastAsiaTheme="majorEastAsia" w:hAnsiTheme="majorHAnsi" w:cstheme="majorBidi"/>
+      <w:rFonts w:ascii="Microsoft YaHei" w:hAnsi="Microsoft YaHei" w:cs="Microsoft YaHei" w:eastAsia="Microsoft YaHei"/>
       <w:i/>
       <w:iCs/>
       <w:color w:val="4F81BD" w:themeColor="accent1"/>
@@ -4112,7 +4428,7 @@
       </w:tabs>
     </w:pPr>
     <w:rPr>
-      <w:rFonts w:ascii="Courier" w:hAnsi="Courier"/>
+      <w:rFonts w:ascii="Microsoft YaHei" w:hAnsi="Microsoft YaHei" w:cs="Microsoft YaHei" w:eastAsia="Microsoft YaHei"/>
       <w:sz w:val="20"/>
       <w:szCs w:val="20"/>
     </w:rPr>
@@ -4124,7 +4440,7 @@
     <w:uiPriority w:val="99"/>
     <w:rsid w:val="0029639D"/>
     <w:rPr>
-      <w:rFonts w:ascii="Courier" w:hAnsi="Courier"/>
+      <w:rFonts w:ascii="Microsoft YaHei" w:hAnsi="Microsoft YaHei" w:cs="Microsoft YaHei" w:eastAsia="Microsoft YaHei"/>
       <w:sz w:val="20"/>
       <w:szCs w:val="20"/>
     </w:rPr>
@@ -4163,7 +4479,7 @@
     <w:semiHidden/>
     <w:rsid w:val="00FC693F"/>
     <w:rPr>
-      <w:rFonts w:asciiTheme="majorHAnsi" w:eastAsiaTheme="majorEastAsia" w:hAnsiTheme="majorHAnsi" w:cstheme="majorBidi"/>
+      <w:rFonts w:ascii="Microsoft YaHei" w:hAnsi="Microsoft YaHei" w:cs="Microsoft YaHei" w:eastAsia="Microsoft YaHei"/>
       <w:b/>
       <w:bCs/>
       <w:i/>
@@ -4179,7 +4495,7 @@
     <w:semiHidden/>
     <w:rsid w:val="00FC693F"/>
     <w:rPr>
-      <w:rFonts w:asciiTheme="majorHAnsi" w:eastAsiaTheme="majorEastAsia" w:hAnsiTheme="majorHAnsi" w:cstheme="majorBidi"/>
+      <w:rFonts w:ascii="Microsoft YaHei" w:hAnsi="Microsoft YaHei" w:cs="Microsoft YaHei" w:eastAsia="Microsoft YaHei"/>
       <w:color w:val="243F60" w:themeColor="accent1" w:themeShade="7F"/>
     </w:rPr>
   </w:style>
@@ -4191,7 +4507,7 @@
     <w:semiHidden/>
     <w:rsid w:val="00FC693F"/>
     <w:rPr>
-      <w:rFonts w:asciiTheme="majorHAnsi" w:eastAsiaTheme="majorEastAsia" w:hAnsiTheme="majorHAnsi" w:cstheme="majorBidi"/>
+      <w:rFonts w:ascii="Microsoft YaHei" w:hAnsi="Microsoft YaHei" w:cs="Microsoft YaHei" w:eastAsia="Microsoft YaHei"/>
       <w:i/>
       <w:iCs/>
       <w:color w:val="243F60" w:themeColor="accent1" w:themeShade="7F"/>
@@ -4205,7 +4521,7 @@
     <w:semiHidden/>
     <w:rsid w:val="00FC693F"/>
     <w:rPr>
-      <w:rFonts w:asciiTheme="majorHAnsi" w:eastAsiaTheme="majorEastAsia" w:hAnsiTheme="majorHAnsi" w:cstheme="majorBidi"/>
+      <w:rFonts w:ascii="Microsoft YaHei" w:hAnsi="Microsoft YaHei" w:cs="Microsoft YaHei" w:eastAsia="Microsoft YaHei"/>
       <w:i/>
       <w:iCs/>
       <w:color w:val="404040" w:themeColor="text1" w:themeTint="BF"/>
@@ -4219,7 +4535,7 @@
     <w:semiHidden/>
     <w:rsid w:val="00FC693F"/>
     <w:rPr>
-      <w:rFonts w:asciiTheme="majorHAnsi" w:eastAsiaTheme="majorEastAsia" w:hAnsiTheme="majorHAnsi" w:cstheme="majorBidi"/>
+      <w:rFonts w:ascii="Microsoft YaHei" w:hAnsi="Microsoft YaHei" w:cs="Microsoft YaHei" w:eastAsia="Microsoft YaHei"/>
       <w:color w:val="4F81BD" w:themeColor="accent1"/>
       <w:sz w:val="20"/>
       <w:szCs w:val="20"/>
@@ -4233,7 +4549,7 @@
     <w:semiHidden/>
     <w:rsid w:val="00FC693F"/>
     <w:rPr>
-      <w:rFonts w:asciiTheme="majorHAnsi" w:eastAsiaTheme="majorEastAsia" w:hAnsiTheme="majorHAnsi" w:cstheme="majorBidi"/>
+      <w:rFonts w:ascii="Microsoft YaHei" w:hAnsi="Microsoft YaHei" w:cs="Microsoft YaHei" w:eastAsia="Microsoft YaHei"/>
       <w:i/>
       <w:iCs/>
       <w:color w:val="404040" w:themeColor="text1" w:themeTint="BF"/>
@@ -4256,7 +4572,7 @@
       <w:snapToGrid w:val="0"/>
     </w:pPr>
     <w:rPr>
-      <w:rFonts w:ascii="Microsoft YaHei" w:hAnsi="Microsoft YaHei" w:eastAsia="Microsoft YaHei"/>
+      <w:rFonts w:ascii="Microsoft YaHei" w:hAnsi="Microsoft YaHei" w:eastAsia="Microsoft YaHei" w:cs="Microsoft YaHei"/>
       <w:b/>
       <w:bCs/>
       <w:color w:val="000000"/>
@@ -5822,7 +6138,7 @@
         <w:spacing w:before="0" w:after="0" w:line="240" w:lineRule="auto"/>
       </w:pPr>
       <w:rPr>
-        <w:rFonts w:asciiTheme="majorHAnsi" w:eastAsiaTheme="majorEastAsia" w:hAnsiTheme="majorHAnsi" w:cstheme="majorBidi"/>
+        <w:rFonts w:ascii="Microsoft YaHei" w:hAnsi="Microsoft YaHei" w:cs="Microsoft YaHei" w:eastAsia="Microsoft YaHei"/>
         <w:b/>
         <w:bCs/>
       </w:rPr>
@@ -5843,7 +6159,7 @@
         <w:spacing w:before="0" w:after="0" w:line="240" w:lineRule="auto"/>
       </w:pPr>
       <w:rPr>
-        <w:rFonts w:asciiTheme="majorHAnsi" w:eastAsiaTheme="majorEastAsia" w:hAnsiTheme="majorHAnsi" w:cstheme="majorBidi"/>
+        <w:rFonts w:ascii="Microsoft YaHei" w:hAnsi="Microsoft YaHei" w:cs="Microsoft YaHei" w:eastAsia="Microsoft YaHei"/>
         <w:b/>
         <w:bCs/>
       </w:rPr>
@@ -5861,14 +6177,14 @@
     </w:tblStylePr>
     <w:tblStylePr w:type="firstCol">
       <w:rPr>
-        <w:rFonts w:asciiTheme="majorHAnsi" w:eastAsiaTheme="majorEastAsia" w:hAnsiTheme="majorHAnsi" w:cstheme="majorBidi"/>
+        <w:rFonts w:ascii="Microsoft YaHei" w:hAnsi="Microsoft YaHei" w:cs="Microsoft YaHei" w:eastAsia="Microsoft YaHei"/>
         <w:b/>
         <w:bCs/>
       </w:rPr>
     </w:tblStylePr>
     <w:tblStylePr w:type="lastCol">
       <w:rPr>
-        <w:rFonts w:asciiTheme="majorHAnsi" w:eastAsiaTheme="majorEastAsia" w:hAnsiTheme="majorHAnsi" w:cstheme="majorBidi"/>
+        <w:rFonts w:ascii="Microsoft YaHei" w:hAnsi="Microsoft YaHei" w:cs="Microsoft YaHei" w:eastAsia="Microsoft YaHei"/>
         <w:b/>
         <w:bCs/>
       </w:rPr>
@@ -5952,7 +6268,7 @@
         <w:spacing w:before="0" w:after="0" w:line="240" w:lineRule="auto"/>
       </w:pPr>
       <w:rPr>
-        <w:rFonts w:asciiTheme="majorHAnsi" w:eastAsiaTheme="majorEastAsia" w:hAnsiTheme="majorHAnsi" w:cstheme="majorBidi"/>
+        <w:rFonts w:ascii="Microsoft YaHei" w:hAnsi="Microsoft YaHei" w:cs="Microsoft YaHei" w:eastAsia="Microsoft YaHei"/>
         <w:b/>
         <w:bCs/>
       </w:rPr>
@@ -5973,7 +6289,7 @@
         <w:spacing w:before="0" w:after="0" w:line="240" w:lineRule="auto"/>
       </w:pPr>
       <w:rPr>
-        <w:rFonts w:asciiTheme="majorHAnsi" w:eastAsiaTheme="majorEastAsia" w:hAnsiTheme="majorHAnsi" w:cstheme="majorBidi"/>
+        <w:rFonts w:ascii="Microsoft YaHei" w:hAnsi="Microsoft YaHei" w:cs="Microsoft YaHei" w:eastAsia="Microsoft YaHei"/>
         <w:b/>
         <w:bCs/>
       </w:rPr>
@@ -5991,14 +6307,14 @@
     </w:tblStylePr>
     <w:tblStylePr w:type="firstCol">
       <w:rPr>
-        <w:rFonts w:asciiTheme="majorHAnsi" w:eastAsiaTheme="majorEastAsia" w:hAnsiTheme="majorHAnsi" w:cstheme="majorBidi"/>
+        <w:rFonts w:ascii="Microsoft YaHei" w:hAnsi="Microsoft YaHei" w:cs="Microsoft YaHei" w:eastAsia="Microsoft YaHei"/>
         <w:b/>
         <w:bCs/>
       </w:rPr>
     </w:tblStylePr>
     <w:tblStylePr w:type="lastCol">
       <w:rPr>
-        <w:rFonts w:asciiTheme="majorHAnsi" w:eastAsiaTheme="majorEastAsia" w:hAnsiTheme="majorHAnsi" w:cstheme="majorBidi"/>
+        <w:rFonts w:ascii="Microsoft YaHei" w:hAnsi="Microsoft YaHei" w:cs="Microsoft YaHei" w:eastAsia="Microsoft YaHei"/>
         <w:b/>
         <w:bCs/>
       </w:rPr>
@@ -6082,7 +6398,7 @@
         <w:spacing w:before="0" w:after="0" w:line="240" w:lineRule="auto"/>
       </w:pPr>
       <w:rPr>
-        <w:rFonts w:asciiTheme="majorHAnsi" w:eastAsiaTheme="majorEastAsia" w:hAnsiTheme="majorHAnsi" w:cstheme="majorBidi"/>
+        <w:rFonts w:ascii="Microsoft YaHei" w:hAnsi="Microsoft YaHei" w:cs="Microsoft YaHei" w:eastAsia="Microsoft YaHei"/>
         <w:b/>
         <w:bCs/>
       </w:rPr>
@@ -6103,7 +6419,7 @@
         <w:spacing w:before="0" w:after="0" w:line="240" w:lineRule="auto"/>
       </w:pPr>
       <w:rPr>
-        <w:rFonts w:asciiTheme="majorHAnsi" w:eastAsiaTheme="majorEastAsia" w:hAnsiTheme="majorHAnsi" w:cstheme="majorBidi"/>
+        <w:rFonts w:ascii="Microsoft YaHei" w:hAnsi="Microsoft YaHei" w:cs="Microsoft YaHei" w:eastAsia="Microsoft YaHei"/>
         <w:b/>
         <w:bCs/>
       </w:rPr>
@@ -6121,14 +6437,14 @@
     </w:tblStylePr>
     <w:tblStylePr w:type="firstCol">
       <w:rPr>
-        <w:rFonts w:asciiTheme="majorHAnsi" w:eastAsiaTheme="majorEastAsia" w:hAnsiTheme="majorHAnsi" w:cstheme="majorBidi"/>
+        <w:rFonts w:ascii="Microsoft YaHei" w:hAnsi="Microsoft YaHei" w:cs="Microsoft YaHei" w:eastAsia="Microsoft YaHei"/>
         <w:b/>
         <w:bCs/>
       </w:rPr>
     </w:tblStylePr>
     <w:tblStylePr w:type="lastCol">
       <w:rPr>
-        <w:rFonts w:asciiTheme="majorHAnsi" w:eastAsiaTheme="majorEastAsia" w:hAnsiTheme="majorHAnsi" w:cstheme="majorBidi"/>
+        <w:rFonts w:ascii="Microsoft YaHei" w:hAnsi="Microsoft YaHei" w:cs="Microsoft YaHei" w:eastAsia="Microsoft YaHei"/>
         <w:b/>
         <w:bCs/>
       </w:rPr>
@@ -6212,7 +6528,7 @@
         <w:spacing w:before="0" w:after="0" w:line="240" w:lineRule="auto"/>
       </w:pPr>
       <w:rPr>
-        <w:rFonts w:asciiTheme="majorHAnsi" w:eastAsiaTheme="majorEastAsia" w:hAnsiTheme="majorHAnsi" w:cstheme="majorBidi"/>
+        <w:rFonts w:ascii="Microsoft YaHei" w:hAnsi="Microsoft YaHei" w:cs="Microsoft YaHei" w:eastAsia="Microsoft YaHei"/>
         <w:b/>
         <w:bCs/>
       </w:rPr>
@@ -6233,7 +6549,7 @@
         <w:spacing w:before="0" w:after="0" w:line="240" w:lineRule="auto"/>
       </w:pPr>
       <w:rPr>
-        <w:rFonts w:asciiTheme="majorHAnsi" w:eastAsiaTheme="majorEastAsia" w:hAnsiTheme="majorHAnsi" w:cstheme="majorBidi"/>
+        <w:rFonts w:ascii="Microsoft YaHei" w:hAnsi="Microsoft YaHei" w:cs="Microsoft YaHei" w:eastAsia="Microsoft YaHei"/>
         <w:b/>
         <w:bCs/>
       </w:rPr>
@@ -6251,14 +6567,14 @@
     </w:tblStylePr>
     <w:tblStylePr w:type="firstCol">
       <w:rPr>
-        <w:rFonts w:asciiTheme="majorHAnsi" w:eastAsiaTheme="majorEastAsia" w:hAnsiTheme="majorHAnsi" w:cstheme="majorBidi"/>
+        <w:rFonts w:ascii="Microsoft YaHei" w:hAnsi="Microsoft YaHei" w:cs="Microsoft YaHei" w:eastAsia="Microsoft YaHei"/>
         <w:b/>
         <w:bCs/>
       </w:rPr>
     </w:tblStylePr>
     <w:tblStylePr w:type="lastCol">
       <w:rPr>
-        <w:rFonts w:asciiTheme="majorHAnsi" w:eastAsiaTheme="majorEastAsia" w:hAnsiTheme="majorHAnsi" w:cstheme="majorBidi"/>
+        <w:rFonts w:ascii="Microsoft YaHei" w:hAnsi="Microsoft YaHei" w:cs="Microsoft YaHei" w:eastAsia="Microsoft YaHei"/>
         <w:b/>
         <w:bCs/>
       </w:rPr>
@@ -6342,7 +6658,7 @@
         <w:spacing w:before="0" w:after="0" w:line="240" w:lineRule="auto"/>
       </w:pPr>
       <w:rPr>
-        <w:rFonts w:asciiTheme="majorHAnsi" w:eastAsiaTheme="majorEastAsia" w:hAnsiTheme="majorHAnsi" w:cstheme="majorBidi"/>
+        <w:rFonts w:ascii="Microsoft YaHei" w:hAnsi="Microsoft YaHei" w:cs="Microsoft YaHei" w:eastAsia="Microsoft YaHei"/>
         <w:b/>
         <w:bCs/>
       </w:rPr>
@@ -6363,7 +6679,7 @@
         <w:spacing w:before="0" w:after="0" w:line="240" w:lineRule="auto"/>
       </w:pPr>
       <w:rPr>
-        <w:rFonts w:asciiTheme="majorHAnsi" w:eastAsiaTheme="majorEastAsia" w:hAnsiTheme="majorHAnsi" w:cstheme="majorBidi"/>
+        <w:rFonts w:ascii="Microsoft YaHei" w:hAnsi="Microsoft YaHei" w:cs="Microsoft YaHei" w:eastAsia="Microsoft YaHei"/>
         <w:b/>
         <w:bCs/>
       </w:rPr>
@@ -6381,14 +6697,14 @@
     </w:tblStylePr>
     <w:tblStylePr w:type="firstCol">
       <w:rPr>
-        <w:rFonts w:asciiTheme="majorHAnsi" w:eastAsiaTheme="majorEastAsia" w:hAnsiTheme="majorHAnsi" w:cstheme="majorBidi"/>
+        <w:rFonts w:ascii="Microsoft YaHei" w:hAnsi="Microsoft YaHei" w:cs="Microsoft YaHei" w:eastAsia="Microsoft YaHei"/>
         <w:b/>
         <w:bCs/>
       </w:rPr>
     </w:tblStylePr>
     <w:tblStylePr w:type="lastCol">
       <w:rPr>
-        <w:rFonts w:asciiTheme="majorHAnsi" w:eastAsiaTheme="majorEastAsia" w:hAnsiTheme="majorHAnsi" w:cstheme="majorBidi"/>
+        <w:rFonts w:ascii="Microsoft YaHei" w:hAnsi="Microsoft YaHei" w:cs="Microsoft YaHei" w:eastAsia="Microsoft YaHei"/>
         <w:b/>
         <w:bCs/>
       </w:rPr>
@@ -6472,7 +6788,7 @@
         <w:spacing w:before="0" w:after="0" w:line="240" w:lineRule="auto"/>
       </w:pPr>
       <w:rPr>
-        <w:rFonts w:asciiTheme="majorHAnsi" w:eastAsiaTheme="majorEastAsia" w:hAnsiTheme="majorHAnsi" w:cstheme="majorBidi"/>
+        <w:rFonts w:ascii="Microsoft YaHei" w:hAnsi="Microsoft YaHei" w:cs="Microsoft YaHei" w:eastAsia="Microsoft YaHei"/>
         <w:b/>
         <w:bCs/>
       </w:rPr>
@@ -6493,7 +6809,7 @@
         <w:spacing w:before="0" w:after="0" w:line="240" w:lineRule="auto"/>
       </w:pPr>
       <w:rPr>
-        <w:rFonts w:asciiTheme="majorHAnsi" w:eastAsiaTheme="majorEastAsia" w:hAnsiTheme="majorHAnsi" w:cstheme="majorBidi"/>
+        <w:rFonts w:ascii="Microsoft YaHei" w:hAnsi="Microsoft YaHei" w:cs="Microsoft YaHei" w:eastAsia="Microsoft YaHei"/>
         <w:b/>
         <w:bCs/>
       </w:rPr>
@@ -6511,14 +6827,14 @@
     </w:tblStylePr>
     <w:tblStylePr w:type="firstCol">
       <w:rPr>
-        <w:rFonts w:asciiTheme="majorHAnsi" w:eastAsiaTheme="majorEastAsia" w:hAnsiTheme="majorHAnsi" w:cstheme="majorBidi"/>
+        <w:rFonts w:ascii="Microsoft YaHei" w:hAnsi="Microsoft YaHei" w:cs="Microsoft YaHei" w:eastAsia="Microsoft YaHei"/>
         <w:b/>
         <w:bCs/>
       </w:rPr>
     </w:tblStylePr>
     <w:tblStylePr w:type="lastCol">
       <w:rPr>
-        <w:rFonts w:asciiTheme="majorHAnsi" w:eastAsiaTheme="majorEastAsia" w:hAnsiTheme="majorHAnsi" w:cstheme="majorBidi"/>
+        <w:rFonts w:ascii="Microsoft YaHei" w:hAnsi="Microsoft YaHei" w:cs="Microsoft YaHei" w:eastAsia="Microsoft YaHei"/>
         <w:b/>
         <w:bCs/>
       </w:rPr>
@@ -6602,7 +6918,7 @@
         <w:spacing w:before="0" w:after="0" w:line="240" w:lineRule="auto"/>
       </w:pPr>
       <w:rPr>
-        <w:rFonts w:asciiTheme="majorHAnsi" w:eastAsiaTheme="majorEastAsia" w:hAnsiTheme="majorHAnsi" w:cstheme="majorBidi"/>
+        <w:rFonts w:ascii="Microsoft YaHei" w:hAnsi="Microsoft YaHei" w:cs="Microsoft YaHei" w:eastAsia="Microsoft YaHei"/>
         <w:b/>
         <w:bCs/>
       </w:rPr>
@@ -6623,7 +6939,7 @@
         <w:spacing w:before="0" w:after="0" w:line="240" w:lineRule="auto"/>
       </w:pPr>
       <w:rPr>
-        <w:rFonts w:asciiTheme="majorHAnsi" w:eastAsiaTheme="majorEastAsia" w:hAnsiTheme="majorHAnsi" w:cstheme="majorBidi"/>
+        <w:rFonts w:ascii="Microsoft YaHei" w:hAnsi="Microsoft YaHei" w:cs="Microsoft YaHei" w:eastAsia="Microsoft YaHei"/>
         <w:b/>
         <w:bCs/>
       </w:rPr>
@@ -6641,14 +6957,14 @@
     </w:tblStylePr>
     <w:tblStylePr w:type="firstCol">
       <w:rPr>
-        <w:rFonts w:asciiTheme="majorHAnsi" w:eastAsiaTheme="majorEastAsia" w:hAnsiTheme="majorHAnsi" w:cstheme="majorBidi"/>
+        <w:rFonts w:ascii="Microsoft YaHei" w:hAnsi="Microsoft YaHei" w:cs="Microsoft YaHei" w:eastAsia="Microsoft YaHei"/>
         <w:b/>
         <w:bCs/>
       </w:rPr>
     </w:tblStylePr>
     <w:tblStylePr w:type="lastCol">
       <w:rPr>
-        <w:rFonts w:asciiTheme="majorHAnsi" w:eastAsiaTheme="majorEastAsia" w:hAnsiTheme="majorHAnsi" w:cstheme="majorBidi"/>
+        <w:rFonts w:ascii="Microsoft YaHei" w:hAnsi="Microsoft YaHei" w:cs="Microsoft YaHei" w:eastAsia="Microsoft YaHei"/>
         <w:b/>
         <w:bCs/>
       </w:rPr>
@@ -8513,7 +8829,7 @@
     </w:tblPr>
     <w:tblStylePr w:type="firstRow">
       <w:rPr>
-        <w:rFonts w:asciiTheme="majorHAnsi" w:eastAsiaTheme="majorEastAsia" w:hAnsiTheme="majorHAnsi" w:cstheme="majorBidi"/>
+        <w:rFonts w:ascii="Microsoft YaHei" w:hAnsi="Microsoft YaHei" w:cs="Microsoft YaHei" w:eastAsia="Microsoft YaHei"/>
       </w:rPr>
       <w:tblPr/>
       <w:tcPr>
@@ -8597,7 +8913,7 @@
     </w:tblPr>
     <w:tblStylePr w:type="firstRow">
       <w:rPr>
-        <w:rFonts w:asciiTheme="majorHAnsi" w:eastAsiaTheme="majorEastAsia" w:hAnsiTheme="majorHAnsi" w:cstheme="majorBidi"/>
+        <w:rFonts w:ascii="Microsoft YaHei" w:hAnsi="Microsoft YaHei" w:cs="Microsoft YaHei" w:eastAsia="Microsoft YaHei"/>
       </w:rPr>
       <w:tblPr/>
       <w:tcPr>
@@ -8681,7 +8997,7 @@
     </w:tblPr>
     <w:tblStylePr w:type="firstRow">
       <w:rPr>
-        <w:rFonts w:asciiTheme="majorHAnsi" w:eastAsiaTheme="majorEastAsia" w:hAnsiTheme="majorHAnsi" w:cstheme="majorBidi"/>
+        <w:rFonts w:ascii="Microsoft YaHei" w:hAnsi="Microsoft YaHei" w:cs="Microsoft YaHei" w:eastAsia="Microsoft YaHei"/>
       </w:rPr>
       <w:tblPr/>
       <w:tcPr>
@@ -8765,7 +9081,7 @@
     </w:tblPr>
     <w:tblStylePr w:type="firstRow">
       <w:rPr>
-        <w:rFonts w:asciiTheme="majorHAnsi" w:eastAsiaTheme="majorEastAsia" w:hAnsiTheme="majorHAnsi" w:cstheme="majorBidi"/>
+        <w:rFonts w:ascii="Microsoft YaHei" w:hAnsi="Microsoft YaHei" w:cs="Microsoft YaHei" w:eastAsia="Microsoft YaHei"/>
       </w:rPr>
       <w:tblPr/>
       <w:tcPr>
@@ -8849,7 +9165,7 @@
     </w:tblPr>
     <w:tblStylePr w:type="firstRow">
       <w:rPr>
-        <w:rFonts w:asciiTheme="majorHAnsi" w:eastAsiaTheme="majorEastAsia" w:hAnsiTheme="majorHAnsi" w:cstheme="majorBidi"/>
+        <w:rFonts w:ascii="Microsoft YaHei" w:hAnsi="Microsoft YaHei" w:cs="Microsoft YaHei" w:eastAsia="Microsoft YaHei"/>
       </w:rPr>
       <w:tblPr/>
       <w:tcPr>
@@ -8933,7 +9249,7 @@
     </w:tblPr>
     <w:tblStylePr w:type="firstRow">
       <w:rPr>
-        <w:rFonts w:asciiTheme="majorHAnsi" w:eastAsiaTheme="majorEastAsia" w:hAnsiTheme="majorHAnsi" w:cstheme="majorBidi"/>
+        <w:rFonts w:ascii="Microsoft YaHei" w:hAnsi="Microsoft YaHei" w:cs="Microsoft YaHei" w:eastAsia="Microsoft YaHei"/>
       </w:rPr>
       <w:tblPr/>
       <w:tcPr>
@@ -9017,7 +9333,7 @@
     </w:tblPr>
     <w:tblStylePr w:type="firstRow">
       <w:rPr>
-        <w:rFonts w:asciiTheme="majorHAnsi" w:eastAsiaTheme="majorEastAsia" w:hAnsiTheme="majorHAnsi" w:cstheme="majorBidi"/>
+        <w:rFonts w:ascii="Microsoft YaHei" w:hAnsi="Microsoft YaHei" w:cs="Microsoft YaHei" w:eastAsia="Microsoft YaHei"/>
       </w:rPr>
       <w:tblPr/>
       <w:tcPr>
@@ -9082,7 +9398,7 @@
       <w:spacing w:after="0" w:line="240" w:lineRule="auto"/>
     </w:pPr>
     <w:rPr>
-      <w:rFonts w:asciiTheme="majorHAnsi" w:eastAsiaTheme="majorEastAsia" w:hAnsiTheme="majorHAnsi" w:cstheme="majorBidi"/>
+      <w:rFonts w:ascii="Microsoft YaHei" w:hAnsi="Microsoft YaHei" w:cs="Microsoft YaHei" w:eastAsia="Microsoft YaHei"/>
       <w:color w:val="000000" w:themeColor="text1"/>
     </w:rPr>
     <w:tblPr>
@@ -9210,7 +9526,7 @@
       <w:spacing w:after="0" w:line="240" w:lineRule="auto"/>
     </w:pPr>
     <w:rPr>
-      <w:rFonts w:asciiTheme="majorHAnsi" w:eastAsiaTheme="majorEastAsia" w:hAnsiTheme="majorHAnsi" w:cstheme="majorBidi"/>
+      <w:rFonts w:ascii="Microsoft YaHei" w:hAnsi="Microsoft YaHei" w:cs="Microsoft YaHei" w:eastAsia="Microsoft YaHei"/>
       <w:color w:val="000000" w:themeColor="text1"/>
     </w:rPr>
     <w:tblPr>
@@ -9338,7 +9654,7 @@
       <w:spacing w:after="0" w:line="240" w:lineRule="auto"/>
     </w:pPr>
     <w:rPr>
-      <w:rFonts w:asciiTheme="majorHAnsi" w:eastAsiaTheme="majorEastAsia" w:hAnsiTheme="majorHAnsi" w:cstheme="majorBidi"/>
+      <w:rFonts w:ascii="Microsoft YaHei" w:hAnsi="Microsoft YaHei" w:cs="Microsoft YaHei" w:eastAsia="Microsoft YaHei"/>
       <w:color w:val="000000" w:themeColor="text1"/>
     </w:rPr>
     <w:tblPr>
@@ -9466,7 +9782,7 @@
       <w:spacing w:after="0" w:line="240" w:lineRule="auto"/>
     </w:pPr>
     <w:rPr>
-      <w:rFonts w:asciiTheme="majorHAnsi" w:eastAsiaTheme="majorEastAsia" w:hAnsiTheme="majorHAnsi" w:cstheme="majorBidi"/>
+      <w:rFonts w:ascii="Microsoft YaHei" w:hAnsi="Microsoft YaHei" w:cs="Microsoft YaHei" w:eastAsia="Microsoft YaHei"/>
       <w:color w:val="000000" w:themeColor="text1"/>
     </w:rPr>
     <w:tblPr>
@@ -9594,7 +9910,7 @@
       <w:spacing w:after="0" w:line="240" w:lineRule="auto"/>
     </w:pPr>
     <w:rPr>
-      <w:rFonts w:asciiTheme="majorHAnsi" w:eastAsiaTheme="majorEastAsia" w:hAnsiTheme="majorHAnsi" w:cstheme="majorBidi"/>
+      <w:rFonts w:ascii="Microsoft YaHei" w:hAnsi="Microsoft YaHei" w:cs="Microsoft YaHei" w:eastAsia="Microsoft YaHei"/>
       <w:color w:val="000000" w:themeColor="text1"/>
     </w:rPr>
     <w:tblPr>
@@ -9722,7 +10038,7 @@
       <w:spacing w:after="0" w:line="240" w:lineRule="auto"/>
     </w:pPr>
     <w:rPr>
-      <w:rFonts w:asciiTheme="majorHAnsi" w:eastAsiaTheme="majorEastAsia" w:hAnsiTheme="majorHAnsi" w:cstheme="majorBidi"/>
+      <w:rFonts w:ascii="Microsoft YaHei" w:hAnsi="Microsoft YaHei" w:cs="Microsoft YaHei" w:eastAsia="Microsoft YaHei"/>
       <w:color w:val="000000" w:themeColor="text1"/>
     </w:rPr>
     <w:tblPr>
@@ -9850,7 +10166,7 @@
       <w:spacing w:after="0" w:line="240" w:lineRule="auto"/>
     </w:pPr>
     <w:rPr>
-      <w:rFonts w:asciiTheme="majorHAnsi" w:eastAsiaTheme="majorEastAsia" w:hAnsiTheme="majorHAnsi" w:cstheme="majorBidi"/>
+      <w:rFonts w:ascii="Microsoft YaHei" w:hAnsi="Microsoft YaHei" w:cs="Microsoft YaHei" w:eastAsia="Microsoft YaHei"/>
       <w:color w:val="000000" w:themeColor="text1"/>
     </w:rPr>
     <w:tblPr>
@@ -10489,7 +10805,7 @@
       <w:spacing w:after="0" w:line="240" w:lineRule="auto"/>
     </w:pPr>
     <w:rPr>
-      <w:rFonts w:asciiTheme="majorHAnsi" w:eastAsiaTheme="majorEastAsia" w:hAnsiTheme="majorHAnsi" w:cstheme="majorBidi"/>
+      <w:rFonts w:ascii="Microsoft YaHei" w:hAnsi="Microsoft YaHei" w:cs="Microsoft YaHei" w:eastAsia="Microsoft YaHei"/>
       <w:color w:val="000000" w:themeColor="text1"/>
     </w:rPr>
     <w:tblPr>
@@ -10614,7 +10930,7 @@
       <w:spacing w:after="0" w:line="240" w:lineRule="auto"/>
     </w:pPr>
     <w:rPr>
-      <w:rFonts w:asciiTheme="majorHAnsi" w:eastAsiaTheme="majorEastAsia" w:hAnsiTheme="majorHAnsi" w:cstheme="majorBidi"/>
+      <w:rFonts w:ascii="Microsoft YaHei" w:hAnsi="Microsoft YaHei" w:cs="Microsoft YaHei" w:eastAsia="Microsoft YaHei"/>
       <w:color w:val="000000" w:themeColor="text1"/>
     </w:rPr>
     <w:tblPr>
@@ -10739,7 +11055,7 @@
       <w:spacing w:after="0" w:line="240" w:lineRule="auto"/>
     </w:pPr>
     <w:rPr>
-      <w:rFonts w:asciiTheme="majorHAnsi" w:eastAsiaTheme="majorEastAsia" w:hAnsiTheme="majorHAnsi" w:cstheme="majorBidi"/>
+      <w:rFonts w:ascii="Microsoft YaHei" w:hAnsi="Microsoft YaHei" w:cs="Microsoft YaHei" w:eastAsia="Microsoft YaHei"/>
       <w:color w:val="000000" w:themeColor="text1"/>
     </w:rPr>
     <w:tblPr>
@@ -10864,7 +11180,7 @@
       <w:spacing w:after="0" w:line="240" w:lineRule="auto"/>
     </w:pPr>
     <w:rPr>
-      <w:rFonts w:asciiTheme="majorHAnsi" w:eastAsiaTheme="majorEastAsia" w:hAnsiTheme="majorHAnsi" w:cstheme="majorBidi"/>
+      <w:rFonts w:ascii="Microsoft YaHei" w:hAnsi="Microsoft YaHei" w:cs="Microsoft YaHei" w:eastAsia="Microsoft YaHei"/>
       <w:color w:val="000000" w:themeColor="text1"/>
     </w:rPr>
     <w:tblPr>
@@ -10989,7 +11305,7 @@
       <w:spacing w:after="0" w:line="240" w:lineRule="auto"/>
     </w:pPr>
     <w:rPr>
-      <w:rFonts w:asciiTheme="majorHAnsi" w:eastAsiaTheme="majorEastAsia" w:hAnsiTheme="majorHAnsi" w:cstheme="majorBidi"/>
+      <w:rFonts w:ascii="Microsoft YaHei" w:hAnsi="Microsoft YaHei" w:cs="Microsoft YaHei" w:eastAsia="Microsoft YaHei"/>
       <w:color w:val="000000" w:themeColor="text1"/>
     </w:rPr>
     <w:tblPr>
@@ -11114,7 +11430,7 @@
       <w:spacing w:after="0" w:line="240" w:lineRule="auto"/>
     </w:pPr>
     <w:rPr>
-      <w:rFonts w:asciiTheme="majorHAnsi" w:eastAsiaTheme="majorEastAsia" w:hAnsiTheme="majorHAnsi" w:cstheme="majorBidi"/>
+      <w:rFonts w:ascii="Microsoft YaHei" w:hAnsi="Microsoft YaHei" w:cs="Microsoft YaHei" w:eastAsia="Microsoft YaHei"/>
       <w:color w:val="000000" w:themeColor="text1"/>
     </w:rPr>
     <w:tblPr>
@@ -11239,7 +11555,7 @@
       <w:spacing w:after="0" w:line="240" w:lineRule="auto"/>
     </w:pPr>
     <w:rPr>
-      <w:rFonts w:asciiTheme="majorHAnsi" w:eastAsiaTheme="majorEastAsia" w:hAnsiTheme="majorHAnsi" w:cstheme="majorBidi"/>
+      <w:rFonts w:ascii="Microsoft YaHei" w:hAnsi="Microsoft YaHei" w:cs="Microsoft YaHei" w:eastAsia="Microsoft YaHei"/>
       <w:color w:val="000000" w:themeColor="text1"/>
     </w:rPr>
     <w:tblPr>
@@ -15154,10 +15470,10 @@
   <w:docDefaults>
     <w:rPrDefault>
       <w:rPr>
-        <w:rFonts w:asciiTheme="minorHAnsi" w:eastAsiaTheme="minorEastAsia" w:hAnsiTheme="minorHAnsi" w:cstheme="minorBidi"/>
+        <w:rFonts w:ascii="Microsoft YaHei" w:hAnsi="Microsoft YaHei" w:cs="Microsoft YaHei" w:eastAsia="Microsoft YaHei"/>
         <w:sz w:val="22"/>
         <w:szCs w:val="22"/>
-        <w:lang w:val="en-US" w:eastAsia="en-US" w:bidi="ar-SA"/>
+        <w:lang w:val="en-US" w:eastAsia="zh-CN" w:bidi="ar-SA"/>
       </w:rPr>
     </w:rPrDefault>
     <w:pPrDefault>
@@ -15325,7 +15641,7 @@
       <w:outlineLvl w:val="0"/>
     </w:pPr>
     <w:rPr>
-      <w:rFonts w:asciiTheme="majorHAnsi" w:eastAsiaTheme="majorEastAsia" w:hAnsiTheme="majorHAnsi" w:cstheme="majorBidi"/>
+      <w:rFonts w:ascii="Microsoft YaHei" w:hAnsi="Microsoft YaHei" w:cs="Microsoft YaHei" w:eastAsia="Microsoft YaHei"/>
       <w:b/>
       <w:bCs/>
       <w:color w:val="365F91" w:themeColor="accent1" w:themeShade="BF"/>
@@ -15349,7 +15665,7 @@
       <w:outlineLvl w:val="1"/>
     </w:pPr>
     <w:rPr>
-      <w:rFonts w:asciiTheme="majorHAnsi" w:eastAsiaTheme="majorEastAsia" w:hAnsiTheme="majorHAnsi" w:cstheme="majorBidi"/>
+      <w:rFonts w:ascii="Microsoft YaHei" w:hAnsi="Microsoft YaHei" w:cs="Microsoft YaHei" w:eastAsia="Microsoft YaHei"/>
       <w:b/>
       <w:bCs/>
       <w:color w:val="4F81BD" w:themeColor="accent1"/>
@@ -15373,7 +15689,7 @@
       <w:outlineLvl w:val="2"/>
     </w:pPr>
     <w:rPr>
-      <w:rFonts w:asciiTheme="majorHAnsi" w:eastAsiaTheme="majorEastAsia" w:hAnsiTheme="majorHAnsi" w:cstheme="majorBidi"/>
+      <w:rFonts w:ascii="Microsoft YaHei" w:hAnsi="Microsoft YaHei" w:cs="Microsoft YaHei" w:eastAsia="Microsoft YaHei"/>
       <w:b/>
       <w:bCs/>
       <w:color w:val="4F81BD" w:themeColor="accent1"/>
@@ -15396,7 +15712,7 @@
       <w:outlineLvl w:val="3"/>
     </w:pPr>
     <w:rPr>
-      <w:rFonts w:asciiTheme="majorHAnsi" w:eastAsiaTheme="majorEastAsia" w:hAnsiTheme="majorHAnsi" w:cstheme="majorBidi"/>
+      <w:rFonts w:ascii="Microsoft YaHei" w:hAnsi="Microsoft YaHei" w:cs="Microsoft YaHei" w:eastAsia="Microsoft YaHei"/>
       <w:b/>
       <w:bCs/>
       <w:i/>
@@ -15421,7 +15737,7 @@
       <w:outlineLvl w:val="4"/>
     </w:pPr>
     <w:rPr>
-      <w:rFonts w:asciiTheme="majorHAnsi" w:eastAsiaTheme="majorEastAsia" w:hAnsiTheme="majorHAnsi" w:cstheme="majorBidi"/>
+      <w:rFonts w:ascii="Microsoft YaHei" w:hAnsi="Microsoft YaHei" w:cs="Microsoft YaHei" w:eastAsia="Microsoft YaHei"/>
       <w:color w:val="243F60" w:themeColor="accent1" w:themeShade="7F"/>
     </w:rPr>
   </w:style>
@@ -15442,7 +15758,7 @@
       <w:outlineLvl w:val="5"/>
     </w:pPr>
     <w:rPr>
-      <w:rFonts w:asciiTheme="majorHAnsi" w:eastAsiaTheme="majorEastAsia" w:hAnsiTheme="majorHAnsi" w:cstheme="majorBidi"/>
+      <w:rFonts w:ascii="Microsoft YaHei" w:hAnsi="Microsoft YaHei" w:cs="Microsoft YaHei" w:eastAsia="Microsoft YaHei"/>
       <w:i/>
       <w:iCs/>
       <w:color w:val="243F60" w:themeColor="accent1" w:themeShade="7F"/>
@@ -15465,7 +15781,7 @@
       <w:outlineLvl w:val="6"/>
     </w:pPr>
     <w:rPr>
-      <w:rFonts w:asciiTheme="majorHAnsi" w:eastAsiaTheme="majorEastAsia" w:hAnsiTheme="majorHAnsi" w:cstheme="majorBidi"/>
+      <w:rFonts w:ascii="Microsoft YaHei" w:hAnsi="Microsoft YaHei" w:cs="Microsoft YaHei" w:eastAsia="Microsoft YaHei"/>
       <w:i/>
       <w:iCs/>
       <w:color w:val="404040" w:themeColor="text1" w:themeTint="BF"/>
@@ -15488,7 +15804,7 @@
       <w:outlineLvl w:val="7"/>
     </w:pPr>
     <w:rPr>
-      <w:rFonts w:asciiTheme="majorHAnsi" w:eastAsiaTheme="majorEastAsia" w:hAnsiTheme="majorHAnsi" w:cstheme="majorBidi"/>
+      <w:rFonts w:ascii="Microsoft YaHei" w:hAnsi="Microsoft YaHei" w:cs="Microsoft YaHei" w:eastAsia="Microsoft YaHei"/>
       <w:color w:val="4F81BD" w:themeColor="accent1"/>
       <w:sz w:val="20"/>
       <w:szCs w:val="20"/>
@@ -15511,7 +15827,7 @@
       <w:outlineLvl w:val="8"/>
     </w:pPr>
     <w:rPr>
-      <w:rFonts w:asciiTheme="majorHAnsi" w:eastAsiaTheme="majorEastAsia" w:hAnsiTheme="majorHAnsi" w:cstheme="majorBidi"/>
+      <w:rFonts w:ascii="Microsoft YaHei" w:hAnsi="Microsoft YaHei" w:cs="Microsoft YaHei" w:eastAsia="Microsoft YaHei"/>
       <w:i/>
       <w:iCs/>
       <w:color w:val="404040" w:themeColor="text1" w:themeTint="BF"/>
@@ -15562,7 +15878,7 @@
     <w:uiPriority w:val="9"/>
     <w:rsid w:val="00FC693F"/>
     <w:rPr>
-      <w:rFonts w:asciiTheme="majorHAnsi" w:eastAsiaTheme="majorEastAsia" w:hAnsiTheme="majorHAnsi" w:cstheme="majorBidi"/>
+      <w:rFonts w:ascii="Microsoft YaHei" w:hAnsi="Microsoft YaHei" w:cs="Microsoft YaHei" w:eastAsia="Microsoft YaHei"/>
       <w:b/>
       <w:bCs/>
       <w:color w:val="365F91" w:themeColor="accent1" w:themeShade="BF"/>
@@ -15577,7 +15893,7 @@
     <w:uiPriority w:val="9"/>
     <w:rsid w:val="00FC693F"/>
     <w:rPr>
-      <w:rFonts w:asciiTheme="majorHAnsi" w:eastAsiaTheme="majorEastAsia" w:hAnsiTheme="majorHAnsi" w:cstheme="majorBidi"/>
+      <w:rFonts w:ascii="Microsoft YaHei" w:hAnsi="Microsoft YaHei" w:cs="Microsoft YaHei" w:eastAsia="Microsoft YaHei"/>
       <w:b/>
       <w:bCs/>
       <w:color w:val="4F81BD" w:themeColor="accent1"/>
@@ -15592,7 +15908,7 @@
     <w:uiPriority w:val="9"/>
     <w:rsid w:val="00FC693F"/>
     <w:rPr>
-      <w:rFonts w:asciiTheme="majorHAnsi" w:eastAsiaTheme="majorEastAsia" w:hAnsiTheme="majorHAnsi" w:cstheme="majorBidi"/>
+      <w:rFonts w:ascii="Microsoft YaHei" w:hAnsi="Microsoft YaHei" w:cs="Microsoft YaHei" w:eastAsia="Microsoft YaHei"/>
       <w:b/>
       <w:bCs/>
       <w:color w:val="4F81BD" w:themeColor="accent1"/>
@@ -15614,7 +15930,7 @@
       <w:contextualSpacing/>
     </w:pPr>
     <w:rPr>
-      <w:rFonts w:asciiTheme="majorHAnsi" w:eastAsiaTheme="majorEastAsia" w:hAnsiTheme="majorHAnsi" w:cstheme="majorBidi"/>
+      <w:rFonts w:ascii="Microsoft YaHei" w:hAnsi="Microsoft YaHei" w:cs="Microsoft YaHei" w:eastAsia="Microsoft YaHei"/>
       <w:color w:val="17365D" w:themeColor="text2" w:themeShade="BF"/>
       <w:spacing w:val="5"/>
       <w:kern w:val="28"/>
@@ -15629,7 +15945,7 @@
     <w:uiPriority w:val="10"/>
     <w:rsid w:val="00FC693F"/>
     <w:rPr>
-      <w:rFonts w:asciiTheme="majorHAnsi" w:eastAsiaTheme="majorEastAsia" w:hAnsiTheme="majorHAnsi" w:cstheme="majorBidi"/>
+      <w:rFonts w:ascii="Microsoft YaHei" w:hAnsi="Microsoft YaHei" w:cs="Microsoft YaHei" w:eastAsia="Microsoft YaHei"/>
       <w:color w:val="17365D" w:themeColor="text2" w:themeShade="BF"/>
       <w:spacing w:val="5"/>
       <w:kern w:val="28"/>
@@ -15651,7 +15967,7 @@
       </w:numPr>
     </w:pPr>
     <w:rPr>
-      <w:rFonts w:asciiTheme="majorHAnsi" w:eastAsiaTheme="majorEastAsia" w:hAnsiTheme="majorHAnsi" w:cstheme="majorBidi"/>
+      <w:rFonts w:ascii="Microsoft YaHei" w:hAnsi="Microsoft YaHei" w:cs="Microsoft YaHei" w:eastAsia="Microsoft YaHei"/>
       <w:i/>
       <w:iCs/>
       <w:color w:val="4F81BD" w:themeColor="accent1"/>
@@ -15667,7 +15983,7 @@
     <w:uiPriority w:val="11"/>
     <w:rsid w:val="00FC693F"/>
     <w:rPr>
-      <w:rFonts w:asciiTheme="majorHAnsi" w:eastAsiaTheme="majorEastAsia" w:hAnsiTheme="majorHAnsi" w:cstheme="majorBidi"/>
+      <w:rFonts w:ascii="Microsoft YaHei" w:hAnsi="Microsoft YaHei" w:cs="Microsoft YaHei" w:eastAsia="Microsoft YaHei"/>
       <w:i/>
       <w:iCs/>
       <w:color w:val="4F81BD" w:themeColor="accent1"/>
@@ -15914,7 +16230,7 @@
       </w:tabs>
     </w:pPr>
     <w:rPr>
-      <w:rFonts w:ascii="Courier" w:hAnsi="Courier"/>
+      <w:rFonts w:ascii="Microsoft YaHei" w:hAnsi="Microsoft YaHei" w:cs="Microsoft YaHei" w:eastAsia="Microsoft YaHei"/>
       <w:sz w:val="20"/>
       <w:szCs w:val="20"/>
     </w:rPr>
@@ -15926,7 +16242,7 @@
     <w:uiPriority w:val="99"/>
     <w:rsid w:val="0029639D"/>
     <w:rPr>
-      <w:rFonts w:ascii="Courier" w:hAnsi="Courier"/>
+      <w:rFonts w:ascii="Microsoft YaHei" w:hAnsi="Microsoft YaHei" w:cs="Microsoft YaHei" w:eastAsia="Microsoft YaHei"/>
       <w:sz w:val="20"/>
       <w:szCs w:val="20"/>
     </w:rPr>
@@ -15965,7 +16281,7 @@
     <w:semiHidden/>
     <w:rsid w:val="00FC693F"/>
     <w:rPr>
-      <w:rFonts w:asciiTheme="majorHAnsi" w:eastAsiaTheme="majorEastAsia" w:hAnsiTheme="majorHAnsi" w:cstheme="majorBidi"/>
+      <w:rFonts w:ascii="Microsoft YaHei" w:hAnsi="Microsoft YaHei" w:cs="Microsoft YaHei" w:eastAsia="Microsoft YaHei"/>
       <w:b/>
       <w:bCs/>
       <w:i/>
@@ -15981,7 +16297,7 @@
     <w:semiHidden/>
     <w:rsid w:val="00FC693F"/>
     <w:rPr>
-      <w:rFonts w:asciiTheme="majorHAnsi" w:eastAsiaTheme="majorEastAsia" w:hAnsiTheme="majorHAnsi" w:cstheme="majorBidi"/>
+      <w:rFonts w:ascii="Microsoft YaHei" w:hAnsi="Microsoft YaHei" w:cs="Microsoft YaHei" w:eastAsia="Microsoft YaHei"/>
       <w:color w:val="243F60" w:themeColor="accent1" w:themeShade="7F"/>
     </w:rPr>
   </w:style>
@@ -15993,7 +16309,7 @@
     <w:semiHidden/>
     <w:rsid w:val="00FC693F"/>
     <w:rPr>
-      <w:rFonts w:asciiTheme="majorHAnsi" w:eastAsiaTheme="majorEastAsia" w:hAnsiTheme="majorHAnsi" w:cstheme="majorBidi"/>
+      <w:rFonts w:ascii="Microsoft YaHei" w:hAnsi="Microsoft YaHei" w:cs="Microsoft YaHei" w:eastAsia="Microsoft YaHei"/>
       <w:i/>
       <w:iCs/>
       <w:color w:val="243F60" w:themeColor="accent1" w:themeShade="7F"/>
@@ -16007,7 +16323,7 @@
     <w:semiHidden/>
     <w:rsid w:val="00FC693F"/>
     <w:rPr>
-      <w:rFonts w:asciiTheme="majorHAnsi" w:eastAsiaTheme="majorEastAsia" w:hAnsiTheme="majorHAnsi" w:cstheme="majorBidi"/>
+      <w:rFonts w:ascii="Microsoft YaHei" w:hAnsi="Microsoft YaHei" w:cs="Microsoft YaHei" w:eastAsia="Microsoft YaHei"/>
       <w:i/>
       <w:iCs/>
       <w:color w:val="404040" w:themeColor="text1" w:themeTint="BF"/>
@@ -16021,7 +16337,7 @@
     <w:semiHidden/>
     <w:rsid w:val="00FC693F"/>
     <w:rPr>
-      <w:rFonts w:asciiTheme="majorHAnsi" w:eastAsiaTheme="majorEastAsia" w:hAnsiTheme="majorHAnsi" w:cstheme="majorBidi"/>
+      <w:rFonts w:ascii="Microsoft YaHei" w:hAnsi="Microsoft YaHei" w:cs="Microsoft YaHei" w:eastAsia="Microsoft YaHei"/>
       <w:color w:val="4F81BD" w:themeColor="accent1"/>
       <w:sz w:val="20"/>
       <w:szCs w:val="20"/>
@@ -16035,7 +16351,7 @@
     <w:semiHidden/>
     <w:rsid w:val="00FC693F"/>
     <w:rPr>
-      <w:rFonts w:asciiTheme="majorHAnsi" w:eastAsiaTheme="majorEastAsia" w:hAnsiTheme="majorHAnsi" w:cstheme="majorBidi"/>
+      <w:rFonts w:ascii="Microsoft YaHei" w:hAnsi="Microsoft YaHei" w:cs="Microsoft YaHei" w:eastAsia="Microsoft YaHei"/>
       <w:i/>
       <w:iCs/>
       <w:color w:val="404040" w:themeColor="text1" w:themeTint="BF"/>
@@ -17624,7 +17940,7 @@
         <w:spacing w:before="0" w:after="0" w:line="240" w:lineRule="auto"/>
       </w:pPr>
       <w:rPr>
-        <w:rFonts w:asciiTheme="majorHAnsi" w:eastAsiaTheme="majorEastAsia" w:hAnsiTheme="majorHAnsi" w:cstheme="majorBidi"/>
+        <w:rFonts w:ascii="Microsoft YaHei" w:hAnsi="Microsoft YaHei" w:cs="Microsoft YaHei" w:eastAsia="Microsoft YaHei"/>
         <w:b/>
         <w:bCs/>
       </w:rPr>
@@ -17645,7 +17961,7 @@
         <w:spacing w:before="0" w:after="0" w:line="240" w:lineRule="auto"/>
       </w:pPr>
       <w:rPr>
-        <w:rFonts w:asciiTheme="majorHAnsi" w:eastAsiaTheme="majorEastAsia" w:hAnsiTheme="majorHAnsi" w:cstheme="majorBidi"/>
+        <w:rFonts w:ascii="Microsoft YaHei" w:hAnsi="Microsoft YaHei" w:cs="Microsoft YaHei" w:eastAsia="Microsoft YaHei"/>
         <w:b/>
         <w:bCs/>
       </w:rPr>
@@ -17663,14 +17979,14 @@
     </w:tblStylePr>
     <w:tblStylePr w:type="firstCol">
       <w:rPr>
-        <w:rFonts w:asciiTheme="majorHAnsi" w:eastAsiaTheme="majorEastAsia" w:hAnsiTheme="majorHAnsi" w:cstheme="majorBidi"/>
+        <w:rFonts w:ascii="Microsoft YaHei" w:hAnsi="Microsoft YaHei" w:cs="Microsoft YaHei" w:eastAsia="Microsoft YaHei"/>
         <w:b/>
         <w:bCs/>
       </w:rPr>
     </w:tblStylePr>
     <w:tblStylePr w:type="lastCol">
       <w:rPr>
-        <w:rFonts w:asciiTheme="majorHAnsi" w:eastAsiaTheme="majorEastAsia" w:hAnsiTheme="majorHAnsi" w:cstheme="majorBidi"/>
+        <w:rFonts w:ascii="Microsoft YaHei" w:hAnsi="Microsoft YaHei" w:cs="Microsoft YaHei" w:eastAsia="Microsoft YaHei"/>
         <w:b/>
         <w:bCs/>
       </w:rPr>
@@ -17754,7 +18070,7 @@
         <w:spacing w:before="0" w:after="0" w:line="240" w:lineRule="auto"/>
       </w:pPr>
       <w:rPr>
-        <w:rFonts w:asciiTheme="majorHAnsi" w:eastAsiaTheme="majorEastAsia" w:hAnsiTheme="majorHAnsi" w:cstheme="majorBidi"/>
+        <w:rFonts w:ascii="Microsoft YaHei" w:hAnsi="Microsoft YaHei" w:cs="Microsoft YaHei" w:eastAsia="Microsoft YaHei"/>
         <w:b/>
         <w:bCs/>
       </w:rPr>
@@ -17775,7 +18091,7 @@
         <w:spacing w:before="0" w:after="0" w:line="240" w:lineRule="auto"/>
       </w:pPr>
       <w:rPr>
-        <w:rFonts w:asciiTheme="majorHAnsi" w:eastAsiaTheme="majorEastAsia" w:hAnsiTheme="majorHAnsi" w:cstheme="majorBidi"/>
+        <w:rFonts w:ascii="Microsoft YaHei" w:hAnsi="Microsoft YaHei" w:cs="Microsoft YaHei" w:eastAsia="Microsoft YaHei"/>
         <w:b/>
         <w:bCs/>
       </w:rPr>
@@ -17793,14 +18109,14 @@
     </w:tblStylePr>
     <w:tblStylePr w:type="firstCol">
       <w:rPr>
-        <w:rFonts w:asciiTheme="majorHAnsi" w:eastAsiaTheme="majorEastAsia" w:hAnsiTheme="majorHAnsi" w:cstheme="majorBidi"/>
+        <w:rFonts w:ascii="Microsoft YaHei" w:hAnsi="Microsoft YaHei" w:cs="Microsoft YaHei" w:eastAsia="Microsoft YaHei"/>
         <w:b/>
         <w:bCs/>
       </w:rPr>
     </w:tblStylePr>
     <w:tblStylePr w:type="lastCol">
       <w:rPr>
-        <w:rFonts w:asciiTheme="majorHAnsi" w:eastAsiaTheme="majorEastAsia" w:hAnsiTheme="majorHAnsi" w:cstheme="majorBidi"/>
+        <w:rFonts w:ascii="Microsoft YaHei" w:hAnsi="Microsoft YaHei" w:cs="Microsoft YaHei" w:eastAsia="Microsoft YaHei"/>
         <w:b/>
         <w:bCs/>
       </w:rPr>
@@ -17884,7 +18200,7 @@
         <w:spacing w:before="0" w:after="0" w:line="240" w:lineRule="auto"/>
       </w:pPr>
       <w:rPr>
-        <w:rFonts w:asciiTheme="majorHAnsi" w:eastAsiaTheme="majorEastAsia" w:hAnsiTheme="majorHAnsi" w:cstheme="majorBidi"/>
+        <w:rFonts w:ascii="Microsoft YaHei" w:hAnsi="Microsoft YaHei" w:cs="Microsoft YaHei" w:eastAsia="Microsoft YaHei"/>
         <w:b/>
         <w:bCs/>
       </w:rPr>
@@ -17905,7 +18221,7 @@
         <w:spacing w:before="0" w:after="0" w:line="240" w:lineRule="auto"/>
       </w:pPr>
       <w:rPr>
-        <w:rFonts w:asciiTheme="majorHAnsi" w:eastAsiaTheme="majorEastAsia" w:hAnsiTheme="majorHAnsi" w:cstheme="majorBidi"/>
+        <w:rFonts w:ascii="Microsoft YaHei" w:hAnsi="Microsoft YaHei" w:cs="Microsoft YaHei" w:eastAsia="Microsoft YaHei"/>
         <w:b/>
         <w:bCs/>
       </w:rPr>
@@ -17923,14 +18239,14 @@
     </w:tblStylePr>
     <w:tblStylePr w:type="firstCol">
       <w:rPr>
-        <w:rFonts w:asciiTheme="majorHAnsi" w:eastAsiaTheme="majorEastAsia" w:hAnsiTheme="majorHAnsi" w:cstheme="majorBidi"/>
+        <w:rFonts w:ascii="Microsoft YaHei" w:hAnsi="Microsoft YaHei" w:cs="Microsoft YaHei" w:eastAsia="Microsoft YaHei"/>
         <w:b/>
         <w:bCs/>
       </w:rPr>
     </w:tblStylePr>
     <w:tblStylePr w:type="lastCol">
       <w:rPr>
-        <w:rFonts w:asciiTheme="majorHAnsi" w:eastAsiaTheme="majorEastAsia" w:hAnsiTheme="majorHAnsi" w:cstheme="majorBidi"/>
+        <w:rFonts w:ascii="Microsoft YaHei" w:hAnsi="Microsoft YaHei" w:cs="Microsoft YaHei" w:eastAsia="Microsoft YaHei"/>
         <w:b/>
         <w:bCs/>
       </w:rPr>
@@ -18014,7 +18330,7 @@
         <w:spacing w:before="0" w:after="0" w:line="240" w:lineRule="auto"/>
       </w:pPr>
       <w:rPr>
-        <w:rFonts w:asciiTheme="majorHAnsi" w:eastAsiaTheme="majorEastAsia" w:hAnsiTheme="majorHAnsi" w:cstheme="majorBidi"/>
+        <w:rFonts w:ascii="Microsoft YaHei" w:hAnsi="Microsoft YaHei" w:cs="Microsoft YaHei" w:eastAsia="Microsoft YaHei"/>
         <w:b/>
         <w:bCs/>
       </w:rPr>
@@ -18035,7 +18351,7 @@
         <w:spacing w:before="0" w:after="0" w:line="240" w:lineRule="auto"/>
       </w:pPr>
       <w:rPr>
-        <w:rFonts w:asciiTheme="majorHAnsi" w:eastAsiaTheme="majorEastAsia" w:hAnsiTheme="majorHAnsi" w:cstheme="majorBidi"/>
+        <w:rFonts w:ascii="Microsoft YaHei" w:hAnsi="Microsoft YaHei" w:cs="Microsoft YaHei" w:eastAsia="Microsoft YaHei"/>
         <w:b/>
         <w:bCs/>
       </w:rPr>
@@ -18053,14 +18369,14 @@
     </w:tblStylePr>
     <w:tblStylePr w:type="firstCol">
       <w:rPr>
-        <w:rFonts w:asciiTheme="majorHAnsi" w:eastAsiaTheme="majorEastAsia" w:hAnsiTheme="majorHAnsi" w:cstheme="majorBidi"/>
+        <w:rFonts w:ascii="Microsoft YaHei" w:hAnsi="Microsoft YaHei" w:cs="Microsoft YaHei" w:eastAsia="Microsoft YaHei"/>
         <w:b/>
         <w:bCs/>
       </w:rPr>
     </w:tblStylePr>
     <w:tblStylePr w:type="lastCol">
       <w:rPr>
-        <w:rFonts w:asciiTheme="majorHAnsi" w:eastAsiaTheme="majorEastAsia" w:hAnsiTheme="majorHAnsi" w:cstheme="majorBidi"/>
+        <w:rFonts w:ascii="Microsoft YaHei" w:hAnsi="Microsoft YaHei" w:cs="Microsoft YaHei" w:eastAsia="Microsoft YaHei"/>
         <w:b/>
         <w:bCs/>
       </w:rPr>
@@ -18144,7 +18460,7 @@
         <w:spacing w:before="0" w:after="0" w:line="240" w:lineRule="auto"/>
       </w:pPr>
       <w:rPr>
-        <w:rFonts w:asciiTheme="majorHAnsi" w:eastAsiaTheme="majorEastAsia" w:hAnsiTheme="majorHAnsi" w:cstheme="majorBidi"/>
+        <w:rFonts w:ascii="Microsoft YaHei" w:hAnsi="Microsoft YaHei" w:cs="Microsoft YaHei" w:eastAsia="Microsoft YaHei"/>
         <w:b/>
         <w:bCs/>
       </w:rPr>
@@ -18165,7 +18481,7 @@
         <w:spacing w:before="0" w:after="0" w:line="240" w:lineRule="auto"/>
       </w:pPr>
       <w:rPr>
-        <w:rFonts w:asciiTheme="majorHAnsi" w:eastAsiaTheme="majorEastAsia" w:hAnsiTheme="majorHAnsi" w:cstheme="majorBidi"/>
+        <w:rFonts w:ascii="Microsoft YaHei" w:hAnsi="Microsoft YaHei" w:cs="Microsoft YaHei" w:eastAsia="Microsoft YaHei"/>
         <w:b/>
         <w:bCs/>
       </w:rPr>
@@ -18183,14 +18499,14 @@
     </w:tblStylePr>
     <w:tblStylePr w:type="firstCol">
       <w:rPr>
-        <w:rFonts w:asciiTheme="majorHAnsi" w:eastAsiaTheme="majorEastAsia" w:hAnsiTheme="majorHAnsi" w:cstheme="majorBidi"/>
+        <w:rFonts w:ascii="Microsoft YaHei" w:hAnsi="Microsoft YaHei" w:cs="Microsoft YaHei" w:eastAsia="Microsoft YaHei"/>
         <w:b/>
         <w:bCs/>
       </w:rPr>
     </w:tblStylePr>
     <w:tblStylePr w:type="lastCol">
       <w:rPr>
-        <w:rFonts w:asciiTheme="majorHAnsi" w:eastAsiaTheme="majorEastAsia" w:hAnsiTheme="majorHAnsi" w:cstheme="majorBidi"/>
+        <w:rFonts w:ascii="Microsoft YaHei" w:hAnsi="Microsoft YaHei" w:cs="Microsoft YaHei" w:eastAsia="Microsoft YaHei"/>
         <w:b/>
         <w:bCs/>
       </w:rPr>
@@ -18274,7 +18590,7 @@
         <w:spacing w:before="0" w:after="0" w:line="240" w:lineRule="auto"/>
       </w:pPr>
       <w:rPr>
-        <w:rFonts w:asciiTheme="majorHAnsi" w:eastAsiaTheme="majorEastAsia" w:hAnsiTheme="majorHAnsi" w:cstheme="majorBidi"/>
+        <w:rFonts w:ascii="Microsoft YaHei" w:hAnsi="Microsoft YaHei" w:cs="Microsoft YaHei" w:eastAsia="Microsoft YaHei"/>
         <w:b/>
         <w:bCs/>
       </w:rPr>
@@ -18295,7 +18611,7 @@
         <w:spacing w:before="0" w:after="0" w:line="240" w:lineRule="auto"/>
       </w:pPr>
       <w:rPr>
-        <w:rFonts w:asciiTheme="majorHAnsi" w:eastAsiaTheme="majorEastAsia" w:hAnsiTheme="majorHAnsi" w:cstheme="majorBidi"/>
+        <w:rFonts w:ascii="Microsoft YaHei" w:hAnsi="Microsoft YaHei" w:cs="Microsoft YaHei" w:eastAsia="Microsoft YaHei"/>
         <w:b/>
         <w:bCs/>
       </w:rPr>
@@ -18313,14 +18629,14 @@
     </w:tblStylePr>
     <w:tblStylePr w:type="firstCol">
       <w:rPr>
-        <w:rFonts w:asciiTheme="majorHAnsi" w:eastAsiaTheme="majorEastAsia" w:hAnsiTheme="majorHAnsi" w:cstheme="majorBidi"/>
+        <w:rFonts w:ascii="Microsoft YaHei" w:hAnsi="Microsoft YaHei" w:cs="Microsoft YaHei" w:eastAsia="Microsoft YaHei"/>
         <w:b/>
         <w:bCs/>
       </w:rPr>
     </w:tblStylePr>
     <w:tblStylePr w:type="lastCol">
       <w:rPr>
-        <w:rFonts w:asciiTheme="majorHAnsi" w:eastAsiaTheme="majorEastAsia" w:hAnsiTheme="majorHAnsi" w:cstheme="majorBidi"/>
+        <w:rFonts w:ascii="Microsoft YaHei" w:hAnsi="Microsoft YaHei" w:cs="Microsoft YaHei" w:eastAsia="Microsoft YaHei"/>
         <w:b/>
         <w:bCs/>
       </w:rPr>
@@ -18404,7 +18720,7 @@
         <w:spacing w:before="0" w:after="0" w:line="240" w:lineRule="auto"/>
       </w:pPr>
       <w:rPr>
-        <w:rFonts w:asciiTheme="majorHAnsi" w:eastAsiaTheme="majorEastAsia" w:hAnsiTheme="majorHAnsi" w:cstheme="majorBidi"/>
+        <w:rFonts w:ascii="Microsoft YaHei" w:hAnsi="Microsoft YaHei" w:cs="Microsoft YaHei" w:eastAsia="Microsoft YaHei"/>
         <w:b/>
         <w:bCs/>
       </w:rPr>
@@ -18425,7 +18741,7 @@
         <w:spacing w:before="0" w:after="0" w:line="240" w:lineRule="auto"/>
       </w:pPr>
       <w:rPr>
-        <w:rFonts w:asciiTheme="majorHAnsi" w:eastAsiaTheme="majorEastAsia" w:hAnsiTheme="majorHAnsi" w:cstheme="majorBidi"/>
+        <w:rFonts w:ascii="Microsoft YaHei" w:hAnsi="Microsoft YaHei" w:cs="Microsoft YaHei" w:eastAsia="Microsoft YaHei"/>
         <w:b/>
         <w:bCs/>
       </w:rPr>
@@ -18443,14 +18759,14 @@
     </w:tblStylePr>
     <w:tblStylePr w:type="firstCol">
       <w:rPr>
-        <w:rFonts w:asciiTheme="majorHAnsi" w:eastAsiaTheme="majorEastAsia" w:hAnsiTheme="majorHAnsi" w:cstheme="majorBidi"/>
+        <w:rFonts w:ascii="Microsoft YaHei" w:hAnsi="Microsoft YaHei" w:cs="Microsoft YaHei" w:eastAsia="Microsoft YaHei"/>
         <w:b/>
         <w:bCs/>
       </w:rPr>
     </w:tblStylePr>
     <w:tblStylePr w:type="lastCol">
       <w:rPr>
-        <w:rFonts w:asciiTheme="majorHAnsi" w:eastAsiaTheme="majorEastAsia" w:hAnsiTheme="majorHAnsi" w:cstheme="majorBidi"/>
+        <w:rFonts w:ascii="Microsoft YaHei" w:hAnsi="Microsoft YaHei" w:cs="Microsoft YaHei" w:eastAsia="Microsoft YaHei"/>
         <w:b/>
         <w:bCs/>
       </w:rPr>
@@ -20315,7 +20631,7 @@
     </w:tblPr>
     <w:tblStylePr w:type="firstRow">
       <w:rPr>
-        <w:rFonts w:asciiTheme="majorHAnsi" w:eastAsiaTheme="majorEastAsia" w:hAnsiTheme="majorHAnsi" w:cstheme="majorBidi"/>
+        <w:rFonts w:ascii="Microsoft YaHei" w:hAnsi="Microsoft YaHei" w:cs="Microsoft YaHei" w:eastAsia="Microsoft YaHei"/>
       </w:rPr>
       <w:tblPr/>
       <w:tcPr>
@@ -20399,7 +20715,7 @@
     </w:tblPr>
     <w:tblStylePr w:type="firstRow">
       <w:rPr>
-        <w:rFonts w:asciiTheme="majorHAnsi" w:eastAsiaTheme="majorEastAsia" w:hAnsiTheme="majorHAnsi" w:cstheme="majorBidi"/>
+        <w:rFonts w:ascii="Microsoft YaHei" w:hAnsi="Microsoft YaHei" w:cs="Microsoft YaHei" w:eastAsia="Microsoft YaHei"/>
       </w:rPr>
       <w:tblPr/>
       <w:tcPr>
@@ -20483,7 +20799,7 @@
     </w:tblPr>
     <w:tblStylePr w:type="firstRow">
       <w:rPr>
-        <w:rFonts w:asciiTheme="majorHAnsi" w:eastAsiaTheme="majorEastAsia" w:hAnsiTheme="majorHAnsi" w:cstheme="majorBidi"/>
+        <w:rFonts w:ascii="Microsoft YaHei" w:hAnsi="Microsoft YaHei" w:cs="Microsoft YaHei" w:eastAsia="Microsoft YaHei"/>
       </w:rPr>
       <w:tblPr/>
       <w:tcPr>
@@ -20567,7 +20883,7 @@
     </w:tblPr>
     <w:tblStylePr w:type="firstRow">
       <w:rPr>
-        <w:rFonts w:asciiTheme="majorHAnsi" w:eastAsiaTheme="majorEastAsia" w:hAnsiTheme="majorHAnsi" w:cstheme="majorBidi"/>
+        <w:rFonts w:ascii="Microsoft YaHei" w:hAnsi="Microsoft YaHei" w:cs="Microsoft YaHei" w:eastAsia="Microsoft YaHei"/>
       </w:rPr>
       <w:tblPr/>
       <w:tcPr>
@@ -20651,7 +20967,7 @@
     </w:tblPr>
     <w:tblStylePr w:type="firstRow">
       <w:rPr>
-        <w:rFonts w:asciiTheme="majorHAnsi" w:eastAsiaTheme="majorEastAsia" w:hAnsiTheme="majorHAnsi" w:cstheme="majorBidi"/>
+        <w:rFonts w:ascii="Microsoft YaHei" w:hAnsi="Microsoft YaHei" w:cs="Microsoft YaHei" w:eastAsia="Microsoft YaHei"/>
       </w:rPr>
       <w:tblPr/>
       <w:tcPr>
@@ -20735,7 +21051,7 @@
     </w:tblPr>
     <w:tblStylePr w:type="firstRow">
       <w:rPr>
-        <w:rFonts w:asciiTheme="majorHAnsi" w:eastAsiaTheme="majorEastAsia" w:hAnsiTheme="majorHAnsi" w:cstheme="majorBidi"/>
+        <w:rFonts w:ascii="Microsoft YaHei" w:hAnsi="Microsoft YaHei" w:cs="Microsoft YaHei" w:eastAsia="Microsoft YaHei"/>
       </w:rPr>
       <w:tblPr/>
       <w:tcPr>
@@ -20819,7 +21135,7 @@
     </w:tblPr>
     <w:tblStylePr w:type="firstRow">
       <w:rPr>
-        <w:rFonts w:asciiTheme="majorHAnsi" w:eastAsiaTheme="majorEastAsia" w:hAnsiTheme="majorHAnsi" w:cstheme="majorBidi"/>
+        <w:rFonts w:ascii="Microsoft YaHei" w:hAnsi="Microsoft YaHei" w:cs="Microsoft YaHei" w:eastAsia="Microsoft YaHei"/>
       </w:rPr>
       <w:tblPr/>
       <w:tcPr>
@@ -20884,7 +21200,7 @@
       <w:spacing w:after="0" w:line="240" w:lineRule="auto"/>
     </w:pPr>
     <w:rPr>
-      <w:rFonts w:asciiTheme="majorHAnsi" w:eastAsiaTheme="majorEastAsia" w:hAnsiTheme="majorHAnsi" w:cstheme="majorBidi"/>
+      <w:rFonts w:ascii="Microsoft YaHei" w:hAnsi="Microsoft YaHei" w:cs="Microsoft YaHei" w:eastAsia="Microsoft YaHei"/>
       <w:color w:val="000000" w:themeColor="text1"/>
     </w:rPr>
     <w:tblPr>
@@ -21012,7 +21328,7 @@
       <w:spacing w:after="0" w:line="240" w:lineRule="auto"/>
     </w:pPr>
     <w:rPr>
-      <w:rFonts w:asciiTheme="majorHAnsi" w:eastAsiaTheme="majorEastAsia" w:hAnsiTheme="majorHAnsi" w:cstheme="majorBidi"/>
+      <w:rFonts w:ascii="Microsoft YaHei" w:hAnsi="Microsoft YaHei" w:cs="Microsoft YaHei" w:eastAsia="Microsoft YaHei"/>
       <w:color w:val="000000" w:themeColor="text1"/>
     </w:rPr>
     <w:tblPr>
@@ -21140,7 +21456,7 @@
       <w:spacing w:after="0" w:line="240" w:lineRule="auto"/>
     </w:pPr>
     <w:rPr>
-      <w:rFonts w:asciiTheme="majorHAnsi" w:eastAsiaTheme="majorEastAsia" w:hAnsiTheme="majorHAnsi" w:cstheme="majorBidi"/>
+      <w:rFonts w:ascii="Microsoft YaHei" w:hAnsi="Microsoft YaHei" w:cs="Microsoft YaHei" w:eastAsia="Microsoft YaHei"/>
       <w:color w:val="000000" w:themeColor="text1"/>
     </w:rPr>
     <w:tblPr>
@@ -21268,7 +21584,7 @@
       <w:spacing w:after="0" w:line="240" w:lineRule="auto"/>
     </w:pPr>
     <w:rPr>
-      <w:rFonts w:asciiTheme="majorHAnsi" w:eastAsiaTheme="majorEastAsia" w:hAnsiTheme="majorHAnsi" w:cstheme="majorBidi"/>
+      <w:rFonts w:ascii="Microsoft YaHei" w:hAnsi="Microsoft YaHei" w:cs="Microsoft YaHei" w:eastAsia="Microsoft YaHei"/>
       <w:color w:val="000000" w:themeColor="text1"/>
     </w:rPr>
     <w:tblPr>
@@ -21396,7 +21712,7 @@
       <w:spacing w:after="0" w:line="240" w:lineRule="auto"/>
     </w:pPr>
     <w:rPr>
-      <w:rFonts w:asciiTheme="majorHAnsi" w:eastAsiaTheme="majorEastAsia" w:hAnsiTheme="majorHAnsi" w:cstheme="majorBidi"/>
+      <w:rFonts w:ascii="Microsoft YaHei" w:hAnsi="Microsoft YaHei" w:cs="Microsoft YaHei" w:eastAsia="Microsoft YaHei"/>
       <w:color w:val="000000" w:themeColor="text1"/>
     </w:rPr>
     <w:tblPr>
@@ -21524,7 +21840,7 @@
       <w:spacing w:after="0" w:line="240" w:lineRule="auto"/>
     </w:pPr>
     <w:rPr>
-      <w:rFonts w:asciiTheme="majorHAnsi" w:eastAsiaTheme="majorEastAsia" w:hAnsiTheme="majorHAnsi" w:cstheme="majorBidi"/>
+      <w:rFonts w:ascii="Microsoft YaHei" w:hAnsi="Microsoft YaHei" w:cs="Microsoft YaHei" w:eastAsia="Microsoft YaHei"/>
       <w:color w:val="000000" w:themeColor="text1"/>
     </w:rPr>
     <w:tblPr>
@@ -21652,7 +21968,7 @@
       <w:spacing w:after="0" w:line="240" w:lineRule="auto"/>
     </w:pPr>
     <w:rPr>
-      <w:rFonts w:asciiTheme="majorHAnsi" w:eastAsiaTheme="majorEastAsia" w:hAnsiTheme="majorHAnsi" w:cstheme="majorBidi"/>
+      <w:rFonts w:ascii="Microsoft YaHei" w:hAnsi="Microsoft YaHei" w:cs="Microsoft YaHei" w:eastAsia="Microsoft YaHei"/>
       <w:color w:val="000000" w:themeColor="text1"/>
     </w:rPr>
     <w:tblPr>
@@ -22291,7 +22607,7 @@
       <w:spacing w:after="0" w:line="240" w:lineRule="auto"/>
     </w:pPr>
     <w:rPr>
-      <w:rFonts w:asciiTheme="majorHAnsi" w:eastAsiaTheme="majorEastAsia" w:hAnsiTheme="majorHAnsi" w:cstheme="majorBidi"/>
+      <w:rFonts w:ascii="Microsoft YaHei" w:hAnsi="Microsoft YaHei" w:cs="Microsoft YaHei" w:eastAsia="Microsoft YaHei"/>
       <w:color w:val="000000" w:themeColor="text1"/>
     </w:rPr>
     <w:tblPr>
@@ -22416,7 +22732,7 @@
       <w:spacing w:after="0" w:line="240" w:lineRule="auto"/>
     </w:pPr>
     <w:rPr>
-      <w:rFonts w:asciiTheme="majorHAnsi" w:eastAsiaTheme="majorEastAsia" w:hAnsiTheme="majorHAnsi" w:cstheme="majorBidi"/>
+      <w:rFonts w:ascii="Microsoft YaHei" w:hAnsi="Microsoft YaHei" w:cs="Microsoft YaHei" w:eastAsia="Microsoft YaHei"/>
       <w:color w:val="000000" w:themeColor="text1"/>
     </w:rPr>
     <w:tblPr>
@@ -22541,7 +22857,7 @@
       <w:spacing w:after="0" w:line="240" w:lineRule="auto"/>
     </w:pPr>
     <w:rPr>
-      <w:rFonts w:asciiTheme="majorHAnsi" w:eastAsiaTheme="majorEastAsia" w:hAnsiTheme="majorHAnsi" w:cstheme="majorBidi"/>
+      <w:rFonts w:ascii="Microsoft YaHei" w:hAnsi="Microsoft YaHei" w:cs="Microsoft YaHei" w:eastAsia="Microsoft YaHei"/>
       <w:color w:val="000000" w:themeColor="text1"/>
     </w:rPr>
     <w:tblPr>
@@ -22666,7 +22982,7 @@
       <w:spacing w:after="0" w:line="240" w:lineRule="auto"/>
     </w:pPr>
     <w:rPr>
-      <w:rFonts w:asciiTheme="majorHAnsi" w:eastAsiaTheme="majorEastAsia" w:hAnsiTheme="majorHAnsi" w:cstheme="majorBidi"/>
+      <w:rFonts w:ascii="Microsoft YaHei" w:hAnsi="Microsoft YaHei" w:cs="Microsoft YaHei" w:eastAsia="Microsoft YaHei"/>
       <w:color w:val="000000" w:themeColor="text1"/>
     </w:rPr>
     <w:tblPr>
@@ -22791,7 +23107,7 @@
       <w:spacing w:after="0" w:line="240" w:lineRule="auto"/>
     </w:pPr>
     <w:rPr>
-      <w:rFonts w:asciiTheme="majorHAnsi" w:eastAsiaTheme="majorEastAsia" w:hAnsiTheme="majorHAnsi" w:cstheme="majorBidi"/>
+      <w:rFonts w:ascii="Microsoft YaHei" w:hAnsi="Microsoft YaHei" w:cs="Microsoft YaHei" w:eastAsia="Microsoft YaHei"/>
       <w:color w:val="000000" w:themeColor="text1"/>
     </w:rPr>
     <w:tblPr>
@@ -22916,7 +23232,7 @@
       <w:spacing w:after="0" w:line="240" w:lineRule="auto"/>
     </w:pPr>
     <w:rPr>
-      <w:rFonts w:asciiTheme="majorHAnsi" w:eastAsiaTheme="majorEastAsia" w:hAnsiTheme="majorHAnsi" w:cstheme="majorBidi"/>
+      <w:rFonts w:ascii="Microsoft YaHei" w:hAnsi="Microsoft YaHei" w:cs="Microsoft YaHei" w:eastAsia="Microsoft YaHei"/>
       <w:color w:val="000000" w:themeColor="text1"/>
     </w:rPr>
     <w:tblPr>
@@ -23041,7 +23357,7 @@
       <w:spacing w:after="0" w:line="240" w:lineRule="auto"/>
     </w:pPr>
     <w:rPr>
-      <w:rFonts w:asciiTheme="majorHAnsi" w:eastAsiaTheme="majorEastAsia" w:hAnsiTheme="majorHAnsi" w:cstheme="majorBidi"/>
+      <w:rFonts w:ascii="Microsoft YaHei" w:hAnsi="Microsoft YaHei" w:cs="Microsoft YaHei" w:eastAsia="Microsoft YaHei"/>
       <w:color w:val="000000" w:themeColor="text1"/>
     </w:rPr>
     <w:tblPr>
@@ -26994,13 +27310,13 @@
     </a:clrScheme>
     <a:fontScheme name="Office">
       <a:majorFont>
-        <a:latin typeface="Calibri"/>
-        <a:ea typeface=""/>
-        <a:cs typeface=""/>
-        <a:font script="Jpan" typeface="ＭＳ ゴシック"/>
+        <a:latin typeface="Microsoft YaHei"/>
+        <a:ea typeface="Microsoft YaHei"/>
+        <a:cs typeface="Microsoft YaHei"/>
+        <a:font script="Jpan" typeface="Microsoft YaHei"/>
         <a:font script="Hang" typeface="맑은 고딕"/>
-        <a:font script="Hans" typeface="宋体"/>
-        <a:font script="Hant" typeface="新細明體"/>
+        <a:font script="Hans" typeface="Microsoft YaHei"/>
+        <a:font script="Hant" typeface="Microsoft YaHei"/>
         <a:font script="Arab" typeface="Times New Roman"/>
         <a:font script="Hebr" typeface="Times New Roman"/>
         <a:font script="Thai" typeface="Angsana New"/>
@@ -27029,13 +27345,13 @@
         <a:font script="Geor" typeface="Sylfaen"/>
       </a:majorFont>
       <a:minorFont>
-        <a:latin typeface="Cambria"/>
-        <a:ea typeface=""/>
-        <a:cs typeface=""/>
-        <a:font script="Jpan" typeface="ＭＳ 明朝"/>
+        <a:latin typeface="Microsoft YaHei"/>
+        <a:ea typeface="Microsoft YaHei"/>
+        <a:cs typeface="Microsoft YaHei"/>
+        <a:font script="Jpan" typeface="Microsoft YaHei"/>
         <a:font script="Hang" typeface="맑은 고딕"/>
-        <a:font script="Hans" typeface="宋体"/>
-        <a:font script="Hant" typeface="新細明體"/>
+        <a:font script="Hans" typeface="Microsoft YaHei"/>
+        <a:font script="Hant" typeface="Microsoft YaHei"/>
         <a:font script="Arab" typeface="Arial"/>
         <a:font script="Hebr" typeface="Arial"/>
         <a:font script="Thai" typeface="Cordia New"/>

</xml_diff>